<commit_message>
S1-CL1 — in-flight edits to per-UoC assessment mapping docs
Working updates to the three S1-CL1 per-UoC mapping documents
(ICTCLD401, ICTCLD502, ICTICT517) — the assessment mapping artefacts
covering cluster waypoint #3.

Co-Authored-By: Claude Opus 4.7 (1M context) <noreply@anthropic.com>
</commit_message>
<xml_diff>
--- a/S1-CL1-Cloud-Design-Build/mappings/ICTICT517_Assessment_Mapping.docx
+++ b/S1-CL1-Cloud-Design-Build/mappings/ICTICT517_Assessment_Mapping.docx
@@ -1,6 +1,6 @@
 
 <file path=word/document.xml><?xml version="1.0" encoding="utf-8"?>
-<w:document xmlns:wpc="http://schemas.microsoft.com/office/word/2010/wordprocessingCanvas" xmlns:cx="http://schemas.microsoft.com/office/drawing/2014/chartex" xmlns:cx1="http://schemas.microsoft.com/office/drawing/2015/9/8/chartex" xmlns:cx2="http://schemas.microsoft.com/office/drawing/2015/10/21/chartex" xmlns:cx3="http://schemas.microsoft.com/office/drawing/2016/5/9/chartex" xmlns:cx4="http://schemas.microsoft.com/office/drawing/2016/5/10/chartex" xmlns:cx5="http://schemas.microsoft.com/office/drawing/2016/5/11/chartex" xmlns:cx6="http://schemas.microsoft.com/office/drawing/2016/5/12/chartex" xmlns:cx7="http://schemas.microsoft.com/office/drawing/2016/5/13/chartex" xmlns:cx8="http://schemas.microsoft.com/office/drawing/2016/5/14/chartex" xmlns:mc="http://schemas.openxmlformats.org/markup-compatibility/2006" xmlns:aink="http://schemas.microsoft.com/office/drawing/2016/ink" xmlns:am3d="http://schemas.microsoft.com/office/drawing/2017/model3d" xmlns:o="urn:schemas-microsoft-com:office:office" xmlns:oel="http://schemas.microsoft.com/office/2019/extlst" xmlns:r="http://schemas.openxmlformats.org/officeDocument/2006/relationships" xmlns:m="http://schemas.openxmlformats.org/officeDocument/2006/math" xmlns:v="urn:schemas-microsoft-com:vml" xmlns:wp14="http://schemas.microsoft.com/office/word/2010/wordprocessingDrawing" xmlns:wp="http://schemas.openxmlformats.org/drawingml/2006/wordprocessingDrawing" xmlns:w10="urn:schemas-microsoft-com:office:word" xmlns:w="http://schemas.openxmlformats.org/wordprocessingml/2006/main" xmlns:w14="http://schemas.microsoft.com/office/word/2010/wordml" xmlns:w15="http://schemas.microsoft.com/office/word/2012/wordml" xmlns:w16cex="http://schemas.microsoft.com/office/word/2018/wordml/cex" xmlns:w16cid="http://schemas.microsoft.com/office/word/2016/wordml/cid" xmlns:w16="http://schemas.microsoft.com/office/word/2018/wordml" xmlns:w16sdtdh="http://schemas.microsoft.com/office/word/2020/wordml/sdtdatahash" xmlns:w16se="http://schemas.microsoft.com/office/word/2015/wordml/symex" xmlns:wpg="http://schemas.microsoft.com/office/word/2010/wordprocessingGroup" xmlns:wpi="http://schemas.microsoft.com/office/word/2010/wordprocessingInk" xmlns:wne="http://schemas.microsoft.com/office/word/2006/wordml" xmlns:wps="http://schemas.microsoft.com/office/word/2010/wordprocessingShape" mc:Ignorable="w14 w15 w16se w16cid w16 w16cex w16sdtdh wp14">
+<w:document xmlns:wpc="http://schemas.microsoft.com/office/word/2010/wordprocessingCanvas" xmlns:cx="http://schemas.microsoft.com/office/drawing/2014/chartex" xmlns:cx1="http://schemas.microsoft.com/office/drawing/2015/9/8/chartex" xmlns:cx2="http://schemas.microsoft.com/office/drawing/2015/10/21/chartex" xmlns:cx3="http://schemas.microsoft.com/office/drawing/2016/5/9/chartex" xmlns:cx4="http://schemas.microsoft.com/office/drawing/2016/5/10/chartex" xmlns:cx5="http://schemas.microsoft.com/office/drawing/2016/5/11/chartex" xmlns:cx6="http://schemas.microsoft.com/office/drawing/2016/5/12/chartex" xmlns:cx7="http://schemas.microsoft.com/office/drawing/2016/5/13/chartex" xmlns:cx8="http://schemas.microsoft.com/office/drawing/2016/5/14/chartex" xmlns:mc="http://schemas.openxmlformats.org/markup-compatibility/2006" xmlns:aink="http://schemas.microsoft.com/office/drawing/2016/ink" xmlns:am3d="http://schemas.microsoft.com/office/drawing/2017/model3d" xmlns:o="urn:schemas-microsoft-com:office:office" xmlns:oel="http://schemas.microsoft.com/office/2019/extlst" xmlns:r="http://schemas.openxmlformats.org/officeDocument/2006/relationships" xmlns:m="http://schemas.openxmlformats.org/officeDocument/2006/math" xmlns:v="urn:schemas-microsoft-com:vml" xmlns:wp14="http://schemas.microsoft.com/office/word/2010/wordprocessingDrawing" xmlns:wp="http://schemas.openxmlformats.org/drawingml/2006/wordprocessingDrawing" xmlns:w10="urn:schemas-microsoft-com:office:word" xmlns:w="http://schemas.openxmlformats.org/wordprocessingml/2006/main" xmlns:w14="http://schemas.microsoft.com/office/word/2010/wordml" xmlns:w15="http://schemas.microsoft.com/office/word/2012/wordml" xmlns:w16cex="http://schemas.microsoft.com/office/word/2018/wordml/cex" xmlns:w16cid="http://schemas.microsoft.com/office/word/2016/wordml/cid" xmlns:w16="http://schemas.microsoft.com/office/word/2018/wordml" xmlns:w16du="http://schemas.microsoft.com/office/word/2023/wordml/word16du" xmlns:w16sdtdh="http://schemas.microsoft.com/office/word/2020/wordml/sdtdatahash" xmlns:w16sdtfl="http://schemas.microsoft.com/office/word/2024/wordml/sdtformatlock" xmlns:w16se="http://schemas.microsoft.com/office/word/2015/wordml/symex" xmlns:wpg="http://schemas.microsoft.com/office/word/2010/wordprocessingGroup" xmlns:wpi="http://schemas.microsoft.com/office/word/2010/wordprocessingInk" xmlns:wne="http://schemas.microsoft.com/office/word/2006/wordml" xmlns:wps="http://schemas.microsoft.com/office/word/2010/wordprocessingShape" mc:Ignorable="w14 w15 w16se w16cid w16 w16cex w16sdtdh w16sdtfl w16du wp14">
   <w:body>
     <w:p>
       <w:pPr>
@@ -74,7 +74,6 @@
               <w:bottom w:val="nil"/>
               <w:right w:val="nil"/>
             </w:tcBorders>
-            <w:shd w:val="clear" w:color="auto" w:fill="auto"/>
           </w:tcPr>
           <w:p>
             <w:r>
@@ -200,7 +199,6 @@
               <w:bottom w:val="single" w:sz="4" w:space="0" w:color="auto"/>
               <w:right w:val="single" w:sz="4" w:space="0" w:color="auto"/>
             </w:tcBorders>
-            <w:shd w:val="clear" w:color="auto" w:fill="auto"/>
             <w:vAlign w:val="center"/>
           </w:tcPr>
           <w:p>
@@ -221,28 +219,124 @@
               <w:bottom w:val="single" w:sz="4" w:space="0" w:color="auto"/>
               <w:right w:val="single" w:sz="4" w:space="0" w:color="auto"/>
             </w:tcBorders>
-            <w:shd w:val="clear" w:color="auto" w:fill="auto"/>
+            <w:vAlign w:val="center"/>
+          </w:tcPr>
+          <w:p>
+            <w:pPr>
+              <w:spacing w:after="60"/>
+              <w:rPr>
+                <w:b/>
+                <w:bCs/>
+              </w:rPr>
+            </w:pPr>
+            <w:r>
+              <w:t xml:space="preserve"> </w:t>
+            </w:r>
+            <w:r>
+              <w:rPr>
+                <w:b/>
+                <w:bCs/>
+              </w:rPr>
+              <w:t>ICTICT517</w:t>
+            </w:r>
+          </w:p>
+        </w:tc>
+        <w:tc>
+          <w:tcPr>
+            <w:tcW w:w="1985" w:type="dxa"/>
+            <w:tcBorders>
+              <w:top w:val="nil"/>
+              <w:left w:val="single" w:sz="4" w:space="0" w:color="auto"/>
+              <w:bottom w:val="single" w:sz="4" w:space="0" w:color="auto"/>
+              <w:right w:val="single" w:sz="4" w:space="0" w:color="auto"/>
+            </w:tcBorders>
+            <w:vAlign w:val="center"/>
+          </w:tcPr>
+          <w:p>
+            <w:pPr>
+              <w:pStyle w:val="Heading3"/>
+            </w:pPr>
+            <w:r>
+              <w:t>Unit/Module Title:</w:t>
+            </w:r>
+          </w:p>
+        </w:tc>
+        <w:tc>
+          <w:tcPr>
+            <w:tcW w:w="6237" w:type="dxa"/>
+            <w:tcBorders>
+              <w:top w:val="nil"/>
+              <w:left w:val="single" w:sz="4" w:space="0" w:color="auto"/>
+              <w:bottom w:val="single" w:sz="4" w:space="0" w:color="auto"/>
+              <w:right w:val="single" w:sz="4" w:space="0" w:color="auto"/>
+            </w:tcBorders>
+            <w:vAlign w:val="center"/>
+          </w:tcPr>
+          <w:p>
+            <w:pPr>
+              <w:spacing w:after="60"/>
+              <w:rPr>
+                <w:b/>
+                <w:bCs/>
+              </w:rPr>
+            </w:pPr>
+            <w:r>
+              <w:rPr>
+                <w:b/>
+                <w:bCs/>
+              </w:rPr>
+              <w:t>Match ICT needs with the strategic direction of the organisation</w:t>
+            </w:r>
+          </w:p>
+        </w:tc>
+        <w:tc>
+          <w:tcPr>
+            <w:tcW w:w="1276" w:type="dxa"/>
+            <w:tcBorders>
+              <w:top w:val="nil"/>
+              <w:left w:val="single" w:sz="4" w:space="0" w:color="auto"/>
+              <w:bottom w:val="single" w:sz="4" w:space="0" w:color="auto"/>
+              <w:right w:val="single" w:sz="4" w:space="0" w:color="auto"/>
+            </w:tcBorders>
+            <w:vAlign w:val="center"/>
+          </w:tcPr>
+          <w:p>
+            <w:pPr>
+              <w:pStyle w:val="Heading3"/>
+            </w:pPr>
+            <w:r>
+              <w:t>Release version</w:t>
+            </w:r>
+          </w:p>
+        </w:tc>
+        <w:tc>
+          <w:tcPr>
+            <w:tcW w:w="1417" w:type="dxa"/>
+            <w:tcBorders>
+              <w:top w:val="nil"/>
+              <w:left w:val="single" w:sz="4" w:space="0" w:color="auto"/>
+              <w:bottom w:val="single" w:sz="4" w:space="0" w:color="auto"/>
+              <w:right w:val="nil"/>
+            </w:tcBorders>
             <w:vAlign w:val="center"/>
           </w:tcPr>
           <w:p>
             <w:pPr>
               <w:spacing w:after="60"/>
             </w:pPr>
-            <w:r>
-              <w:t xml:space="preserve"> </w:t>
-            </w:r>
-          </w:p>
-        </w:tc>
-        <w:tc>
-          <w:tcPr>
-            <w:tcW w:w="1985" w:type="dxa"/>
-            <w:tcBorders>
-              <w:top w:val="nil"/>
-              <w:left w:val="single" w:sz="4" w:space="0" w:color="auto"/>
+          </w:p>
+        </w:tc>
+      </w:tr>
+      <w:tr>
+        <w:tc>
+          <w:tcPr>
+            <w:tcW w:w="2665" w:type="dxa"/>
+            <w:tcBorders>
+              <w:top w:val="single" w:sz="4" w:space="0" w:color="auto"/>
+              <w:left w:val="nil"/>
               <w:bottom w:val="single" w:sz="4" w:space="0" w:color="auto"/>
               <w:right w:val="single" w:sz="4" w:space="0" w:color="auto"/>
             </w:tcBorders>
-            <w:shd w:val="clear" w:color="auto" w:fill="auto"/>
             <w:vAlign w:val="center"/>
           </w:tcPr>
           <w:p>
@@ -250,38 +344,39 @@
               <w:pStyle w:val="Heading3"/>
             </w:pPr>
             <w:r>
-              <w:t>Unit/Module Title:</w:t>
-            </w:r>
-          </w:p>
-        </w:tc>
-        <w:tc>
-          <w:tcPr>
-            <w:tcW w:w="6237" w:type="dxa"/>
-            <w:tcBorders>
-              <w:top w:val="nil"/>
+              <w:t>Course Code:</w:t>
+            </w:r>
+          </w:p>
+        </w:tc>
+        <w:tc>
+          <w:tcPr>
+            <w:tcW w:w="1984" w:type="dxa"/>
+            <w:tcBorders>
+              <w:top w:val="single" w:sz="4" w:space="0" w:color="auto"/>
               <w:left w:val="single" w:sz="4" w:space="0" w:color="auto"/>
               <w:bottom w:val="single" w:sz="4" w:space="0" w:color="auto"/>
               <w:right w:val="single" w:sz="4" w:space="0" w:color="auto"/>
             </w:tcBorders>
-            <w:shd w:val="clear" w:color="auto" w:fill="auto"/>
             <w:vAlign w:val="center"/>
           </w:tcPr>
           <w:p>
             <w:pPr>
               <w:spacing w:after="60"/>
             </w:pPr>
-          </w:p>
-        </w:tc>
-        <w:tc>
-          <w:tcPr>
-            <w:tcW w:w="1276" w:type="dxa"/>
-            <w:tcBorders>
-              <w:top w:val="nil"/>
+            <w:r>
+              <w:t>ICT50220</w:t>
+            </w:r>
+          </w:p>
+        </w:tc>
+        <w:tc>
+          <w:tcPr>
+            <w:tcW w:w="1985" w:type="dxa"/>
+            <w:tcBorders>
+              <w:top w:val="single" w:sz="4" w:space="0" w:color="auto"/>
               <w:left w:val="single" w:sz="4" w:space="0" w:color="auto"/>
               <w:bottom w:val="single" w:sz="4" w:space="0" w:color="auto"/>
               <w:right w:val="single" w:sz="4" w:space="0" w:color="auto"/>
             </w:tcBorders>
-            <w:shd w:val="clear" w:color="auto" w:fill="auto"/>
             <w:vAlign w:val="center"/>
           </w:tcPr>
           <w:p>
@@ -289,26 +384,29 @@
               <w:pStyle w:val="Heading3"/>
             </w:pPr>
             <w:r>
-              <w:t>Release version</w:t>
-            </w:r>
-          </w:p>
-        </w:tc>
-        <w:tc>
-          <w:tcPr>
-            <w:tcW w:w="1417" w:type="dxa"/>
-            <w:tcBorders>
-              <w:top w:val="nil"/>
+              <w:t>Course Title:</w:t>
+            </w:r>
+          </w:p>
+        </w:tc>
+        <w:tc>
+          <w:tcPr>
+            <w:tcW w:w="8930" w:type="dxa"/>
+            <w:gridSpan w:val="3"/>
+            <w:tcBorders>
+              <w:top w:val="single" w:sz="4" w:space="0" w:color="auto"/>
               <w:left w:val="single" w:sz="4" w:space="0" w:color="auto"/>
               <w:bottom w:val="single" w:sz="4" w:space="0" w:color="auto"/>
               <w:right w:val="nil"/>
             </w:tcBorders>
-            <w:shd w:val="clear" w:color="auto" w:fill="auto"/>
             <w:vAlign w:val="center"/>
           </w:tcPr>
           <w:p>
             <w:pPr>
               <w:spacing w:after="60"/>
             </w:pPr>
+            <w:r>
+              <w:t>Diploma of Information Technology</w:t>
+            </w:r>
           </w:p>
         </w:tc>
       </w:tr>
@@ -322,7 +420,6 @@
               <w:bottom w:val="single" w:sz="4" w:space="0" w:color="auto"/>
               <w:right w:val="single" w:sz="4" w:space="0" w:color="auto"/>
             </w:tcBorders>
-            <w:shd w:val="clear" w:color="auto" w:fill="auto"/>
             <w:vAlign w:val="center"/>
           </w:tcPr>
           <w:p>
@@ -330,20 +427,20 @@
               <w:pStyle w:val="Heading3"/>
             </w:pPr>
             <w:r>
-              <w:t>Course Code:</w:t>
-            </w:r>
-          </w:p>
-        </w:tc>
-        <w:tc>
-          <w:tcPr>
-            <w:tcW w:w="1984" w:type="dxa"/>
+              <w:t>Related TAS:</w:t>
+            </w:r>
+          </w:p>
+        </w:tc>
+        <w:tc>
+          <w:tcPr>
+            <w:tcW w:w="12899" w:type="dxa"/>
+            <w:gridSpan w:val="5"/>
             <w:tcBorders>
               <w:top w:val="single" w:sz="4" w:space="0" w:color="auto"/>
               <w:left w:val="single" w:sz="4" w:space="0" w:color="auto"/>
               <w:bottom w:val="single" w:sz="4" w:space="0" w:color="auto"/>
-              <w:right w:val="single" w:sz="4" w:space="0" w:color="auto"/>
-            </w:tcBorders>
-            <w:shd w:val="clear" w:color="auto" w:fill="auto"/>
+              <w:right w:val="nil"/>
+            </w:tcBorders>
             <w:vAlign w:val="center"/>
           </w:tcPr>
           <w:p>
@@ -352,16 +449,17 @@
             </w:pPr>
           </w:p>
         </w:tc>
-        <w:tc>
-          <w:tcPr>
-            <w:tcW w:w="1985" w:type="dxa"/>
+      </w:tr>
+      <w:tr>
+        <w:tc>
+          <w:tcPr>
+            <w:tcW w:w="2665" w:type="dxa"/>
             <w:tcBorders>
               <w:top w:val="single" w:sz="4" w:space="0" w:color="auto"/>
-              <w:left w:val="single" w:sz="4" w:space="0" w:color="auto"/>
+              <w:left w:val="nil"/>
               <w:bottom w:val="single" w:sz="4" w:space="0" w:color="auto"/>
               <w:right w:val="single" w:sz="4" w:space="0" w:color="auto"/>
             </w:tcBorders>
-            <w:shd w:val="clear" w:color="auto" w:fill="auto"/>
             <w:vAlign w:val="center"/>
           </w:tcPr>
           <w:p>
@@ -369,105 +467,20 @@
               <w:pStyle w:val="Heading3"/>
             </w:pPr>
             <w:r>
-              <w:t>Course Title:</w:t>
-            </w:r>
-          </w:p>
-        </w:tc>
-        <w:tc>
-          <w:tcPr>
-            <w:tcW w:w="8930" w:type="dxa"/>
-            <w:gridSpan w:val="3"/>
+              <w:t>Staff member responsible:</w:t>
+            </w:r>
+          </w:p>
+        </w:tc>
+        <w:tc>
+          <w:tcPr>
+            <w:tcW w:w="12899" w:type="dxa"/>
+            <w:gridSpan w:val="5"/>
             <w:tcBorders>
               <w:top w:val="single" w:sz="4" w:space="0" w:color="auto"/>
               <w:left w:val="single" w:sz="4" w:space="0" w:color="auto"/>
               <w:bottom w:val="single" w:sz="4" w:space="0" w:color="auto"/>
               <w:right w:val="nil"/>
             </w:tcBorders>
-            <w:shd w:val="clear" w:color="auto" w:fill="auto"/>
-            <w:vAlign w:val="center"/>
-          </w:tcPr>
-          <w:p>
-            <w:pPr>
-              <w:spacing w:after="60"/>
-            </w:pPr>
-          </w:p>
-        </w:tc>
-      </w:tr>
-      <w:tr>
-        <w:tc>
-          <w:tcPr>
-            <w:tcW w:w="2665" w:type="dxa"/>
-            <w:tcBorders>
-              <w:top w:val="single" w:sz="4" w:space="0" w:color="auto"/>
-              <w:left w:val="nil"/>
-              <w:bottom w:val="single" w:sz="4" w:space="0" w:color="auto"/>
-              <w:right w:val="single" w:sz="4" w:space="0" w:color="auto"/>
-            </w:tcBorders>
-            <w:shd w:val="clear" w:color="auto" w:fill="auto"/>
-            <w:vAlign w:val="center"/>
-          </w:tcPr>
-          <w:p>
-            <w:pPr>
-              <w:pStyle w:val="Heading3"/>
-            </w:pPr>
-            <w:r>
-              <w:t>Related TAS:</w:t>
-            </w:r>
-          </w:p>
-        </w:tc>
-        <w:tc>
-          <w:tcPr>
-            <w:tcW w:w="12899" w:type="dxa"/>
-            <w:gridSpan w:val="5"/>
-            <w:tcBorders>
-              <w:top w:val="single" w:sz="4" w:space="0" w:color="auto"/>
-              <w:left w:val="single" w:sz="4" w:space="0" w:color="auto"/>
-              <w:bottom w:val="single" w:sz="4" w:space="0" w:color="auto"/>
-              <w:right w:val="nil"/>
-            </w:tcBorders>
-            <w:shd w:val="clear" w:color="auto" w:fill="auto"/>
-            <w:vAlign w:val="center"/>
-          </w:tcPr>
-          <w:p>
-            <w:pPr>
-              <w:spacing w:after="60"/>
-            </w:pPr>
-          </w:p>
-        </w:tc>
-      </w:tr>
-      <w:tr>
-        <w:tc>
-          <w:tcPr>
-            <w:tcW w:w="2665" w:type="dxa"/>
-            <w:tcBorders>
-              <w:top w:val="single" w:sz="4" w:space="0" w:color="auto"/>
-              <w:left w:val="nil"/>
-              <w:bottom w:val="single" w:sz="4" w:space="0" w:color="auto"/>
-              <w:right w:val="single" w:sz="4" w:space="0" w:color="auto"/>
-            </w:tcBorders>
-            <w:shd w:val="clear" w:color="auto" w:fill="auto"/>
-            <w:vAlign w:val="center"/>
-          </w:tcPr>
-          <w:p>
-            <w:pPr>
-              <w:pStyle w:val="Heading3"/>
-            </w:pPr>
-            <w:r>
-              <w:t>Staff member responsible:</w:t>
-            </w:r>
-          </w:p>
-        </w:tc>
-        <w:tc>
-          <w:tcPr>
-            <w:tcW w:w="12899" w:type="dxa"/>
-            <w:gridSpan w:val="5"/>
-            <w:tcBorders>
-              <w:top w:val="single" w:sz="4" w:space="0" w:color="auto"/>
-              <w:left w:val="single" w:sz="4" w:space="0" w:color="auto"/>
-              <w:bottom w:val="single" w:sz="4" w:space="0" w:color="auto"/>
-              <w:right w:val="nil"/>
-            </w:tcBorders>
-            <w:shd w:val="clear" w:color="auto" w:fill="auto"/>
             <w:vAlign w:val="center"/>
           </w:tcPr>
           <w:p>
@@ -538,7 +551,6 @@
               <w:bottom w:val="single" w:sz="4" w:space="0" w:color="auto"/>
               <w:right w:val="single" w:sz="4" w:space="0" w:color="auto"/>
             </w:tcBorders>
-            <w:shd w:val="clear" w:color="auto" w:fill="auto"/>
           </w:tcPr>
           <w:p>
             <w:pPr>
@@ -555,7 +567,6 @@
               <w:bottom w:val="single" w:sz="4" w:space="0" w:color="auto"/>
               <w:right w:val="single" w:sz="4" w:space="0" w:color="auto"/>
             </w:tcBorders>
-            <w:shd w:val="clear" w:color="auto" w:fill="auto"/>
             <w:vAlign w:val="center"/>
           </w:tcPr>
           <w:p>
@@ -576,7 +587,6 @@
               <w:bottom w:val="single" w:sz="4" w:space="0" w:color="auto"/>
               <w:right w:val="nil"/>
             </w:tcBorders>
-            <w:shd w:val="clear" w:color="auto" w:fill="auto"/>
             <w:vAlign w:val="center"/>
           </w:tcPr>
           <w:p>
@@ -602,7 +612,6 @@
               <w:bottom w:val="single" w:sz="4" w:space="0" w:color="auto"/>
               <w:right w:val="single" w:sz="4" w:space="0" w:color="auto"/>
             </w:tcBorders>
-            <w:shd w:val="clear" w:color="auto" w:fill="auto"/>
             <w:vAlign w:val="center"/>
           </w:tcPr>
           <w:p>
@@ -610,10 +619,7 @@
               <w:pStyle w:val="Heading3"/>
             </w:pPr>
             <w:r>
-              <w:t>Assessment Task</w:t>
-            </w:r>
-            <w:r>
-              <w:t xml:space="preserve"> 1 (AT1)</w:t>
+              <w:t>Assessment Task 1 (AT1)</w:t>
             </w:r>
           </w:p>
         </w:tc>
@@ -626,10 +632,13 @@
               <w:bottom w:val="single" w:sz="4" w:space="0" w:color="auto"/>
               <w:right w:val="single" w:sz="4" w:space="0" w:color="auto"/>
             </w:tcBorders>
-            <w:shd w:val="clear" w:color="auto" w:fill="auto"/>
             <w:vAlign w:val="center"/>
           </w:tcPr>
-          <w:p/>
+          <w:p>
+            <w:r>
+              <w:t>AT1 – Business Case</w:t>
+            </w:r>
+          </w:p>
         </w:tc>
         <w:tc>
           <w:tcPr>
@@ -640,7 +649,6 @@
               <w:bottom w:val="single" w:sz="4" w:space="0" w:color="auto"/>
               <w:right w:val="nil"/>
             </w:tcBorders>
-            <w:shd w:val="clear" w:color="auto" w:fill="auto"/>
             <w:vAlign w:val="center"/>
           </w:tcPr>
           <w:p/>
@@ -659,7 +667,6 @@
               <w:bottom w:val="single" w:sz="4" w:space="0" w:color="auto"/>
               <w:right w:val="single" w:sz="4" w:space="0" w:color="auto"/>
             </w:tcBorders>
-            <w:shd w:val="clear" w:color="auto" w:fill="auto"/>
             <w:vAlign w:val="center"/>
           </w:tcPr>
           <w:p>
@@ -667,10 +674,7 @@
               <w:pStyle w:val="Heading3"/>
             </w:pPr>
             <w:r>
-              <w:t>Assessment Task</w:t>
-            </w:r>
-            <w:r>
-              <w:t xml:space="preserve"> 2 (AT2)</w:t>
+              <w:t>Assessment Task 2 (AT2)</w:t>
             </w:r>
           </w:p>
         </w:tc>
@@ -683,10 +687,13 @@
               <w:bottom w:val="single" w:sz="4" w:space="0" w:color="auto"/>
               <w:right w:val="single" w:sz="4" w:space="0" w:color="auto"/>
             </w:tcBorders>
-            <w:shd w:val="clear" w:color="auto" w:fill="auto"/>
             <w:vAlign w:val="center"/>
           </w:tcPr>
-          <w:p/>
+          <w:p>
+            <w:r>
+              <w:t xml:space="preserve">AT2 - </w:t>
+            </w:r>
+          </w:p>
         </w:tc>
         <w:tc>
           <w:tcPr>
@@ -697,7 +704,6 @@
               <w:bottom w:val="single" w:sz="4" w:space="0" w:color="auto"/>
               <w:right w:val="nil"/>
             </w:tcBorders>
-            <w:shd w:val="clear" w:color="auto" w:fill="auto"/>
             <w:vAlign w:val="center"/>
           </w:tcPr>
           <w:p/>
@@ -716,7 +722,6 @@
               <w:bottom w:val="single" w:sz="4" w:space="0" w:color="auto"/>
               <w:right w:val="single" w:sz="4" w:space="0" w:color="auto"/>
             </w:tcBorders>
-            <w:shd w:val="clear" w:color="auto" w:fill="auto"/>
             <w:vAlign w:val="center"/>
           </w:tcPr>
           <w:p>
@@ -724,10 +729,7 @@
               <w:pStyle w:val="Heading3"/>
             </w:pPr>
             <w:r>
-              <w:t>Assessment Task</w:t>
-            </w:r>
-            <w:r>
-              <w:t xml:space="preserve"> 3 (AT3)</w:t>
+              <w:t>Assessment Task 3 (AT3)</w:t>
             </w:r>
           </w:p>
         </w:tc>
@@ -740,10 +742,13 @@
               <w:bottom w:val="single" w:sz="4" w:space="0" w:color="auto"/>
               <w:right w:val="single" w:sz="4" w:space="0" w:color="auto"/>
             </w:tcBorders>
-            <w:shd w:val="clear" w:color="auto" w:fill="auto"/>
             <w:vAlign w:val="center"/>
           </w:tcPr>
-          <w:p/>
+          <w:p>
+            <w:r>
+              <w:t xml:space="preserve">AT3 - </w:t>
+            </w:r>
+          </w:p>
         </w:tc>
         <w:tc>
           <w:tcPr>
@@ -754,127 +759,27 @@
               <w:bottom w:val="single" w:sz="4" w:space="0" w:color="auto"/>
               <w:right w:val="nil"/>
             </w:tcBorders>
-            <w:shd w:val="clear" w:color="auto" w:fill="auto"/>
-            <w:vAlign w:val="center"/>
-          </w:tcPr>
-          <w:p/>
-        </w:tc>
-      </w:tr>
-      <w:tr>
-        <w:trPr>
-          <w:trHeight w:val="340"/>
-        </w:trPr>
-        <w:tc>
-          <w:tcPr>
-            <w:tcW w:w="2665" w:type="dxa"/>
-            <w:tcBorders>
-              <w:top w:val="single" w:sz="4" w:space="0" w:color="auto"/>
-              <w:left w:val="nil"/>
-              <w:bottom w:val="single" w:sz="4" w:space="0" w:color="auto"/>
-              <w:right w:val="single" w:sz="4" w:space="0" w:color="auto"/>
-            </w:tcBorders>
-            <w:shd w:val="clear" w:color="auto" w:fill="auto"/>
-            <w:vAlign w:val="center"/>
-          </w:tcPr>
-          <w:p>
-            <w:pPr>
-              <w:pStyle w:val="Heading3"/>
-            </w:pPr>
-            <w:r>
-              <w:t>Assessment Task</w:t>
-            </w:r>
-            <w:r>
-              <w:t xml:space="preserve"> 4 (AT4)</w:t>
-            </w:r>
-          </w:p>
-        </w:tc>
-        <w:tc>
-          <w:tcPr>
-            <w:tcW w:w="11056" w:type="dxa"/>
-            <w:tcBorders>
-              <w:top w:val="single" w:sz="4" w:space="0" w:color="auto"/>
-              <w:left w:val="single" w:sz="4" w:space="0" w:color="auto"/>
-              <w:bottom w:val="single" w:sz="4" w:space="0" w:color="auto"/>
-              <w:right w:val="single" w:sz="4" w:space="0" w:color="auto"/>
-            </w:tcBorders>
-            <w:shd w:val="clear" w:color="auto" w:fill="auto"/>
-            <w:vAlign w:val="center"/>
-          </w:tcPr>
-          <w:p/>
-        </w:tc>
-        <w:tc>
-          <w:tcPr>
-            <w:tcW w:w="1843" w:type="dxa"/>
-            <w:tcBorders>
-              <w:top w:val="single" w:sz="4" w:space="0" w:color="auto"/>
-              <w:left w:val="single" w:sz="4" w:space="0" w:color="auto"/>
-              <w:bottom w:val="single" w:sz="4" w:space="0" w:color="auto"/>
-              <w:right w:val="nil"/>
-            </w:tcBorders>
-            <w:shd w:val="clear" w:color="auto" w:fill="auto"/>
-            <w:vAlign w:val="center"/>
-          </w:tcPr>
-          <w:p/>
-        </w:tc>
-      </w:tr>
-      <w:tr>
-        <w:trPr>
-          <w:trHeight w:val="340"/>
-        </w:trPr>
-        <w:tc>
-          <w:tcPr>
-            <w:tcW w:w="2665" w:type="dxa"/>
-            <w:tcBorders>
-              <w:top w:val="single" w:sz="4" w:space="0" w:color="auto"/>
-              <w:left w:val="nil"/>
-              <w:bottom w:val="single" w:sz="4" w:space="0" w:color="auto"/>
-              <w:right w:val="single" w:sz="4" w:space="0" w:color="auto"/>
-            </w:tcBorders>
-            <w:shd w:val="clear" w:color="auto" w:fill="auto"/>
-            <w:vAlign w:val="center"/>
-          </w:tcPr>
-          <w:p>
-            <w:pPr>
-              <w:pStyle w:val="Heading3"/>
-            </w:pPr>
-            <w:r>
-              <w:t>Assessment Task</w:t>
-            </w:r>
-            <w:r>
-              <w:t xml:space="preserve"> 5 (AT5)</w:t>
-            </w:r>
-          </w:p>
-        </w:tc>
-        <w:tc>
-          <w:tcPr>
-            <w:tcW w:w="11056" w:type="dxa"/>
-            <w:tcBorders>
-              <w:top w:val="single" w:sz="4" w:space="0" w:color="auto"/>
-              <w:left w:val="single" w:sz="4" w:space="0" w:color="auto"/>
-              <w:bottom w:val="single" w:sz="4" w:space="0" w:color="auto"/>
-              <w:right w:val="single" w:sz="4" w:space="0" w:color="auto"/>
-            </w:tcBorders>
-            <w:shd w:val="clear" w:color="auto" w:fill="auto"/>
-            <w:vAlign w:val="center"/>
-          </w:tcPr>
-          <w:p/>
-        </w:tc>
-        <w:tc>
-          <w:tcPr>
-            <w:tcW w:w="1843" w:type="dxa"/>
-            <w:tcBorders>
-              <w:top w:val="single" w:sz="4" w:space="0" w:color="auto"/>
-              <w:left w:val="single" w:sz="4" w:space="0" w:color="auto"/>
-              <w:bottom w:val="single" w:sz="4" w:space="0" w:color="auto"/>
-              <w:right w:val="nil"/>
-            </w:tcBorders>
-            <w:shd w:val="clear" w:color="auto" w:fill="auto"/>
             <w:vAlign w:val="center"/>
           </w:tcPr>
           <w:p/>
         </w:tc>
       </w:tr>
     </w:tbl>
+    <w:p>
+      <w:pPr>
+        <w:pStyle w:val="NoSpacing"/>
+      </w:pPr>
+    </w:p>
+    <w:p>
+      <w:pPr>
+        <w:pStyle w:val="NoSpacing"/>
+      </w:pPr>
+    </w:p>
+    <w:p>
+      <w:pPr>
+        <w:pStyle w:val="NoSpacing"/>
+      </w:pPr>
+    </w:p>
     <w:p>
       <w:pPr>
         <w:pStyle w:val="NoSpacing"/>
@@ -1037,7 +942,6 @@
               <w:bottom w:val="single" w:sz="4" w:space="0" w:color="auto"/>
               <w:right w:val="single" w:sz="4" w:space="0" w:color="auto"/>
             </w:tcBorders>
-            <w:shd w:val="clear" w:color="auto" w:fill="auto"/>
             <w:vAlign w:val="center"/>
           </w:tcPr>
           <w:p>
@@ -1082,7 +986,6 @@
               <w:bottom w:val="single" w:sz="4" w:space="0" w:color="auto"/>
               <w:right w:val="single" w:sz="4" w:space="0" w:color="auto"/>
             </w:tcBorders>
-            <w:shd w:val="clear" w:color="auto" w:fill="auto"/>
             <w:vAlign w:val="center"/>
           </w:tcPr>
           <w:p>
@@ -1104,7 +1007,6 @@
               <w:bottom w:val="single" w:sz="4" w:space="0" w:color="auto"/>
               <w:right w:val="single" w:sz="4" w:space="0" w:color="auto"/>
             </w:tcBorders>
-            <w:shd w:val="clear" w:color="auto" w:fill="auto"/>
             <w:vAlign w:val="center"/>
           </w:tcPr>
           <w:p>
@@ -1126,7 +1028,6 @@
               <w:bottom w:val="single" w:sz="4" w:space="0" w:color="auto"/>
               <w:right w:val="single" w:sz="4" w:space="0" w:color="auto"/>
             </w:tcBorders>
-            <w:shd w:val="clear" w:color="auto" w:fill="auto"/>
             <w:vAlign w:val="center"/>
           </w:tcPr>
           <w:p>
@@ -1148,7 +1049,6 @@
               <w:bottom w:val="single" w:sz="4" w:space="0" w:color="auto"/>
               <w:right w:val="single" w:sz="4" w:space="0" w:color="auto"/>
             </w:tcBorders>
-            <w:shd w:val="clear" w:color="auto" w:fill="auto"/>
             <w:vAlign w:val="center"/>
           </w:tcPr>
           <w:p>
@@ -1170,7 +1070,6 @@
               <w:bottom w:val="single" w:sz="4" w:space="0" w:color="auto"/>
               <w:right w:val="nil"/>
             </w:tcBorders>
-            <w:shd w:val="clear" w:color="auto" w:fill="auto"/>
             <w:vAlign w:val="center"/>
           </w:tcPr>
           <w:p>
@@ -1196,11 +1095,10 @@
               <w:left w:val="nil"/>
               <w:right w:val="single" w:sz="4" w:space="0" w:color="auto"/>
             </w:tcBorders>
-            <w:shd w:val="clear" w:color="auto" w:fill="auto"/>
-          </w:tcPr>
-          <w:p>
-            <w:r>
-              <w:t xml:space="preserve">1 </w:t>
+          </w:tcPr>
+          <w:p>
+            <w:r>
+              <w:t>A site where ICT needs and strategic directions of the organisation are coordinated</w:t>
             </w:r>
           </w:p>
         </w:tc>
@@ -1212,7 +1110,6 @@
               <w:left w:val="single" w:sz="4" w:space="0" w:color="auto"/>
               <w:right w:val="single" w:sz="4" w:space="0" w:color="auto"/>
             </w:tcBorders>
-            <w:shd w:val="clear" w:color="auto" w:fill="auto"/>
           </w:tcPr>
           <w:p/>
         </w:tc>
@@ -1224,7 +1121,6 @@
               <w:left w:val="single" w:sz="4" w:space="0" w:color="auto"/>
               <w:right w:val="single" w:sz="4" w:space="0" w:color="auto"/>
             </w:tcBorders>
-            <w:shd w:val="clear" w:color="auto" w:fill="auto"/>
           </w:tcPr>
           <w:p/>
         </w:tc>
@@ -1236,7 +1132,6 @@
               <w:left w:val="single" w:sz="4" w:space="0" w:color="auto"/>
               <w:right w:val="single" w:sz="4" w:space="0" w:color="auto"/>
             </w:tcBorders>
-            <w:shd w:val="clear" w:color="auto" w:fill="auto"/>
           </w:tcPr>
           <w:p/>
         </w:tc>
@@ -1248,7 +1143,6 @@
               <w:left w:val="single" w:sz="4" w:space="0" w:color="auto"/>
               <w:right w:val="single" w:sz="4" w:space="0" w:color="auto"/>
             </w:tcBorders>
-            <w:shd w:val="clear" w:color="auto" w:fill="auto"/>
           </w:tcPr>
           <w:p/>
         </w:tc>
@@ -1260,7 +1154,6 @@
               <w:left w:val="single" w:sz="4" w:space="0" w:color="auto"/>
               <w:right w:val="nil"/>
             </w:tcBorders>
-            <w:shd w:val="clear" w:color="auto" w:fill="auto"/>
           </w:tcPr>
           <w:p/>
         </w:tc>
@@ -1277,11 +1170,10 @@
               <w:bottom w:val="single" w:sz="4" w:space="0" w:color="auto"/>
               <w:right w:val="single" w:sz="4" w:space="0" w:color="auto"/>
             </w:tcBorders>
-            <w:shd w:val="clear" w:color="auto" w:fill="auto"/>
-          </w:tcPr>
-          <w:p>
-            <w:r>
-              <w:t>2</w:t>
+          </w:tcPr>
+          <w:p>
+            <w:r>
+              <w:t>Detailed information relating to a strategic organisation plan, objectives, and direction</w:t>
             </w:r>
           </w:p>
         </w:tc>
@@ -1293,7 +1185,6 @@
               <w:bottom w:val="single" w:sz="4" w:space="0" w:color="auto"/>
               <w:right w:val="single" w:sz="4" w:space="0" w:color="auto"/>
             </w:tcBorders>
-            <w:shd w:val="clear" w:color="auto" w:fill="auto"/>
           </w:tcPr>
           <w:p/>
         </w:tc>
@@ -1305,7 +1196,6 @@
               <w:bottom w:val="single" w:sz="4" w:space="0" w:color="auto"/>
               <w:right w:val="single" w:sz="4" w:space="0" w:color="auto"/>
             </w:tcBorders>
-            <w:shd w:val="clear" w:color="auto" w:fill="auto"/>
           </w:tcPr>
           <w:p/>
         </w:tc>
@@ -1317,7 +1207,6 @@
               <w:bottom w:val="single" w:sz="4" w:space="0" w:color="auto"/>
               <w:right w:val="single" w:sz="4" w:space="0" w:color="auto"/>
             </w:tcBorders>
-            <w:shd w:val="clear" w:color="auto" w:fill="auto"/>
           </w:tcPr>
           <w:p/>
         </w:tc>
@@ -1329,7 +1218,6 @@
               <w:bottom w:val="single" w:sz="4" w:space="0" w:color="auto"/>
               <w:right w:val="single" w:sz="4" w:space="0" w:color="auto"/>
             </w:tcBorders>
-            <w:shd w:val="clear" w:color="auto" w:fill="auto"/>
           </w:tcPr>
           <w:p/>
         </w:tc>
@@ -1341,7 +1229,6 @@
               <w:bottom w:val="single" w:sz="4" w:space="0" w:color="auto"/>
               <w:right w:val="nil"/>
             </w:tcBorders>
-            <w:shd w:val="clear" w:color="auto" w:fill="auto"/>
           </w:tcPr>
           <w:p/>
         </w:tc>
@@ -1355,14 +1242,151 @@
             <w:tcW w:w="11312" w:type="dxa"/>
             <w:tcBorders>
               <w:left w:val="nil"/>
+              <w:right w:val="single" w:sz="4" w:space="0" w:color="auto"/>
+            </w:tcBorders>
+          </w:tcPr>
+          <w:p>
+            <w:r>
+              <w:t>Organisational policies and procedures relating to the implementation of ICT changes</w:t>
+            </w:r>
+          </w:p>
+        </w:tc>
+        <w:tc>
+          <w:tcPr>
+            <w:tcW w:w="850" w:type="dxa"/>
+            <w:tcBorders>
+              <w:left w:val="single" w:sz="4" w:space="0" w:color="auto"/>
+              <w:right w:val="single" w:sz="4" w:space="0" w:color="auto"/>
+            </w:tcBorders>
+          </w:tcPr>
+          <w:p/>
+        </w:tc>
+        <w:tc>
+          <w:tcPr>
+            <w:tcW w:w="851" w:type="dxa"/>
+            <w:tcBorders>
+              <w:left w:val="single" w:sz="4" w:space="0" w:color="auto"/>
+              <w:right w:val="single" w:sz="4" w:space="0" w:color="auto"/>
+            </w:tcBorders>
+          </w:tcPr>
+          <w:p/>
+        </w:tc>
+        <w:tc>
+          <w:tcPr>
+            <w:tcW w:w="850" w:type="dxa"/>
+            <w:tcBorders>
+              <w:left w:val="single" w:sz="4" w:space="0" w:color="auto"/>
+              <w:right w:val="single" w:sz="4" w:space="0" w:color="auto"/>
+            </w:tcBorders>
+          </w:tcPr>
+          <w:p/>
+        </w:tc>
+        <w:tc>
+          <w:tcPr>
+            <w:tcW w:w="851" w:type="dxa"/>
+            <w:tcBorders>
+              <w:left w:val="single" w:sz="4" w:space="0" w:color="auto"/>
+              <w:right w:val="single" w:sz="4" w:space="0" w:color="auto"/>
+            </w:tcBorders>
+          </w:tcPr>
+          <w:p/>
+        </w:tc>
+        <w:tc>
+          <w:tcPr>
+            <w:tcW w:w="850" w:type="dxa"/>
+            <w:tcBorders>
+              <w:left w:val="single" w:sz="4" w:space="0" w:color="auto"/>
+              <w:right w:val="nil"/>
+            </w:tcBorders>
+          </w:tcPr>
+          <w:p/>
+        </w:tc>
+      </w:tr>
+      <w:tr>
+        <w:trPr>
+          <w:trHeight w:val="340"/>
+        </w:trPr>
+        <w:tc>
+          <w:tcPr>
+            <w:tcW w:w="11312" w:type="dxa"/>
+            <w:tcBorders>
+              <w:left w:val="nil"/>
+              <w:right w:val="single" w:sz="4" w:space="0" w:color="auto"/>
+            </w:tcBorders>
+          </w:tcPr>
+          <w:p>
+            <w:r>
+              <w:t>Individual superior in the organisation</w:t>
+            </w:r>
+          </w:p>
+        </w:tc>
+        <w:tc>
+          <w:tcPr>
+            <w:tcW w:w="850" w:type="dxa"/>
+            <w:tcBorders>
+              <w:left w:val="single" w:sz="4" w:space="0" w:color="auto"/>
+              <w:right w:val="single" w:sz="4" w:space="0" w:color="auto"/>
+            </w:tcBorders>
+          </w:tcPr>
+          <w:p/>
+        </w:tc>
+        <w:tc>
+          <w:tcPr>
+            <w:tcW w:w="851" w:type="dxa"/>
+            <w:tcBorders>
+              <w:left w:val="single" w:sz="4" w:space="0" w:color="auto"/>
+              <w:right w:val="single" w:sz="4" w:space="0" w:color="auto"/>
+            </w:tcBorders>
+          </w:tcPr>
+          <w:p/>
+        </w:tc>
+        <w:tc>
+          <w:tcPr>
+            <w:tcW w:w="850" w:type="dxa"/>
+            <w:tcBorders>
+              <w:left w:val="single" w:sz="4" w:space="0" w:color="auto"/>
+              <w:right w:val="single" w:sz="4" w:space="0" w:color="auto"/>
+            </w:tcBorders>
+          </w:tcPr>
+          <w:p/>
+        </w:tc>
+        <w:tc>
+          <w:tcPr>
+            <w:tcW w:w="851" w:type="dxa"/>
+            <w:tcBorders>
+              <w:left w:val="single" w:sz="4" w:space="0" w:color="auto"/>
+              <w:right w:val="single" w:sz="4" w:space="0" w:color="auto"/>
+            </w:tcBorders>
+          </w:tcPr>
+          <w:p/>
+        </w:tc>
+        <w:tc>
+          <w:tcPr>
+            <w:tcW w:w="850" w:type="dxa"/>
+            <w:tcBorders>
+              <w:left w:val="single" w:sz="4" w:space="0" w:color="auto"/>
+              <w:right w:val="nil"/>
+            </w:tcBorders>
+          </w:tcPr>
+          <w:p/>
+        </w:tc>
+      </w:tr>
+      <w:tr>
+        <w:trPr>
+          <w:trHeight w:val="340"/>
+        </w:trPr>
+        <w:tc>
+          <w:tcPr>
+            <w:tcW w:w="11312" w:type="dxa"/>
+            <w:tcBorders>
+              <w:left w:val="nil"/>
               <w:bottom w:val="single" w:sz="4" w:space="0" w:color="auto"/>
               <w:right w:val="single" w:sz="4" w:space="0" w:color="auto"/>
             </w:tcBorders>
-            <w:shd w:val="clear" w:color="auto" w:fill="auto"/>
-          </w:tcPr>
-          <w:p>
-            <w:r>
-              <w:t>3</w:t>
+          </w:tcPr>
+          <w:p>
+            <w:r>
+              <w:t>Information on current ICT systems and practices in the organisation including operating systems, hardware, and security</w:t>
             </w:r>
           </w:p>
         </w:tc>
@@ -1374,7 +1398,6 @@
               <w:bottom w:val="single" w:sz="4" w:space="0" w:color="auto"/>
               <w:right w:val="single" w:sz="4" w:space="0" w:color="auto"/>
             </w:tcBorders>
-            <w:shd w:val="clear" w:color="auto" w:fill="auto"/>
           </w:tcPr>
           <w:p/>
         </w:tc>
@@ -1386,7 +1409,6 @@
               <w:bottom w:val="single" w:sz="4" w:space="0" w:color="auto"/>
               <w:right w:val="single" w:sz="4" w:space="0" w:color="auto"/>
             </w:tcBorders>
-            <w:shd w:val="clear" w:color="auto" w:fill="auto"/>
           </w:tcPr>
           <w:p/>
         </w:tc>
@@ -1398,7 +1420,6 @@
               <w:bottom w:val="single" w:sz="4" w:space="0" w:color="auto"/>
               <w:right w:val="single" w:sz="4" w:space="0" w:color="auto"/>
             </w:tcBorders>
-            <w:shd w:val="clear" w:color="auto" w:fill="auto"/>
           </w:tcPr>
           <w:p/>
         </w:tc>
@@ -1410,7 +1431,6 @@
               <w:bottom w:val="single" w:sz="4" w:space="0" w:color="auto"/>
               <w:right w:val="single" w:sz="4" w:space="0" w:color="auto"/>
             </w:tcBorders>
-            <w:shd w:val="clear" w:color="auto" w:fill="auto"/>
           </w:tcPr>
           <w:p/>
         </w:tc>
@@ -1422,7 +1442,6 @@
               <w:bottom w:val="single" w:sz="4" w:space="0" w:color="auto"/>
               <w:right w:val="nil"/>
             </w:tcBorders>
-            <w:shd w:val="clear" w:color="auto" w:fill="auto"/>
           </w:tcPr>
           <w:p/>
         </w:tc>
@@ -1586,7 +1605,6 @@
               <w:bottom w:val="single" w:sz="4" w:space="0" w:color="auto"/>
               <w:right w:val="single" w:sz="4" w:space="0" w:color="auto"/>
             </w:tcBorders>
-            <w:shd w:val="clear" w:color="auto" w:fill="auto"/>
             <w:vAlign w:val="center"/>
           </w:tcPr>
           <w:p>
@@ -1610,7 +1628,6 @@
               <w:bottom w:val="single" w:sz="4" w:space="0" w:color="auto"/>
               <w:right w:val="single" w:sz="4" w:space="0" w:color="auto"/>
             </w:tcBorders>
-            <w:shd w:val="clear" w:color="auto" w:fill="auto"/>
             <w:vAlign w:val="center"/>
           </w:tcPr>
           <w:p>
@@ -1649,7 +1666,6 @@
               <w:bottom w:val="single" w:sz="4" w:space="0" w:color="auto"/>
               <w:right w:val="single" w:sz="4" w:space="0" w:color="auto"/>
             </w:tcBorders>
-            <w:shd w:val="clear" w:color="auto" w:fill="auto"/>
             <w:vAlign w:val="center"/>
           </w:tcPr>
           <w:p>
@@ -1671,7 +1687,6 @@
               <w:bottom w:val="single" w:sz="4" w:space="0" w:color="auto"/>
               <w:right w:val="single" w:sz="4" w:space="0" w:color="auto"/>
             </w:tcBorders>
-            <w:shd w:val="clear" w:color="auto" w:fill="auto"/>
             <w:vAlign w:val="center"/>
           </w:tcPr>
           <w:p>
@@ -1693,7 +1708,6 @@
               <w:bottom w:val="single" w:sz="4" w:space="0" w:color="auto"/>
               <w:right w:val="single" w:sz="4" w:space="0" w:color="auto"/>
             </w:tcBorders>
-            <w:shd w:val="clear" w:color="auto" w:fill="auto"/>
             <w:vAlign w:val="center"/>
           </w:tcPr>
           <w:p>
@@ -1715,7 +1729,6 @@
               <w:bottom w:val="single" w:sz="4" w:space="0" w:color="auto"/>
               <w:right w:val="single" w:sz="4" w:space="0" w:color="auto"/>
             </w:tcBorders>
-            <w:shd w:val="clear" w:color="auto" w:fill="auto"/>
             <w:vAlign w:val="center"/>
           </w:tcPr>
           <w:p>
@@ -1737,7 +1750,6 @@
               <w:bottom w:val="single" w:sz="4" w:space="0" w:color="auto"/>
               <w:right w:val="nil"/>
             </w:tcBorders>
-            <w:shd w:val="clear" w:color="auto" w:fill="auto"/>
             <w:vAlign w:val="center"/>
           </w:tcPr>
           <w:p>
@@ -1763,11 +1775,10 @@
               <w:left w:val="nil"/>
               <w:right w:val="single" w:sz="4" w:space="0" w:color="auto"/>
             </w:tcBorders>
-            <w:shd w:val="clear" w:color="auto" w:fill="auto"/>
-          </w:tcPr>
-          <w:p>
-            <w:r>
-              <w:t>1</w:t>
+          </w:tcPr>
+          <w:p>
+            <w:r>
+              <w:t>1. Evaluate current strategic plan and propose changes</w:t>
             </w:r>
           </w:p>
         </w:tc>
@@ -1779,11 +1790,10 @@
               <w:left w:val="single" w:sz="4" w:space="0" w:color="auto"/>
               <w:right w:val="single" w:sz="4" w:space="0" w:color="auto"/>
             </w:tcBorders>
-            <w:shd w:val="clear" w:color="auto" w:fill="auto"/>
-          </w:tcPr>
-          <w:p>
-            <w:r>
-              <w:t>1.1</w:t>
+          </w:tcPr>
+          <w:p>
+            <w:r>
+              <w:t>1.1 Analyse and document current strategic plan of organisation against industry environment and organisational objectives</w:t>
             </w:r>
           </w:p>
         </w:tc>
@@ -1795,7 +1805,6 @@
               <w:left w:val="single" w:sz="4" w:space="0" w:color="auto"/>
               <w:right w:val="single" w:sz="4" w:space="0" w:color="auto"/>
             </w:tcBorders>
-            <w:shd w:val="clear" w:color="auto" w:fill="auto"/>
           </w:tcPr>
           <w:p/>
         </w:tc>
@@ -1807,7 +1816,6 @@
               <w:left w:val="single" w:sz="4" w:space="0" w:color="auto"/>
               <w:right w:val="single" w:sz="4" w:space="0" w:color="auto"/>
             </w:tcBorders>
-            <w:shd w:val="clear" w:color="auto" w:fill="auto"/>
           </w:tcPr>
           <w:p/>
         </w:tc>
@@ -1819,7 +1827,6 @@
               <w:left w:val="single" w:sz="4" w:space="0" w:color="auto"/>
               <w:right w:val="single" w:sz="4" w:space="0" w:color="auto"/>
             </w:tcBorders>
-            <w:shd w:val="clear" w:color="auto" w:fill="auto"/>
           </w:tcPr>
           <w:p/>
         </w:tc>
@@ -1831,7 +1838,6 @@
               <w:left w:val="single" w:sz="4" w:space="0" w:color="auto"/>
               <w:right w:val="single" w:sz="4" w:space="0" w:color="auto"/>
             </w:tcBorders>
-            <w:shd w:val="clear" w:color="auto" w:fill="auto"/>
           </w:tcPr>
           <w:p/>
         </w:tc>
@@ -1843,7 +1849,6 @@
               <w:left w:val="single" w:sz="4" w:space="0" w:color="auto"/>
               <w:right w:val="nil"/>
             </w:tcBorders>
-            <w:shd w:val="clear" w:color="auto" w:fill="auto"/>
           </w:tcPr>
           <w:p/>
         </w:tc>
@@ -1859,9 +1864,12 @@
               <w:left w:val="nil"/>
               <w:right w:val="single" w:sz="4" w:space="0" w:color="auto"/>
             </w:tcBorders>
-            <w:shd w:val="clear" w:color="auto" w:fill="auto"/>
-          </w:tcPr>
-          <w:p/>
+          </w:tcPr>
+          <w:p>
+            <w:r>
+              <w:t>1. Evaluate current strategic plan and propose changes</w:t>
+            </w:r>
+          </w:p>
         </w:tc>
         <w:tc>
           <w:tcPr>
@@ -1870,11 +1878,10 @@
               <w:left w:val="single" w:sz="4" w:space="0" w:color="auto"/>
               <w:right w:val="single" w:sz="4" w:space="0" w:color="auto"/>
             </w:tcBorders>
-            <w:shd w:val="clear" w:color="auto" w:fill="auto"/>
-          </w:tcPr>
-          <w:p>
-            <w:r>
-              <w:t>1.2</w:t>
+          </w:tcPr>
+          <w:p>
+            <w:r>
+              <w:t>1.2 Determine and document current state of ICT systems and practices in organisation</w:t>
             </w:r>
           </w:p>
         </w:tc>
@@ -1885,7 +1892,6 @@
               <w:left w:val="single" w:sz="4" w:space="0" w:color="auto"/>
               <w:right w:val="single" w:sz="4" w:space="0" w:color="auto"/>
             </w:tcBorders>
-            <w:shd w:val="clear" w:color="auto" w:fill="auto"/>
           </w:tcPr>
           <w:p/>
         </w:tc>
@@ -1896,7 +1902,6 @@
               <w:left w:val="single" w:sz="4" w:space="0" w:color="auto"/>
               <w:right w:val="single" w:sz="4" w:space="0" w:color="auto"/>
             </w:tcBorders>
-            <w:shd w:val="clear" w:color="auto" w:fill="auto"/>
           </w:tcPr>
           <w:p/>
         </w:tc>
@@ -1907,7 +1912,6 @@
               <w:left w:val="single" w:sz="4" w:space="0" w:color="auto"/>
               <w:right w:val="single" w:sz="4" w:space="0" w:color="auto"/>
             </w:tcBorders>
-            <w:shd w:val="clear" w:color="auto" w:fill="auto"/>
           </w:tcPr>
           <w:p/>
         </w:tc>
@@ -1918,7 +1922,6 @@
               <w:left w:val="single" w:sz="4" w:space="0" w:color="auto"/>
               <w:right w:val="single" w:sz="4" w:space="0" w:color="auto"/>
             </w:tcBorders>
-            <w:shd w:val="clear" w:color="auto" w:fill="auto"/>
           </w:tcPr>
           <w:p/>
         </w:tc>
@@ -1929,7 +1932,6 @@
               <w:left w:val="single" w:sz="4" w:space="0" w:color="auto"/>
               <w:right w:val="nil"/>
             </w:tcBorders>
-            <w:shd w:val="clear" w:color="auto" w:fill="auto"/>
           </w:tcPr>
           <w:p/>
         </w:tc>
@@ -1945,9 +1947,12 @@
               <w:left w:val="nil"/>
               <w:right w:val="single" w:sz="4" w:space="0" w:color="auto"/>
             </w:tcBorders>
-            <w:shd w:val="clear" w:color="auto" w:fill="auto"/>
-          </w:tcPr>
-          <w:p/>
+          </w:tcPr>
+          <w:p>
+            <w:r>
+              <w:t>1. Evaluate current strategic plan and propose changes</w:t>
+            </w:r>
+          </w:p>
         </w:tc>
         <w:tc>
           <w:tcPr>
@@ -1956,11 +1961,10 @@
               <w:left w:val="single" w:sz="4" w:space="0" w:color="auto"/>
               <w:right w:val="single" w:sz="4" w:space="0" w:color="auto"/>
             </w:tcBorders>
-            <w:shd w:val="clear" w:color="auto" w:fill="auto"/>
-          </w:tcPr>
-          <w:p>
-            <w:r>
-              <w:t>1.3</w:t>
+          </w:tcPr>
+          <w:p>
+            <w:r>
+              <w:t>1.3 Compare strategic plan objectives and current state of ICT to determine ICT gaps, improvement opportunities, and proposed changes</w:t>
             </w:r>
           </w:p>
         </w:tc>
@@ -1971,7 +1975,6 @@
               <w:left w:val="single" w:sz="4" w:space="0" w:color="auto"/>
               <w:right w:val="single" w:sz="4" w:space="0" w:color="auto"/>
             </w:tcBorders>
-            <w:shd w:val="clear" w:color="auto" w:fill="auto"/>
           </w:tcPr>
           <w:p/>
         </w:tc>
@@ -1982,7 +1985,6 @@
               <w:left w:val="single" w:sz="4" w:space="0" w:color="auto"/>
               <w:right w:val="single" w:sz="4" w:space="0" w:color="auto"/>
             </w:tcBorders>
-            <w:shd w:val="clear" w:color="auto" w:fill="auto"/>
           </w:tcPr>
           <w:p/>
         </w:tc>
@@ -1993,7 +1995,6 @@
               <w:left w:val="single" w:sz="4" w:space="0" w:color="auto"/>
               <w:right w:val="single" w:sz="4" w:space="0" w:color="auto"/>
             </w:tcBorders>
-            <w:shd w:val="clear" w:color="auto" w:fill="auto"/>
           </w:tcPr>
           <w:p/>
         </w:tc>
@@ -2004,7 +2005,6 @@
               <w:left w:val="single" w:sz="4" w:space="0" w:color="auto"/>
               <w:right w:val="single" w:sz="4" w:space="0" w:color="auto"/>
             </w:tcBorders>
-            <w:shd w:val="clear" w:color="auto" w:fill="auto"/>
           </w:tcPr>
           <w:p/>
         </w:tc>
@@ -2015,7 +2015,6 @@
               <w:left w:val="single" w:sz="4" w:space="0" w:color="auto"/>
               <w:right w:val="nil"/>
             </w:tcBorders>
-            <w:shd w:val="clear" w:color="auto" w:fill="auto"/>
           </w:tcPr>
           <w:p/>
         </w:tc>
@@ -2031,11 +2030,10 @@
               <w:left w:val="nil"/>
               <w:right w:val="single" w:sz="4" w:space="0" w:color="auto"/>
             </w:tcBorders>
-            <w:shd w:val="clear" w:color="auto" w:fill="auto"/>
-          </w:tcPr>
-          <w:p>
-            <w:r>
-              <w:t>2</w:t>
+          </w:tcPr>
+          <w:p>
+            <w:r>
+              <w:t>1. Evaluate current strategic plan and propose changes</w:t>
             </w:r>
           </w:p>
         </w:tc>
@@ -2046,11 +2044,10 @@
               <w:left w:val="single" w:sz="4" w:space="0" w:color="auto"/>
               <w:right w:val="single" w:sz="4" w:space="0" w:color="auto"/>
             </w:tcBorders>
-            <w:shd w:val="clear" w:color="auto" w:fill="auto"/>
-          </w:tcPr>
-          <w:p>
-            <w:r>
-              <w:t>2.1</w:t>
+          </w:tcPr>
+          <w:p>
+            <w:r>
+              <w:t>1.4 Report on proposed changes, gaps and improvement opportunities to superior</w:t>
             </w:r>
           </w:p>
         </w:tc>
@@ -2061,7 +2058,6 @@
               <w:left w:val="single" w:sz="4" w:space="0" w:color="auto"/>
               <w:right w:val="single" w:sz="4" w:space="0" w:color="auto"/>
             </w:tcBorders>
-            <w:shd w:val="clear" w:color="auto" w:fill="auto"/>
           </w:tcPr>
           <w:p/>
         </w:tc>
@@ -2072,7 +2068,6 @@
               <w:left w:val="single" w:sz="4" w:space="0" w:color="auto"/>
               <w:right w:val="single" w:sz="4" w:space="0" w:color="auto"/>
             </w:tcBorders>
-            <w:shd w:val="clear" w:color="auto" w:fill="auto"/>
           </w:tcPr>
           <w:p/>
         </w:tc>
@@ -2083,7 +2078,6 @@
               <w:left w:val="single" w:sz="4" w:space="0" w:color="auto"/>
               <w:right w:val="single" w:sz="4" w:space="0" w:color="auto"/>
             </w:tcBorders>
-            <w:shd w:val="clear" w:color="auto" w:fill="auto"/>
           </w:tcPr>
           <w:p/>
         </w:tc>
@@ -2094,7 +2088,6 @@
               <w:left w:val="single" w:sz="4" w:space="0" w:color="auto"/>
               <w:right w:val="single" w:sz="4" w:space="0" w:color="auto"/>
             </w:tcBorders>
-            <w:shd w:val="clear" w:color="auto" w:fill="auto"/>
           </w:tcPr>
           <w:p/>
         </w:tc>
@@ -2105,7 +2098,6 @@
               <w:left w:val="single" w:sz="4" w:space="0" w:color="auto"/>
               <w:right w:val="nil"/>
             </w:tcBorders>
-            <w:shd w:val="clear" w:color="auto" w:fill="auto"/>
           </w:tcPr>
           <w:p/>
         </w:tc>
@@ -2121,9 +2113,12 @@
               <w:left w:val="nil"/>
               <w:right w:val="single" w:sz="4" w:space="0" w:color="auto"/>
             </w:tcBorders>
-            <w:shd w:val="clear" w:color="auto" w:fill="auto"/>
-          </w:tcPr>
-          <w:p/>
+          </w:tcPr>
+          <w:p>
+            <w:r>
+              <w:t>2. Evaluate effect of changes</w:t>
+            </w:r>
+          </w:p>
         </w:tc>
         <w:tc>
           <w:tcPr>
@@ -2132,11 +2127,10 @@
               <w:left w:val="single" w:sz="4" w:space="0" w:color="auto"/>
               <w:right w:val="single" w:sz="4" w:space="0" w:color="auto"/>
             </w:tcBorders>
-            <w:shd w:val="clear" w:color="auto" w:fill="auto"/>
-          </w:tcPr>
-          <w:p>
-            <w:r>
-              <w:t>2.2</w:t>
+          </w:tcPr>
+          <w:p>
+            <w:r>
+              <w:t xml:space="preserve">2.1 Evaluate impact of proposed changes to ICT systems and products against strategic </w:t>
             </w:r>
           </w:p>
         </w:tc>
@@ -2147,7 +2141,6 @@
               <w:left w:val="single" w:sz="4" w:space="0" w:color="auto"/>
               <w:right w:val="single" w:sz="4" w:space="0" w:color="auto"/>
             </w:tcBorders>
-            <w:shd w:val="clear" w:color="auto" w:fill="auto"/>
           </w:tcPr>
           <w:p/>
         </w:tc>
@@ -2158,7 +2151,6 @@
               <w:left w:val="single" w:sz="4" w:space="0" w:color="auto"/>
               <w:right w:val="single" w:sz="4" w:space="0" w:color="auto"/>
             </w:tcBorders>
-            <w:shd w:val="clear" w:color="auto" w:fill="auto"/>
           </w:tcPr>
           <w:p/>
         </w:tc>
@@ -2169,7 +2161,6 @@
               <w:left w:val="single" w:sz="4" w:space="0" w:color="auto"/>
               <w:right w:val="single" w:sz="4" w:space="0" w:color="auto"/>
             </w:tcBorders>
-            <w:shd w:val="clear" w:color="auto" w:fill="auto"/>
           </w:tcPr>
           <w:p/>
         </w:tc>
@@ -2180,7 +2171,6 @@
               <w:left w:val="single" w:sz="4" w:space="0" w:color="auto"/>
               <w:right w:val="single" w:sz="4" w:space="0" w:color="auto"/>
             </w:tcBorders>
-            <w:shd w:val="clear" w:color="auto" w:fill="auto"/>
           </w:tcPr>
           <w:p/>
         </w:tc>
@@ -2191,7 +2181,6 @@
               <w:left w:val="single" w:sz="4" w:space="0" w:color="auto"/>
               <w:right w:val="nil"/>
             </w:tcBorders>
-            <w:shd w:val="clear" w:color="auto" w:fill="auto"/>
           </w:tcPr>
           <w:p/>
         </w:tc>
@@ -2207,9 +2196,12 @@
               <w:left w:val="nil"/>
               <w:right w:val="single" w:sz="4" w:space="0" w:color="auto"/>
             </w:tcBorders>
-            <w:shd w:val="clear" w:color="auto" w:fill="auto"/>
-          </w:tcPr>
-          <w:p/>
+          </w:tcPr>
+          <w:p>
+            <w:r>
+              <w:t>2. Evaluate effect of changes</w:t>
+            </w:r>
+          </w:p>
         </w:tc>
         <w:tc>
           <w:tcPr>
@@ -2218,11 +2210,10 @@
               <w:left w:val="single" w:sz="4" w:space="0" w:color="auto"/>
               <w:right w:val="single" w:sz="4" w:space="0" w:color="auto"/>
             </w:tcBorders>
-            <w:shd w:val="clear" w:color="auto" w:fill="auto"/>
-          </w:tcPr>
-          <w:p>
-            <w:r>
-              <w:t>2.3</w:t>
+          </w:tcPr>
+          <w:p>
+            <w:r>
+              <w:t>2.2 Evaluate the difficulty of implementing proposed changes to ICT systems and products</w:t>
             </w:r>
           </w:p>
         </w:tc>
@@ -2233,7 +2224,6 @@
               <w:left w:val="single" w:sz="4" w:space="0" w:color="auto"/>
               <w:right w:val="single" w:sz="4" w:space="0" w:color="auto"/>
             </w:tcBorders>
-            <w:shd w:val="clear" w:color="auto" w:fill="auto"/>
           </w:tcPr>
           <w:p/>
         </w:tc>
@@ -2244,7 +2234,6 @@
               <w:left w:val="single" w:sz="4" w:space="0" w:color="auto"/>
               <w:right w:val="single" w:sz="4" w:space="0" w:color="auto"/>
             </w:tcBorders>
-            <w:shd w:val="clear" w:color="auto" w:fill="auto"/>
           </w:tcPr>
           <w:p/>
         </w:tc>
@@ -2255,7 +2244,6 @@
               <w:left w:val="single" w:sz="4" w:space="0" w:color="auto"/>
               <w:right w:val="single" w:sz="4" w:space="0" w:color="auto"/>
             </w:tcBorders>
-            <w:shd w:val="clear" w:color="auto" w:fill="auto"/>
           </w:tcPr>
           <w:p/>
         </w:tc>
@@ -2266,7 +2254,6 @@
               <w:left w:val="single" w:sz="4" w:space="0" w:color="auto"/>
               <w:right w:val="single" w:sz="4" w:space="0" w:color="auto"/>
             </w:tcBorders>
-            <w:shd w:val="clear" w:color="auto" w:fill="auto"/>
           </w:tcPr>
           <w:p/>
         </w:tc>
@@ -2277,7 +2264,6 @@
               <w:left w:val="single" w:sz="4" w:space="0" w:color="auto"/>
               <w:right w:val="nil"/>
             </w:tcBorders>
-            <w:shd w:val="clear" w:color="auto" w:fill="auto"/>
           </w:tcPr>
           <w:p/>
         </w:tc>
@@ -2293,11 +2279,10 @@
               <w:left w:val="nil"/>
               <w:right w:val="single" w:sz="4" w:space="0" w:color="auto"/>
             </w:tcBorders>
-            <w:shd w:val="clear" w:color="auto" w:fill="auto"/>
-          </w:tcPr>
-          <w:p>
-            <w:r>
-              <w:t>3</w:t>
+          </w:tcPr>
+          <w:p>
+            <w:r>
+              <w:t>2. Evaluate effect of changes</w:t>
             </w:r>
           </w:p>
         </w:tc>
@@ -2308,11 +2293,10 @@
               <w:left w:val="single" w:sz="4" w:space="0" w:color="auto"/>
               <w:right w:val="single" w:sz="4" w:space="0" w:color="auto"/>
             </w:tcBorders>
-            <w:shd w:val="clear" w:color="auto" w:fill="auto"/>
-          </w:tcPr>
-          <w:p>
-            <w:r>
-              <w:t>3.1</w:t>
+          </w:tcPr>
+          <w:p>
+            <w:r>
+              <w:t>2.3 Prioritise proposed changes to refine opportunities and assist in scheduling implementation</w:t>
             </w:r>
           </w:p>
         </w:tc>
@@ -2323,7 +2307,6 @@
               <w:left w:val="single" w:sz="4" w:space="0" w:color="auto"/>
               <w:right w:val="single" w:sz="4" w:space="0" w:color="auto"/>
             </w:tcBorders>
-            <w:shd w:val="clear" w:color="auto" w:fill="auto"/>
           </w:tcPr>
           <w:p/>
         </w:tc>
@@ -2334,7 +2317,6 @@
               <w:left w:val="single" w:sz="4" w:space="0" w:color="auto"/>
               <w:right w:val="single" w:sz="4" w:space="0" w:color="auto"/>
             </w:tcBorders>
-            <w:shd w:val="clear" w:color="auto" w:fill="auto"/>
           </w:tcPr>
           <w:p/>
         </w:tc>
@@ -2345,7 +2327,6 @@
               <w:left w:val="single" w:sz="4" w:space="0" w:color="auto"/>
               <w:right w:val="single" w:sz="4" w:space="0" w:color="auto"/>
             </w:tcBorders>
-            <w:shd w:val="clear" w:color="auto" w:fill="auto"/>
           </w:tcPr>
           <w:p/>
         </w:tc>
@@ -2356,7 +2337,6 @@
               <w:left w:val="single" w:sz="4" w:space="0" w:color="auto"/>
               <w:right w:val="single" w:sz="4" w:space="0" w:color="auto"/>
             </w:tcBorders>
-            <w:shd w:val="clear" w:color="auto" w:fill="auto"/>
           </w:tcPr>
           <w:p/>
         </w:tc>
@@ -2367,7 +2347,6 @@
               <w:left w:val="single" w:sz="4" w:space="0" w:color="auto"/>
               <w:right w:val="nil"/>
             </w:tcBorders>
-            <w:shd w:val="clear" w:color="auto" w:fill="auto"/>
           </w:tcPr>
           <w:p/>
         </w:tc>
@@ -2383,9 +2362,12 @@
               <w:left w:val="nil"/>
               <w:right w:val="single" w:sz="4" w:space="0" w:color="auto"/>
             </w:tcBorders>
-            <w:shd w:val="clear" w:color="auto" w:fill="auto"/>
-          </w:tcPr>
-          <w:p/>
+          </w:tcPr>
+          <w:p>
+            <w:r>
+              <w:t>2. Evaluate effect of changes</w:t>
+            </w:r>
+          </w:p>
         </w:tc>
         <w:tc>
           <w:tcPr>
@@ -2394,11 +2376,10 @@
               <w:left w:val="single" w:sz="4" w:space="0" w:color="auto"/>
               <w:right w:val="single" w:sz="4" w:space="0" w:color="auto"/>
             </w:tcBorders>
-            <w:shd w:val="clear" w:color="auto" w:fill="auto"/>
-          </w:tcPr>
-          <w:p>
-            <w:r>
-              <w:t>3.2</w:t>
+          </w:tcPr>
+          <w:p>
+            <w:r>
+              <w:t>2.4 Document evaluation process and provide to superior for feedback</w:t>
             </w:r>
           </w:p>
         </w:tc>
@@ -2409,7 +2390,6 @@
               <w:left w:val="single" w:sz="4" w:space="0" w:color="auto"/>
               <w:right w:val="single" w:sz="4" w:space="0" w:color="auto"/>
             </w:tcBorders>
-            <w:shd w:val="clear" w:color="auto" w:fill="auto"/>
           </w:tcPr>
           <w:p/>
         </w:tc>
@@ -2420,7 +2400,6 @@
               <w:left w:val="single" w:sz="4" w:space="0" w:color="auto"/>
               <w:right w:val="single" w:sz="4" w:space="0" w:color="auto"/>
             </w:tcBorders>
-            <w:shd w:val="clear" w:color="auto" w:fill="auto"/>
           </w:tcPr>
           <w:p/>
         </w:tc>
@@ -2431,7 +2410,6 @@
               <w:left w:val="single" w:sz="4" w:space="0" w:color="auto"/>
               <w:right w:val="single" w:sz="4" w:space="0" w:color="auto"/>
             </w:tcBorders>
-            <w:shd w:val="clear" w:color="auto" w:fill="auto"/>
           </w:tcPr>
           <w:p/>
         </w:tc>
@@ -2442,7 +2420,6 @@
               <w:left w:val="single" w:sz="4" w:space="0" w:color="auto"/>
               <w:right w:val="single" w:sz="4" w:space="0" w:color="auto"/>
             </w:tcBorders>
-            <w:shd w:val="clear" w:color="auto" w:fill="auto"/>
           </w:tcPr>
           <w:p/>
         </w:tc>
@@ -2453,7 +2430,6 @@
               <w:left w:val="single" w:sz="4" w:space="0" w:color="auto"/>
               <w:right w:val="nil"/>
             </w:tcBorders>
-            <w:shd w:val="clear" w:color="auto" w:fill="auto"/>
           </w:tcPr>
           <w:p/>
         </w:tc>
@@ -2469,9 +2445,13 @@
               <w:left w:val="nil"/>
               <w:right w:val="single" w:sz="4" w:space="0" w:color="auto"/>
             </w:tcBorders>
-            <w:shd w:val="clear" w:color="auto" w:fill="auto"/>
-          </w:tcPr>
-          <w:p/>
+          </w:tcPr>
+          <w:p>
+            <w:r>
+              <w:lastRenderedPageBreak/>
+              <w:t>3. Plan implementation of changes</w:t>
+            </w:r>
+          </w:p>
         </w:tc>
         <w:tc>
           <w:tcPr>
@@ -2480,11 +2460,10 @@
               <w:left w:val="single" w:sz="4" w:space="0" w:color="auto"/>
               <w:right w:val="single" w:sz="4" w:space="0" w:color="auto"/>
             </w:tcBorders>
-            <w:shd w:val="clear" w:color="auto" w:fill="auto"/>
-          </w:tcPr>
-          <w:p>
-            <w:r>
-              <w:t>3.3</w:t>
+          </w:tcPr>
+          <w:p>
+            <w:r>
+              <w:t>3.1 Develop action plan to implement proposed changes including prioritised schedule and consistency with organisational policy and procedures</w:t>
             </w:r>
           </w:p>
         </w:tc>
@@ -2495,7 +2474,6 @@
               <w:left w:val="single" w:sz="4" w:space="0" w:color="auto"/>
               <w:right w:val="single" w:sz="4" w:space="0" w:color="auto"/>
             </w:tcBorders>
-            <w:shd w:val="clear" w:color="auto" w:fill="auto"/>
           </w:tcPr>
           <w:p/>
         </w:tc>
@@ -2506,7 +2484,6 @@
               <w:left w:val="single" w:sz="4" w:space="0" w:color="auto"/>
               <w:right w:val="single" w:sz="4" w:space="0" w:color="auto"/>
             </w:tcBorders>
-            <w:shd w:val="clear" w:color="auto" w:fill="auto"/>
           </w:tcPr>
           <w:p/>
         </w:tc>
@@ -2517,7 +2494,6 @@
               <w:left w:val="single" w:sz="4" w:space="0" w:color="auto"/>
               <w:right w:val="single" w:sz="4" w:space="0" w:color="auto"/>
             </w:tcBorders>
-            <w:shd w:val="clear" w:color="auto" w:fill="auto"/>
           </w:tcPr>
           <w:p/>
         </w:tc>
@@ -2528,7 +2504,6 @@
               <w:left w:val="single" w:sz="4" w:space="0" w:color="auto"/>
               <w:right w:val="single" w:sz="4" w:space="0" w:color="auto"/>
             </w:tcBorders>
-            <w:shd w:val="clear" w:color="auto" w:fill="auto"/>
           </w:tcPr>
           <w:p/>
         </w:tc>
@@ -2539,7 +2514,6 @@
               <w:left w:val="single" w:sz="4" w:space="0" w:color="auto"/>
               <w:right w:val="nil"/>
             </w:tcBorders>
-            <w:shd w:val="clear" w:color="auto" w:fill="auto"/>
           </w:tcPr>
           <w:p/>
         </w:tc>
@@ -2555,11 +2529,10 @@
               <w:left w:val="nil"/>
               <w:right w:val="single" w:sz="4" w:space="0" w:color="auto"/>
             </w:tcBorders>
-            <w:shd w:val="clear" w:color="auto" w:fill="auto"/>
-          </w:tcPr>
-          <w:p>
-            <w:r>
-              <w:t>4</w:t>
+          </w:tcPr>
+          <w:p>
+            <w:r>
+              <w:t>3. Plan implementation of changes</w:t>
             </w:r>
           </w:p>
         </w:tc>
@@ -2570,11 +2543,10 @@
               <w:left w:val="single" w:sz="4" w:space="0" w:color="auto"/>
               <w:right w:val="single" w:sz="4" w:space="0" w:color="auto"/>
             </w:tcBorders>
-            <w:shd w:val="clear" w:color="auto" w:fill="auto"/>
-          </w:tcPr>
-          <w:p>
-            <w:r>
-              <w:t>4.1</w:t>
+          </w:tcPr>
+          <w:p>
+            <w:r>
+              <w:t>3.2 Detail standards, targets and implementation methods in action plan</w:t>
             </w:r>
           </w:p>
         </w:tc>
@@ -2585,7 +2557,6 @@
               <w:left w:val="single" w:sz="4" w:space="0" w:color="auto"/>
               <w:right w:val="single" w:sz="4" w:space="0" w:color="auto"/>
             </w:tcBorders>
-            <w:shd w:val="clear" w:color="auto" w:fill="auto"/>
           </w:tcPr>
           <w:p/>
         </w:tc>
@@ -2596,7 +2567,6 @@
               <w:left w:val="single" w:sz="4" w:space="0" w:color="auto"/>
               <w:right w:val="single" w:sz="4" w:space="0" w:color="auto"/>
             </w:tcBorders>
-            <w:shd w:val="clear" w:color="auto" w:fill="auto"/>
           </w:tcPr>
           <w:p/>
         </w:tc>
@@ -2607,7 +2577,6 @@
               <w:left w:val="single" w:sz="4" w:space="0" w:color="auto"/>
               <w:right w:val="single" w:sz="4" w:space="0" w:color="auto"/>
             </w:tcBorders>
-            <w:shd w:val="clear" w:color="auto" w:fill="auto"/>
           </w:tcPr>
           <w:p/>
         </w:tc>
@@ -2618,7 +2587,6 @@
               <w:left w:val="single" w:sz="4" w:space="0" w:color="auto"/>
               <w:right w:val="single" w:sz="4" w:space="0" w:color="auto"/>
             </w:tcBorders>
-            <w:shd w:val="clear" w:color="auto" w:fill="auto"/>
           </w:tcPr>
           <w:p/>
         </w:tc>
@@ -2629,7 +2597,6 @@
               <w:left w:val="single" w:sz="4" w:space="0" w:color="auto"/>
               <w:right w:val="nil"/>
             </w:tcBorders>
-            <w:shd w:val="clear" w:color="auto" w:fill="auto"/>
           </w:tcPr>
           <w:p/>
         </w:tc>
@@ -2645,9 +2612,12 @@
               <w:left w:val="nil"/>
               <w:right w:val="single" w:sz="4" w:space="0" w:color="auto"/>
             </w:tcBorders>
-            <w:shd w:val="clear" w:color="auto" w:fill="auto"/>
-          </w:tcPr>
-          <w:p/>
+          </w:tcPr>
+          <w:p>
+            <w:r>
+              <w:t>3. Plan implementation of changes</w:t>
+            </w:r>
+          </w:p>
         </w:tc>
         <w:tc>
           <w:tcPr>
@@ -2656,11 +2626,10 @@
               <w:left w:val="single" w:sz="4" w:space="0" w:color="auto"/>
               <w:right w:val="single" w:sz="4" w:space="0" w:color="auto"/>
             </w:tcBorders>
-            <w:shd w:val="clear" w:color="auto" w:fill="auto"/>
-          </w:tcPr>
-          <w:p>
-            <w:r>
-              <w:t>4.2</w:t>
+          </w:tcPr>
+          <w:p>
+            <w:r>
+              <w:t>3.3 Provide action plan to superior for feedback and approval</w:t>
             </w:r>
           </w:p>
         </w:tc>
@@ -2671,7 +2640,6 @@
               <w:left w:val="single" w:sz="4" w:space="0" w:color="auto"/>
               <w:right w:val="single" w:sz="4" w:space="0" w:color="auto"/>
             </w:tcBorders>
-            <w:shd w:val="clear" w:color="auto" w:fill="auto"/>
           </w:tcPr>
           <w:p/>
         </w:tc>
@@ -2682,7 +2650,6 @@
               <w:left w:val="single" w:sz="4" w:space="0" w:color="auto"/>
               <w:right w:val="single" w:sz="4" w:space="0" w:color="auto"/>
             </w:tcBorders>
-            <w:shd w:val="clear" w:color="auto" w:fill="auto"/>
           </w:tcPr>
           <w:p/>
         </w:tc>
@@ -2693,7 +2660,6 @@
               <w:left w:val="single" w:sz="4" w:space="0" w:color="auto"/>
               <w:right w:val="single" w:sz="4" w:space="0" w:color="auto"/>
             </w:tcBorders>
-            <w:shd w:val="clear" w:color="auto" w:fill="auto"/>
           </w:tcPr>
           <w:p/>
         </w:tc>
@@ -2704,7 +2670,6 @@
               <w:left w:val="single" w:sz="4" w:space="0" w:color="auto"/>
               <w:right w:val="single" w:sz="4" w:space="0" w:color="auto"/>
             </w:tcBorders>
-            <w:shd w:val="clear" w:color="auto" w:fill="auto"/>
           </w:tcPr>
           <w:p/>
         </w:tc>
@@ -2715,93 +2680,6 @@
               <w:left w:val="single" w:sz="4" w:space="0" w:color="auto"/>
               <w:right w:val="nil"/>
             </w:tcBorders>
-            <w:shd w:val="clear" w:color="auto" w:fill="auto"/>
-          </w:tcPr>
-          <w:p/>
-        </w:tc>
-      </w:tr>
-      <w:tr>
-        <w:trPr>
-          <w:trHeight w:val="340"/>
-        </w:trPr>
-        <w:tc>
-          <w:tcPr>
-            <w:tcW w:w="2948" w:type="dxa"/>
-            <w:tcBorders>
-              <w:left w:val="nil"/>
-              <w:right w:val="single" w:sz="4" w:space="0" w:color="auto"/>
-            </w:tcBorders>
-            <w:shd w:val="clear" w:color="auto" w:fill="auto"/>
-          </w:tcPr>
-          <w:p/>
-        </w:tc>
-        <w:tc>
-          <w:tcPr>
-            <w:tcW w:w="8364" w:type="dxa"/>
-            <w:tcBorders>
-              <w:left w:val="single" w:sz="4" w:space="0" w:color="auto"/>
-              <w:right w:val="single" w:sz="4" w:space="0" w:color="auto"/>
-            </w:tcBorders>
-            <w:shd w:val="clear" w:color="auto" w:fill="auto"/>
-          </w:tcPr>
-          <w:p>
-            <w:r>
-              <w:t>4.3</w:t>
-            </w:r>
-          </w:p>
-        </w:tc>
-        <w:tc>
-          <w:tcPr>
-            <w:tcW w:w="850" w:type="dxa"/>
-            <w:tcBorders>
-              <w:left w:val="single" w:sz="4" w:space="0" w:color="auto"/>
-              <w:right w:val="single" w:sz="4" w:space="0" w:color="auto"/>
-            </w:tcBorders>
-            <w:shd w:val="clear" w:color="auto" w:fill="auto"/>
-          </w:tcPr>
-          <w:p/>
-        </w:tc>
-        <w:tc>
-          <w:tcPr>
-            <w:tcW w:w="851" w:type="dxa"/>
-            <w:tcBorders>
-              <w:left w:val="single" w:sz="4" w:space="0" w:color="auto"/>
-              <w:right w:val="single" w:sz="4" w:space="0" w:color="auto"/>
-            </w:tcBorders>
-            <w:shd w:val="clear" w:color="auto" w:fill="auto"/>
-          </w:tcPr>
-          <w:p/>
-        </w:tc>
-        <w:tc>
-          <w:tcPr>
-            <w:tcW w:w="850" w:type="dxa"/>
-            <w:tcBorders>
-              <w:left w:val="single" w:sz="4" w:space="0" w:color="auto"/>
-              <w:right w:val="single" w:sz="4" w:space="0" w:color="auto"/>
-            </w:tcBorders>
-            <w:shd w:val="clear" w:color="auto" w:fill="auto"/>
-          </w:tcPr>
-          <w:p/>
-        </w:tc>
-        <w:tc>
-          <w:tcPr>
-            <w:tcW w:w="851" w:type="dxa"/>
-            <w:tcBorders>
-              <w:left w:val="single" w:sz="4" w:space="0" w:color="auto"/>
-              <w:right w:val="single" w:sz="4" w:space="0" w:color="auto"/>
-            </w:tcBorders>
-            <w:shd w:val="clear" w:color="auto" w:fill="auto"/>
-          </w:tcPr>
-          <w:p/>
-        </w:tc>
-        <w:tc>
-          <w:tcPr>
-            <w:tcW w:w="850" w:type="dxa"/>
-            <w:tcBorders>
-              <w:left w:val="single" w:sz="4" w:space="0" w:color="auto"/>
-              <w:right w:val="nil"/>
-            </w:tcBorders>
-            <w:shd w:val="clear" w:color="auto" w:fill="auto"/>
           </w:tcPr>
           <w:p/>
         </w:tc>
@@ -2858,7 +2736,6 @@
               </w:rPr>
             </w:pPr>
             <w:r>
-              <w:lastRenderedPageBreak/>
               <w:t>Required Skills / Performance Evidence</w:t>
             </w:r>
           </w:p>
@@ -2972,7 +2849,6 @@
               <w:bottom w:val="single" w:sz="4" w:space="0" w:color="auto"/>
               <w:right w:val="single" w:sz="4" w:space="0" w:color="auto"/>
             </w:tcBorders>
-            <w:shd w:val="clear" w:color="auto" w:fill="auto"/>
             <w:vAlign w:val="center"/>
           </w:tcPr>
           <w:p>
@@ -3008,7 +2884,6 @@
               <w:bottom w:val="single" w:sz="4" w:space="0" w:color="auto"/>
               <w:right w:val="single" w:sz="4" w:space="0" w:color="auto"/>
             </w:tcBorders>
-            <w:shd w:val="clear" w:color="auto" w:fill="auto"/>
             <w:vAlign w:val="center"/>
           </w:tcPr>
           <w:p>
@@ -3030,7 +2905,6 @@
               <w:bottom w:val="single" w:sz="4" w:space="0" w:color="auto"/>
               <w:right w:val="single" w:sz="4" w:space="0" w:color="auto"/>
             </w:tcBorders>
-            <w:shd w:val="clear" w:color="auto" w:fill="auto"/>
             <w:vAlign w:val="center"/>
           </w:tcPr>
           <w:p>
@@ -3052,7 +2926,6 @@
               <w:bottom w:val="single" w:sz="4" w:space="0" w:color="auto"/>
               <w:right w:val="single" w:sz="4" w:space="0" w:color="auto"/>
             </w:tcBorders>
-            <w:shd w:val="clear" w:color="auto" w:fill="auto"/>
             <w:vAlign w:val="center"/>
           </w:tcPr>
           <w:p>
@@ -3074,7 +2947,6 @@
               <w:bottom w:val="single" w:sz="4" w:space="0" w:color="auto"/>
               <w:right w:val="single" w:sz="4" w:space="0" w:color="auto"/>
             </w:tcBorders>
-            <w:shd w:val="clear" w:color="auto" w:fill="auto"/>
             <w:vAlign w:val="center"/>
           </w:tcPr>
           <w:p>
@@ -3096,7 +2968,6 @@
               <w:bottom w:val="single" w:sz="4" w:space="0" w:color="auto"/>
               <w:right w:val="nil"/>
             </w:tcBorders>
-            <w:shd w:val="clear" w:color="auto" w:fill="auto"/>
             <w:vAlign w:val="center"/>
           </w:tcPr>
           <w:p>
@@ -3122,9 +2993,78 @@
               <w:left w:val="nil"/>
               <w:right w:val="single" w:sz="4" w:space="0" w:color="auto"/>
             </w:tcBorders>
-            <w:shd w:val="clear" w:color="auto" w:fill="auto"/>
-          </w:tcPr>
-          <w:p/>
+          </w:tcPr>
+          <w:p>
+            <w:r>
+              <w:t>For one organisation:</w:t>
+            </w:r>
+          </w:p>
+          <w:p>
+            <w:pPr>
+              <w:numPr>
+                <w:ilvl w:val="0"/>
+                <w:numId w:val="38"/>
+              </w:numPr>
+            </w:pPr>
+            <w:r>
+              <w:t>interpret a strategic plan and objectives of the organisation</w:t>
+            </w:r>
+          </w:p>
+          <w:p>
+            <w:pPr>
+              <w:numPr>
+                <w:ilvl w:val="0"/>
+                <w:numId w:val="38"/>
+              </w:numPr>
+            </w:pPr>
+            <w:r>
+              <w:t>evaluate the current state of ICT in the organisation</w:t>
+            </w:r>
+          </w:p>
+          <w:p>
+            <w:pPr>
+              <w:numPr>
+                <w:ilvl w:val="0"/>
+                <w:numId w:val="38"/>
+              </w:numPr>
+            </w:pPr>
+            <w:r>
+              <w:t>identify possible gaps and opportunities in ICT and evaluate organisational impact with reference to the strategic plan and the objectives</w:t>
+            </w:r>
+          </w:p>
+          <w:p>
+            <w:pPr>
+              <w:numPr>
+                <w:ilvl w:val="0"/>
+                <w:numId w:val="38"/>
+              </w:numPr>
+            </w:pPr>
+            <w:r>
+              <w:t>determine and prioritise proposed changes to meet organisational needs</w:t>
+            </w:r>
+          </w:p>
+          <w:p>
+            <w:pPr>
+              <w:numPr>
+                <w:ilvl w:val="0"/>
+                <w:numId w:val="38"/>
+              </w:numPr>
+            </w:pPr>
+            <w:r>
+              <w:t>evaluate the difficulty of implementing proposed changes</w:t>
+            </w:r>
+          </w:p>
+          <w:p>
+            <w:pPr>
+              <w:numPr>
+                <w:ilvl w:val="0"/>
+                <w:numId w:val="38"/>
+              </w:numPr>
+            </w:pPr>
+            <w:r>
+              <w:t>develop an action plan for implementation</w:t>
+            </w:r>
+          </w:p>
         </w:tc>
         <w:tc>
           <w:tcPr>
@@ -3134,7 +3074,6 @@
               <w:left w:val="single" w:sz="4" w:space="0" w:color="auto"/>
               <w:right w:val="single" w:sz="4" w:space="0" w:color="auto"/>
             </w:tcBorders>
-            <w:shd w:val="clear" w:color="auto" w:fill="auto"/>
           </w:tcPr>
           <w:p/>
         </w:tc>
@@ -3146,7 +3085,6 @@
               <w:left w:val="single" w:sz="4" w:space="0" w:color="auto"/>
               <w:right w:val="single" w:sz="4" w:space="0" w:color="auto"/>
             </w:tcBorders>
-            <w:shd w:val="clear" w:color="auto" w:fill="auto"/>
           </w:tcPr>
           <w:p/>
         </w:tc>
@@ -3158,7 +3096,6 @@
               <w:left w:val="single" w:sz="4" w:space="0" w:color="auto"/>
               <w:right w:val="single" w:sz="4" w:space="0" w:color="auto"/>
             </w:tcBorders>
-            <w:shd w:val="clear" w:color="auto" w:fill="auto"/>
           </w:tcPr>
           <w:p/>
         </w:tc>
@@ -3170,7 +3107,6 @@
               <w:left w:val="single" w:sz="4" w:space="0" w:color="auto"/>
               <w:right w:val="single" w:sz="4" w:space="0" w:color="auto"/>
             </w:tcBorders>
-            <w:shd w:val="clear" w:color="auto" w:fill="auto"/>
           </w:tcPr>
           <w:p/>
         </w:tc>
@@ -3182,220 +3118,6 @@
               <w:left w:val="single" w:sz="4" w:space="0" w:color="auto"/>
               <w:right w:val="nil"/>
             </w:tcBorders>
-            <w:shd w:val="clear" w:color="auto" w:fill="auto"/>
-          </w:tcPr>
-          <w:p/>
-        </w:tc>
-      </w:tr>
-      <w:tr>
-        <w:trPr>
-          <w:trHeight w:val="340"/>
-        </w:trPr>
-        <w:tc>
-          <w:tcPr>
-            <w:tcW w:w="11272" w:type="dxa"/>
-            <w:tcBorders>
-              <w:left w:val="nil"/>
-              <w:right w:val="single" w:sz="4" w:space="0" w:color="auto"/>
-            </w:tcBorders>
-            <w:shd w:val="clear" w:color="auto" w:fill="auto"/>
-          </w:tcPr>
-          <w:p/>
-        </w:tc>
-        <w:tc>
-          <w:tcPr>
-            <w:tcW w:w="859" w:type="dxa"/>
-            <w:tcBorders>
-              <w:left w:val="single" w:sz="4" w:space="0" w:color="auto"/>
-              <w:right w:val="single" w:sz="4" w:space="0" w:color="auto"/>
-            </w:tcBorders>
-            <w:shd w:val="clear" w:color="auto" w:fill="auto"/>
-          </w:tcPr>
-          <w:p/>
-        </w:tc>
-        <w:tc>
-          <w:tcPr>
-            <w:tcW w:w="859" w:type="dxa"/>
-            <w:tcBorders>
-              <w:left w:val="single" w:sz="4" w:space="0" w:color="auto"/>
-              <w:right w:val="single" w:sz="4" w:space="0" w:color="auto"/>
-            </w:tcBorders>
-            <w:shd w:val="clear" w:color="auto" w:fill="auto"/>
-          </w:tcPr>
-          <w:p/>
-        </w:tc>
-        <w:tc>
-          <w:tcPr>
-            <w:tcW w:w="859" w:type="dxa"/>
-            <w:tcBorders>
-              <w:left w:val="single" w:sz="4" w:space="0" w:color="auto"/>
-              <w:right w:val="single" w:sz="4" w:space="0" w:color="auto"/>
-            </w:tcBorders>
-            <w:shd w:val="clear" w:color="auto" w:fill="auto"/>
-          </w:tcPr>
-          <w:p/>
-        </w:tc>
-        <w:tc>
-          <w:tcPr>
-            <w:tcW w:w="859" w:type="dxa"/>
-            <w:tcBorders>
-              <w:left w:val="single" w:sz="4" w:space="0" w:color="auto"/>
-              <w:right w:val="single" w:sz="4" w:space="0" w:color="auto"/>
-            </w:tcBorders>
-            <w:shd w:val="clear" w:color="auto" w:fill="auto"/>
-          </w:tcPr>
-          <w:p/>
-        </w:tc>
-        <w:tc>
-          <w:tcPr>
-            <w:tcW w:w="860" w:type="dxa"/>
-            <w:tcBorders>
-              <w:left w:val="single" w:sz="4" w:space="0" w:color="auto"/>
-              <w:right w:val="nil"/>
-            </w:tcBorders>
-            <w:shd w:val="clear" w:color="auto" w:fill="auto"/>
-          </w:tcPr>
-          <w:p/>
-        </w:tc>
-      </w:tr>
-      <w:tr>
-        <w:trPr>
-          <w:trHeight w:val="340"/>
-        </w:trPr>
-        <w:tc>
-          <w:tcPr>
-            <w:tcW w:w="11272" w:type="dxa"/>
-            <w:tcBorders>
-              <w:left w:val="nil"/>
-              <w:right w:val="single" w:sz="4" w:space="0" w:color="auto"/>
-            </w:tcBorders>
-            <w:shd w:val="clear" w:color="auto" w:fill="auto"/>
-          </w:tcPr>
-          <w:p/>
-        </w:tc>
-        <w:tc>
-          <w:tcPr>
-            <w:tcW w:w="859" w:type="dxa"/>
-            <w:tcBorders>
-              <w:left w:val="single" w:sz="4" w:space="0" w:color="auto"/>
-              <w:right w:val="single" w:sz="4" w:space="0" w:color="auto"/>
-            </w:tcBorders>
-            <w:shd w:val="clear" w:color="auto" w:fill="auto"/>
-          </w:tcPr>
-          <w:p/>
-        </w:tc>
-        <w:tc>
-          <w:tcPr>
-            <w:tcW w:w="859" w:type="dxa"/>
-            <w:tcBorders>
-              <w:left w:val="single" w:sz="4" w:space="0" w:color="auto"/>
-              <w:right w:val="single" w:sz="4" w:space="0" w:color="auto"/>
-            </w:tcBorders>
-            <w:shd w:val="clear" w:color="auto" w:fill="auto"/>
-          </w:tcPr>
-          <w:p/>
-        </w:tc>
-        <w:tc>
-          <w:tcPr>
-            <w:tcW w:w="859" w:type="dxa"/>
-            <w:tcBorders>
-              <w:left w:val="single" w:sz="4" w:space="0" w:color="auto"/>
-              <w:right w:val="single" w:sz="4" w:space="0" w:color="auto"/>
-            </w:tcBorders>
-            <w:shd w:val="clear" w:color="auto" w:fill="auto"/>
-          </w:tcPr>
-          <w:p/>
-        </w:tc>
-        <w:tc>
-          <w:tcPr>
-            <w:tcW w:w="859" w:type="dxa"/>
-            <w:tcBorders>
-              <w:left w:val="single" w:sz="4" w:space="0" w:color="auto"/>
-              <w:right w:val="single" w:sz="4" w:space="0" w:color="auto"/>
-            </w:tcBorders>
-            <w:shd w:val="clear" w:color="auto" w:fill="auto"/>
-          </w:tcPr>
-          <w:p/>
-        </w:tc>
-        <w:tc>
-          <w:tcPr>
-            <w:tcW w:w="860" w:type="dxa"/>
-            <w:tcBorders>
-              <w:left w:val="single" w:sz="4" w:space="0" w:color="auto"/>
-              <w:right w:val="nil"/>
-            </w:tcBorders>
-            <w:shd w:val="clear" w:color="auto" w:fill="auto"/>
-          </w:tcPr>
-          <w:p/>
-        </w:tc>
-      </w:tr>
-      <w:tr>
-        <w:trPr>
-          <w:trHeight w:val="340"/>
-        </w:trPr>
-        <w:tc>
-          <w:tcPr>
-            <w:tcW w:w="11272" w:type="dxa"/>
-            <w:tcBorders>
-              <w:left w:val="nil"/>
-              <w:right w:val="single" w:sz="4" w:space="0" w:color="auto"/>
-            </w:tcBorders>
-            <w:shd w:val="clear" w:color="auto" w:fill="auto"/>
-          </w:tcPr>
-          <w:p/>
-        </w:tc>
-        <w:tc>
-          <w:tcPr>
-            <w:tcW w:w="859" w:type="dxa"/>
-            <w:tcBorders>
-              <w:left w:val="single" w:sz="4" w:space="0" w:color="auto"/>
-              <w:right w:val="single" w:sz="4" w:space="0" w:color="auto"/>
-            </w:tcBorders>
-            <w:shd w:val="clear" w:color="auto" w:fill="auto"/>
-          </w:tcPr>
-          <w:p/>
-        </w:tc>
-        <w:tc>
-          <w:tcPr>
-            <w:tcW w:w="859" w:type="dxa"/>
-            <w:tcBorders>
-              <w:left w:val="single" w:sz="4" w:space="0" w:color="auto"/>
-              <w:right w:val="single" w:sz="4" w:space="0" w:color="auto"/>
-            </w:tcBorders>
-            <w:shd w:val="clear" w:color="auto" w:fill="auto"/>
-          </w:tcPr>
-          <w:p/>
-        </w:tc>
-        <w:tc>
-          <w:tcPr>
-            <w:tcW w:w="859" w:type="dxa"/>
-            <w:tcBorders>
-              <w:left w:val="single" w:sz="4" w:space="0" w:color="auto"/>
-              <w:right w:val="single" w:sz="4" w:space="0" w:color="auto"/>
-            </w:tcBorders>
-            <w:shd w:val="clear" w:color="auto" w:fill="auto"/>
-          </w:tcPr>
-          <w:p/>
-        </w:tc>
-        <w:tc>
-          <w:tcPr>
-            <w:tcW w:w="859" w:type="dxa"/>
-            <w:tcBorders>
-              <w:left w:val="single" w:sz="4" w:space="0" w:color="auto"/>
-              <w:right w:val="single" w:sz="4" w:space="0" w:color="auto"/>
-            </w:tcBorders>
-            <w:shd w:val="clear" w:color="auto" w:fill="auto"/>
-          </w:tcPr>
-          <w:p/>
-        </w:tc>
-        <w:tc>
-          <w:tcPr>
-            <w:tcW w:w="860" w:type="dxa"/>
-            <w:tcBorders>
-              <w:left w:val="single" w:sz="4" w:space="0" w:color="auto"/>
-              <w:right w:val="nil"/>
-            </w:tcBorders>
-            <w:shd w:val="clear" w:color="auto" w:fill="auto"/>
           </w:tcPr>
           <w:p/>
         </w:tc>
@@ -3576,7 +3298,6 @@
               <w:bottom w:val="single" w:sz="4" w:space="0" w:color="auto"/>
               <w:right w:val="single" w:sz="4" w:space="0" w:color="auto"/>
             </w:tcBorders>
-            <w:shd w:val="clear" w:color="auto" w:fill="auto"/>
             <w:vAlign w:val="center"/>
           </w:tcPr>
           <w:p>
@@ -3612,7 +3333,6 @@
               <w:bottom w:val="single" w:sz="4" w:space="0" w:color="auto"/>
               <w:right w:val="single" w:sz="4" w:space="0" w:color="auto"/>
             </w:tcBorders>
-            <w:shd w:val="clear" w:color="auto" w:fill="auto"/>
             <w:vAlign w:val="center"/>
           </w:tcPr>
           <w:p>
@@ -3634,7 +3354,6 @@
               <w:bottom w:val="single" w:sz="4" w:space="0" w:color="auto"/>
               <w:right w:val="single" w:sz="4" w:space="0" w:color="auto"/>
             </w:tcBorders>
-            <w:shd w:val="clear" w:color="auto" w:fill="auto"/>
             <w:vAlign w:val="center"/>
           </w:tcPr>
           <w:p>
@@ -3656,7 +3375,6 @@
               <w:bottom w:val="single" w:sz="4" w:space="0" w:color="auto"/>
               <w:right w:val="single" w:sz="4" w:space="0" w:color="auto"/>
             </w:tcBorders>
-            <w:shd w:val="clear" w:color="auto" w:fill="auto"/>
             <w:vAlign w:val="center"/>
           </w:tcPr>
           <w:p>
@@ -3678,7 +3396,6 @@
               <w:bottom w:val="single" w:sz="4" w:space="0" w:color="auto"/>
               <w:right w:val="single" w:sz="4" w:space="0" w:color="auto"/>
             </w:tcBorders>
-            <w:shd w:val="clear" w:color="auto" w:fill="auto"/>
             <w:vAlign w:val="center"/>
           </w:tcPr>
           <w:p>
@@ -3700,7 +3417,6 @@
               <w:bottom w:val="single" w:sz="4" w:space="0" w:color="auto"/>
               <w:right w:val="nil"/>
             </w:tcBorders>
-            <w:shd w:val="clear" w:color="auto" w:fill="auto"/>
             <w:vAlign w:val="center"/>
           </w:tcPr>
           <w:p>
@@ -3726,10 +3442,13 @@
               <w:left w:val="nil"/>
               <w:right w:val="single" w:sz="4" w:space="0" w:color="auto"/>
             </w:tcBorders>
-            <w:shd w:val="clear" w:color="auto" w:fill="auto"/>
             <w:vAlign w:val="center"/>
           </w:tcPr>
-          <w:p/>
+          <w:p>
+            <w:r>
+              <w:t>Key sections of an action plan for ICT implementation projects</w:t>
+            </w:r>
+          </w:p>
         </w:tc>
         <w:tc>
           <w:tcPr>
@@ -3739,7 +3458,6 @@
               <w:left w:val="single" w:sz="4" w:space="0" w:color="auto"/>
               <w:right w:val="single" w:sz="4" w:space="0" w:color="auto"/>
             </w:tcBorders>
-            <w:shd w:val="clear" w:color="auto" w:fill="auto"/>
           </w:tcPr>
           <w:p/>
         </w:tc>
@@ -3751,7 +3469,6 @@
               <w:left w:val="single" w:sz="4" w:space="0" w:color="auto"/>
               <w:right w:val="single" w:sz="4" w:space="0" w:color="auto"/>
             </w:tcBorders>
-            <w:shd w:val="clear" w:color="auto" w:fill="auto"/>
           </w:tcPr>
           <w:p/>
         </w:tc>
@@ -3763,7 +3480,6 @@
               <w:left w:val="single" w:sz="4" w:space="0" w:color="auto"/>
               <w:right w:val="single" w:sz="4" w:space="0" w:color="auto"/>
             </w:tcBorders>
-            <w:shd w:val="clear" w:color="auto" w:fill="auto"/>
           </w:tcPr>
           <w:p/>
         </w:tc>
@@ -3775,7 +3491,6 @@
               <w:left w:val="single" w:sz="4" w:space="0" w:color="auto"/>
               <w:right w:val="single" w:sz="4" w:space="0" w:color="auto"/>
             </w:tcBorders>
-            <w:shd w:val="clear" w:color="auto" w:fill="auto"/>
           </w:tcPr>
           <w:p/>
         </w:tc>
@@ -3787,7 +3502,6 @@
               <w:left w:val="single" w:sz="4" w:space="0" w:color="auto"/>
               <w:right w:val="nil"/>
             </w:tcBorders>
-            <w:shd w:val="clear" w:color="auto" w:fill="auto"/>
           </w:tcPr>
           <w:p/>
         </w:tc>
@@ -3803,9 +3517,12 @@
               <w:left w:val="nil"/>
               <w:right w:val="single" w:sz="4" w:space="0" w:color="auto"/>
             </w:tcBorders>
-            <w:shd w:val="clear" w:color="auto" w:fill="auto"/>
-          </w:tcPr>
-          <w:p/>
+          </w:tcPr>
+          <w:p>
+            <w:r>
+              <w:t>Methods of evaluation and planning approaches to technical problems and strategic objectives</w:t>
+            </w:r>
+          </w:p>
         </w:tc>
         <w:tc>
           <w:tcPr>
@@ -3814,7 +3531,6 @@
               <w:left w:val="single" w:sz="4" w:space="0" w:color="auto"/>
               <w:right w:val="single" w:sz="4" w:space="0" w:color="auto"/>
             </w:tcBorders>
-            <w:shd w:val="clear" w:color="auto" w:fill="auto"/>
           </w:tcPr>
           <w:p/>
         </w:tc>
@@ -3825,7 +3541,6 @@
               <w:left w:val="single" w:sz="4" w:space="0" w:color="auto"/>
               <w:right w:val="single" w:sz="4" w:space="0" w:color="auto"/>
             </w:tcBorders>
-            <w:shd w:val="clear" w:color="auto" w:fill="auto"/>
           </w:tcPr>
           <w:p/>
         </w:tc>
@@ -3836,7 +3551,6 @@
               <w:left w:val="single" w:sz="4" w:space="0" w:color="auto"/>
               <w:right w:val="single" w:sz="4" w:space="0" w:color="auto"/>
             </w:tcBorders>
-            <w:shd w:val="clear" w:color="auto" w:fill="auto"/>
           </w:tcPr>
           <w:p/>
         </w:tc>
@@ -3847,7 +3561,6 @@
               <w:left w:val="single" w:sz="4" w:space="0" w:color="auto"/>
               <w:right w:val="single" w:sz="4" w:space="0" w:color="auto"/>
             </w:tcBorders>
-            <w:shd w:val="clear" w:color="auto" w:fill="auto"/>
           </w:tcPr>
           <w:p/>
         </w:tc>
@@ -3858,7 +3571,6 @@
               <w:left w:val="single" w:sz="4" w:space="0" w:color="auto"/>
               <w:right w:val="nil"/>
             </w:tcBorders>
-            <w:shd w:val="clear" w:color="auto" w:fill="auto"/>
           </w:tcPr>
           <w:p/>
         </w:tc>
@@ -3874,9 +3586,12 @@
               <w:left w:val="nil"/>
               <w:right w:val="single" w:sz="4" w:space="0" w:color="auto"/>
             </w:tcBorders>
-            <w:shd w:val="clear" w:color="auto" w:fill="auto"/>
-          </w:tcPr>
-          <w:p/>
+          </w:tcPr>
+          <w:p>
+            <w:r>
+              <w:t>Methods of evaluation of competing and complementary internal and external ICT systems and products</w:t>
+            </w:r>
+          </w:p>
         </w:tc>
         <w:tc>
           <w:tcPr>
@@ -3885,7 +3600,6 @@
               <w:left w:val="single" w:sz="4" w:space="0" w:color="auto"/>
               <w:right w:val="single" w:sz="4" w:space="0" w:color="auto"/>
             </w:tcBorders>
-            <w:shd w:val="clear" w:color="auto" w:fill="auto"/>
           </w:tcPr>
           <w:p/>
         </w:tc>
@@ -3896,7 +3610,6 @@
               <w:left w:val="single" w:sz="4" w:space="0" w:color="auto"/>
               <w:right w:val="single" w:sz="4" w:space="0" w:color="auto"/>
             </w:tcBorders>
-            <w:shd w:val="clear" w:color="auto" w:fill="auto"/>
           </w:tcPr>
           <w:p/>
         </w:tc>
@@ -3907,7 +3620,6 @@
               <w:left w:val="single" w:sz="4" w:space="0" w:color="auto"/>
               <w:right w:val="single" w:sz="4" w:space="0" w:color="auto"/>
             </w:tcBorders>
-            <w:shd w:val="clear" w:color="auto" w:fill="auto"/>
           </w:tcPr>
           <w:p/>
         </w:tc>
@@ -3918,7 +3630,6 @@
               <w:left w:val="single" w:sz="4" w:space="0" w:color="auto"/>
               <w:right w:val="single" w:sz="4" w:space="0" w:color="auto"/>
             </w:tcBorders>
-            <w:shd w:val="clear" w:color="auto" w:fill="auto"/>
           </w:tcPr>
           <w:p/>
         </w:tc>
@@ -3929,7 +3640,6 @@
               <w:left w:val="single" w:sz="4" w:space="0" w:color="auto"/>
               <w:right w:val="nil"/>
             </w:tcBorders>
-            <w:shd w:val="clear" w:color="auto" w:fill="auto"/>
           </w:tcPr>
           <w:p/>
         </w:tc>
@@ -3945,9 +3655,13 @@
               <w:left w:val="nil"/>
               <w:right w:val="single" w:sz="4" w:space="0" w:color="auto"/>
             </w:tcBorders>
-            <w:shd w:val="clear" w:color="auto" w:fill="auto"/>
-          </w:tcPr>
-          <w:p/>
+          </w:tcPr>
+          <w:p>
+            <w:r>
+              <w:lastRenderedPageBreak/>
+              <w:t>Current and emerging system and product trends and directions</w:t>
+            </w:r>
+          </w:p>
         </w:tc>
         <w:tc>
           <w:tcPr>
@@ -3956,7 +3670,6 @@
               <w:left w:val="single" w:sz="4" w:space="0" w:color="auto"/>
               <w:right w:val="single" w:sz="4" w:space="0" w:color="auto"/>
             </w:tcBorders>
-            <w:shd w:val="clear" w:color="auto" w:fill="auto"/>
           </w:tcPr>
           <w:p/>
         </w:tc>
@@ -3967,7 +3680,6 @@
               <w:left w:val="single" w:sz="4" w:space="0" w:color="auto"/>
               <w:right w:val="single" w:sz="4" w:space="0" w:color="auto"/>
             </w:tcBorders>
-            <w:shd w:val="clear" w:color="auto" w:fill="auto"/>
           </w:tcPr>
           <w:p/>
         </w:tc>
@@ -3978,7 +3690,6 @@
               <w:left w:val="single" w:sz="4" w:space="0" w:color="auto"/>
               <w:right w:val="single" w:sz="4" w:space="0" w:color="auto"/>
             </w:tcBorders>
-            <w:shd w:val="clear" w:color="auto" w:fill="auto"/>
           </w:tcPr>
           <w:p/>
         </w:tc>
@@ -3989,7 +3700,6 @@
               <w:left w:val="single" w:sz="4" w:space="0" w:color="auto"/>
               <w:right w:val="single" w:sz="4" w:space="0" w:color="auto"/>
             </w:tcBorders>
-            <w:shd w:val="clear" w:color="auto" w:fill="auto"/>
           </w:tcPr>
           <w:p/>
         </w:tc>
@@ -4000,7 +3710,6 @@
               <w:left w:val="single" w:sz="4" w:space="0" w:color="auto"/>
               <w:right w:val="nil"/>
             </w:tcBorders>
-            <w:shd w:val="clear" w:color="auto" w:fill="auto"/>
           </w:tcPr>
           <w:p/>
         </w:tc>
@@ -4173,7 +3882,6 @@
               <w:bottom w:val="single" w:sz="4" w:space="0" w:color="auto"/>
               <w:right w:val="single" w:sz="4" w:space="0" w:color="auto"/>
             </w:tcBorders>
-            <w:shd w:val="clear" w:color="auto" w:fill="auto"/>
             <w:vAlign w:val="center"/>
           </w:tcPr>
           <w:p>
@@ -4203,7 +3911,6 @@
               <w:bottom w:val="single" w:sz="4" w:space="0" w:color="auto"/>
               <w:right w:val="single" w:sz="4" w:space="0" w:color="auto"/>
             </w:tcBorders>
-            <w:shd w:val="clear" w:color="auto" w:fill="auto"/>
             <w:vAlign w:val="center"/>
           </w:tcPr>
           <w:p>
@@ -4233,7 +3940,6 @@
               <w:bottom w:val="single" w:sz="4" w:space="0" w:color="auto"/>
               <w:right w:val="single" w:sz="4" w:space="0" w:color="auto"/>
             </w:tcBorders>
-            <w:shd w:val="clear" w:color="auto" w:fill="auto"/>
             <w:vAlign w:val="center"/>
           </w:tcPr>
           <w:p>
@@ -4263,7 +3969,6 @@
               <w:bottom w:val="single" w:sz="4" w:space="0" w:color="auto"/>
               <w:right w:val="single" w:sz="4" w:space="0" w:color="auto"/>
             </w:tcBorders>
-            <w:shd w:val="clear" w:color="auto" w:fill="auto"/>
             <w:vAlign w:val="center"/>
           </w:tcPr>
           <w:p>
@@ -4285,7 +3990,6 @@
               <w:bottom w:val="single" w:sz="4" w:space="0" w:color="auto"/>
               <w:right w:val="single" w:sz="4" w:space="0" w:color="auto"/>
             </w:tcBorders>
-            <w:shd w:val="clear" w:color="auto" w:fill="auto"/>
             <w:vAlign w:val="center"/>
           </w:tcPr>
           <w:p>
@@ -4307,7 +4011,6 @@
               <w:bottom w:val="single" w:sz="4" w:space="0" w:color="auto"/>
               <w:right w:val="single" w:sz="4" w:space="0" w:color="auto"/>
             </w:tcBorders>
-            <w:shd w:val="clear" w:color="auto" w:fill="auto"/>
             <w:vAlign w:val="center"/>
           </w:tcPr>
           <w:p>
@@ -4329,7 +4032,6 @@
               <w:bottom w:val="single" w:sz="4" w:space="0" w:color="auto"/>
               <w:right w:val="single" w:sz="4" w:space="0" w:color="auto"/>
             </w:tcBorders>
-            <w:shd w:val="clear" w:color="auto" w:fill="auto"/>
             <w:vAlign w:val="center"/>
           </w:tcPr>
           <w:p>
@@ -4351,7 +4053,6 @@
               <w:bottom w:val="single" w:sz="4" w:space="0" w:color="auto"/>
               <w:right w:val="nil"/>
             </w:tcBorders>
-            <w:shd w:val="clear" w:color="auto" w:fill="auto"/>
             <w:vAlign w:val="center"/>
           </w:tcPr>
           <w:p>
@@ -4377,9 +4078,12 @@
               <w:left w:val="nil"/>
               <w:right w:val="single" w:sz="4" w:space="0" w:color="auto"/>
             </w:tcBorders>
-            <w:shd w:val="clear" w:color="auto" w:fill="auto"/>
-          </w:tcPr>
-          <w:p/>
+          </w:tcPr>
+          <w:p>
+            <w:r>
+              <w:t>Reading</w:t>
+            </w:r>
+          </w:p>
         </w:tc>
         <w:tc>
           <w:tcPr>
@@ -4389,7 +4093,6 @@
               <w:left w:val="single" w:sz="4" w:space="0" w:color="auto"/>
               <w:right w:val="single" w:sz="4" w:space="0" w:color="auto"/>
             </w:tcBorders>
-            <w:shd w:val="clear" w:color="auto" w:fill="auto"/>
           </w:tcPr>
           <w:p/>
         </w:tc>
@@ -4401,9 +4104,12 @@
               <w:left w:val="single" w:sz="4" w:space="0" w:color="auto"/>
               <w:right w:val="single" w:sz="4" w:space="0" w:color="auto"/>
             </w:tcBorders>
-            <w:shd w:val="clear" w:color="auto" w:fill="auto"/>
-          </w:tcPr>
-          <w:p/>
+          </w:tcPr>
+          <w:p>
+            <w:r>
+              <w:t>Reviews, analyses and evaluates complex online and hard copy documentation containing ICT specific terminology, diagrams and numerical information to determine ICT gaps and improvement opportunities</w:t>
+            </w:r>
+          </w:p>
         </w:tc>
         <w:tc>
           <w:tcPr>
@@ -4412,7 +4118,6 @@
               <w:left w:val="single" w:sz="4" w:space="0" w:color="auto"/>
               <w:right w:val="single" w:sz="4" w:space="0" w:color="auto"/>
             </w:tcBorders>
-            <w:shd w:val="clear" w:color="auto" w:fill="auto"/>
           </w:tcPr>
           <w:p/>
         </w:tc>
@@ -4423,7 +4128,6 @@
               <w:left w:val="single" w:sz="4" w:space="0" w:color="auto"/>
               <w:right w:val="single" w:sz="4" w:space="0" w:color="auto"/>
             </w:tcBorders>
-            <w:shd w:val="clear" w:color="auto" w:fill="auto"/>
           </w:tcPr>
           <w:p/>
         </w:tc>
@@ -4434,7 +4138,6 @@
               <w:left w:val="single" w:sz="4" w:space="0" w:color="auto"/>
               <w:right w:val="single" w:sz="4" w:space="0" w:color="auto"/>
             </w:tcBorders>
-            <w:shd w:val="clear" w:color="auto" w:fill="auto"/>
           </w:tcPr>
           <w:p/>
         </w:tc>
@@ -4445,7 +4148,6 @@
               <w:left w:val="single" w:sz="4" w:space="0" w:color="auto"/>
               <w:right w:val="single" w:sz="4" w:space="0" w:color="auto"/>
             </w:tcBorders>
-            <w:shd w:val="clear" w:color="auto" w:fill="auto"/>
           </w:tcPr>
           <w:p/>
         </w:tc>
@@ -4456,7 +4158,6 @@
               <w:left w:val="single" w:sz="4" w:space="0" w:color="auto"/>
               <w:right w:val="nil"/>
             </w:tcBorders>
-            <w:shd w:val="clear" w:color="auto" w:fill="auto"/>
           </w:tcPr>
           <w:p/>
         </w:tc>
@@ -4472,9 +4173,12 @@
               <w:left w:val="nil"/>
               <w:right w:val="single" w:sz="4" w:space="0" w:color="auto"/>
             </w:tcBorders>
-            <w:shd w:val="clear" w:color="auto" w:fill="auto"/>
-          </w:tcPr>
-          <w:p/>
+          </w:tcPr>
+          <w:p>
+            <w:r>
+              <w:t>Writing</w:t>
+            </w:r>
+          </w:p>
         </w:tc>
         <w:tc>
           <w:tcPr>
@@ -4483,7 +4187,6 @@
               <w:left w:val="single" w:sz="4" w:space="0" w:color="auto"/>
               <w:right w:val="single" w:sz="4" w:space="0" w:color="auto"/>
             </w:tcBorders>
-            <w:shd w:val="clear" w:color="auto" w:fill="auto"/>
           </w:tcPr>
           <w:p/>
         </w:tc>
@@ -4494,9 +4197,12 @@
               <w:left w:val="single" w:sz="4" w:space="0" w:color="auto"/>
               <w:right w:val="single" w:sz="4" w:space="0" w:color="auto"/>
             </w:tcBorders>
-            <w:shd w:val="clear" w:color="auto" w:fill="auto"/>
-          </w:tcPr>
-          <w:p/>
+          </w:tcPr>
+          <w:p>
+            <w:r>
+              <w:t>Uses plain English, together with vocabulary, grammatical structures, terminology, diagrams, numerical information, formatting and structure relevant to the job role and organisation</w:t>
+            </w:r>
+          </w:p>
         </w:tc>
         <w:tc>
           <w:tcPr>
@@ -4505,7 +4211,6 @@
               <w:left w:val="single" w:sz="4" w:space="0" w:color="auto"/>
               <w:right w:val="single" w:sz="4" w:space="0" w:color="auto"/>
             </w:tcBorders>
-            <w:shd w:val="clear" w:color="auto" w:fill="auto"/>
           </w:tcPr>
           <w:p/>
         </w:tc>
@@ -4516,7 +4221,6 @@
               <w:left w:val="single" w:sz="4" w:space="0" w:color="auto"/>
               <w:right w:val="single" w:sz="4" w:space="0" w:color="auto"/>
             </w:tcBorders>
-            <w:shd w:val="clear" w:color="auto" w:fill="auto"/>
           </w:tcPr>
           <w:p/>
         </w:tc>
@@ -4527,7 +4231,6 @@
               <w:left w:val="single" w:sz="4" w:space="0" w:color="auto"/>
               <w:right w:val="single" w:sz="4" w:space="0" w:color="auto"/>
             </w:tcBorders>
-            <w:shd w:val="clear" w:color="auto" w:fill="auto"/>
           </w:tcPr>
           <w:p/>
         </w:tc>
@@ -4538,7 +4241,6 @@
               <w:left w:val="single" w:sz="4" w:space="0" w:color="auto"/>
               <w:right w:val="single" w:sz="4" w:space="0" w:color="auto"/>
             </w:tcBorders>
-            <w:shd w:val="clear" w:color="auto" w:fill="auto"/>
           </w:tcPr>
           <w:p/>
         </w:tc>
@@ -4549,7 +4251,6 @@
               <w:left w:val="single" w:sz="4" w:space="0" w:color="auto"/>
               <w:right w:val="nil"/>
             </w:tcBorders>
-            <w:shd w:val="clear" w:color="auto" w:fill="auto"/>
           </w:tcPr>
           <w:p/>
         </w:tc>
@@ -4565,9 +4266,12 @@
               <w:left w:val="nil"/>
               <w:right w:val="single" w:sz="4" w:space="0" w:color="auto"/>
             </w:tcBorders>
-            <w:shd w:val="clear" w:color="auto" w:fill="auto"/>
-          </w:tcPr>
-          <w:p/>
+          </w:tcPr>
+          <w:p>
+            <w:r>
+              <w:t>Oral Communication</w:t>
+            </w:r>
+          </w:p>
         </w:tc>
         <w:tc>
           <w:tcPr>
@@ -4576,7 +4280,6 @@
               <w:left w:val="single" w:sz="4" w:space="0" w:color="auto"/>
               <w:right w:val="single" w:sz="4" w:space="0" w:color="auto"/>
             </w:tcBorders>
-            <w:shd w:val="clear" w:color="auto" w:fill="auto"/>
           </w:tcPr>
           <w:p/>
         </w:tc>
@@ -4587,9 +4290,20 @@
               <w:left w:val="single" w:sz="4" w:space="0" w:color="auto"/>
               <w:right w:val="single" w:sz="4" w:space="0" w:color="auto"/>
             </w:tcBorders>
-            <w:shd w:val="clear" w:color="auto" w:fill="auto"/>
-          </w:tcPr>
-          <w:p/>
+          </w:tcPr>
+          <w:p>
+            <w:r>
+              <w:t xml:space="preserve">Uses plain English, translating technical </w:t>
+            </w:r>
+            <w:proofErr w:type="gramStart"/>
+            <w:r>
+              <w:t>terminology</w:t>
+            </w:r>
+            <w:proofErr w:type="gramEnd"/>
+            <w:r>
+              <w:t xml:space="preserve"> when necessary, to communicate with a range of personnel and determine objectives, articulate ideas and requirements, and develop plans</w:t>
+            </w:r>
+          </w:p>
         </w:tc>
         <w:tc>
           <w:tcPr>
@@ -4598,7 +4312,6 @@
               <w:left w:val="single" w:sz="4" w:space="0" w:color="auto"/>
               <w:right w:val="single" w:sz="4" w:space="0" w:color="auto"/>
             </w:tcBorders>
-            <w:shd w:val="clear" w:color="auto" w:fill="auto"/>
           </w:tcPr>
           <w:p/>
         </w:tc>
@@ -4609,7 +4322,6 @@
               <w:left w:val="single" w:sz="4" w:space="0" w:color="auto"/>
               <w:right w:val="single" w:sz="4" w:space="0" w:color="auto"/>
             </w:tcBorders>
-            <w:shd w:val="clear" w:color="auto" w:fill="auto"/>
           </w:tcPr>
           <w:p/>
         </w:tc>
@@ -4620,7 +4332,6 @@
               <w:left w:val="single" w:sz="4" w:space="0" w:color="auto"/>
               <w:right w:val="single" w:sz="4" w:space="0" w:color="auto"/>
             </w:tcBorders>
-            <w:shd w:val="clear" w:color="auto" w:fill="auto"/>
           </w:tcPr>
           <w:p/>
         </w:tc>
@@ -4631,7 +4342,6 @@
               <w:left w:val="single" w:sz="4" w:space="0" w:color="auto"/>
               <w:right w:val="single" w:sz="4" w:space="0" w:color="auto"/>
             </w:tcBorders>
-            <w:shd w:val="clear" w:color="auto" w:fill="auto"/>
           </w:tcPr>
           <w:p/>
         </w:tc>
@@ -4642,7 +4352,1070 @@
               <w:left w:val="single" w:sz="4" w:space="0" w:color="auto"/>
               <w:right w:val="nil"/>
             </w:tcBorders>
-            <w:shd w:val="clear" w:color="auto" w:fill="auto"/>
+          </w:tcPr>
+          <w:p/>
+        </w:tc>
+      </w:tr>
+      <w:tr>
+        <w:trPr>
+          <w:trHeight w:val="340"/>
+        </w:trPr>
+        <w:tc>
+          <w:tcPr>
+            <w:tcW w:w="2381" w:type="dxa"/>
+            <w:tcBorders>
+              <w:left w:val="nil"/>
+              <w:right w:val="single" w:sz="4" w:space="0" w:color="auto"/>
+            </w:tcBorders>
+          </w:tcPr>
+          <w:p>
+            <w:r>
+              <w:t>Oral Communication</w:t>
+            </w:r>
+          </w:p>
+        </w:tc>
+        <w:tc>
+          <w:tcPr>
+            <w:tcW w:w="2552" w:type="dxa"/>
+            <w:tcBorders>
+              <w:left w:val="single" w:sz="4" w:space="0" w:color="auto"/>
+              <w:right w:val="single" w:sz="4" w:space="0" w:color="auto"/>
+            </w:tcBorders>
+          </w:tcPr>
+          <w:p/>
+        </w:tc>
+        <w:tc>
+          <w:tcPr>
+            <w:tcW w:w="6339" w:type="dxa"/>
+            <w:tcBorders>
+              <w:left w:val="single" w:sz="4" w:space="0" w:color="auto"/>
+              <w:right w:val="single" w:sz="4" w:space="0" w:color="auto"/>
+            </w:tcBorders>
+          </w:tcPr>
+          <w:p>
+            <w:r>
+              <w:t>Elicits information using effective listening and questioning techniques</w:t>
+            </w:r>
+          </w:p>
+        </w:tc>
+        <w:tc>
+          <w:tcPr>
+            <w:tcW w:w="859" w:type="dxa"/>
+            <w:tcBorders>
+              <w:left w:val="single" w:sz="4" w:space="0" w:color="auto"/>
+              <w:right w:val="single" w:sz="4" w:space="0" w:color="auto"/>
+            </w:tcBorders>
+          </w:tcPr>
+          <w:p/>
+        </w:tc>
+        <w:tc>
+          <w:tcPr>
+            <w:tcW w:w="859" w:type="dxa"/>
+            <w:tcBorders>
+              <w:left w:val="single" w:sz="4" w:space="0" w:color="auto"/>
+              <w:right w:val="single" w:sz="4" w:space="0" w:color="auto"/>
+            </w:tcBorders>
+          </w:tcPr>
+          <w:p/>
+        </w:tc>
+        <w:tc>
+          <w:tcPr>
+            <w:tcW w:w="859" w:type="dxa"/>
+            <w:tcBorders>
+              <w:left w:val="single" w:sz="4" w:space="0" w:color="auto"/>
+              <w:right w:val="single" w:sz="4" w:space="0" w:color="auto"/>
+            </w:tcBorders>
+          </w:tcPr>
+          <w:p/>
+        </w:tc>
+        <w:tc>
+          <w:tcPr>
+            <w:tcW w:w="859" w:type="dxa"/>
+            <w:tcBorders>
+              <w:left w:val="single" w:sz="4" w:space="0" w:color="auto"/>
+              <w:right w:val="single" w:sz="4" w:space="0" w:color="auto"/>
+            </w:tcBorders>
+          </w:tcPr>
+          <w:p/>
+        </w:tc>
+        <w:tc>
+          <w:tcPr>
+            <w:tcW w:w="860" w:type="dxa"/>
+            <w:tcBorders>
+              <w:left w:val="single" w:sz="4" w:space="0" w:color="auto"/>
+              <w:right w:val="nil"/>
+            </w:tcBorders>
+          </w:tcPr>
+          <w:p/>
+        </w:tc>
+      </w:tr>
+      <w:tr>
+        <w:trPr>
+          <w:trHeight w:val="340"/>
+        </w:trPr>
+        <w:tc>
+          <w:tcPr>
+            <w:tcW w:w="2381" w:type="dxa"/>
+            <w:tcBorders>
+              <w:left w:val="nil"/>
+              <w:right w:val="single" w:sz="4" w:space="0" w:color="auto"/>
+            </w:tcBorders>
+          </w:tcPr>
+          <w:p>
+            <w:r>
+              <w:t>Numeracy</w:t>
+            </w:r>
+          </w:p>
+        </w:tc>
+        <w:tc>
+          <w:tcPr>
+            <w:tcW w:w="2552" w:type="dxa"/>
+            <w:tcBorders>
+              <w:left w:val="single" w:sz="4" w:space="0" w:color="auto"/>
+              <w:right w:val="single" w:sz="4" w:space="0" w:color="auto"/>
+            </w:tcBorders>
+          </w:tcPr>
+          <w:p/>
+        </w:tc>
+        <w:tc>
+          <w:tcPr>
+            <w:tcW w:w="6339" w:type="dxa"/>
+            <w:tcBorders>
+              <w:left w:val="single" w:sz="4" w:space="0" w:color="auto"/>
+              <w:right w:val="single" w:sz="4" w:space="0" w:color="auto"/>
+            </w:tcBorders>
+          </w:tcPr>
+          <w:p>
+            <w:r>
+              <w:t>Interprets numerical data and applies mathematical calculations to assess the financial implications of introducing changes</w:t>
+            </w:r>
+          </w:p>
+        </w:tc>
+        <w:tc>
+          <w:tcPr>
+            <w:tcW w:w="859" w:type="dxa"/>
+            <w:tcBorders>
+              <w:left w:val="single" w:sz="4" w:space="0" w:color="auto"/>
+              <w:right w:val="single" w:sz="4" w:space="0" w:color="auto"/>
+            </w:tcBorders>
+          </w:tcPr>
+          <w:p/>
+        </w:tc>
+        <w:tc>
+          <w:tcPr>
+            <w:tcW w:w="859" w:type="dxa"/>
+            <w:tcBorders>
+              <w:left w:val="single" w:sz="4" w:space="0" w:color="auto"/>
+              <w:right w:val="single" w:sz="4" w:space="0" w:color="auto"/>
+            </w:tcBorders>
+          </w:tcPr>
+          <w:p/>
+        </w:tc>
+        <w:tc>
+          <w:tcPr>
+            <w:tcW w:w="859" w:type="dxa"/>
+            <w:tcBorders>
+              <w:left w:val="single" w:sz="4" w:space="0" w:color="auto"/>
+              <w:right w:val="single" w:sz="4" w:space="0" w:color="auto"/>
+            </w:tcBorders>
+          </w:tcPr>
+          <w:p/>
+        </w:tc>
+        <w:tc>
+          <w:tcPr>
+            <w:tcW w:w="859" w:type="dxa"/>
+            <w:tcBorders>
+              <w:left w:val="single" w:sz="4" w:space="0" w:color="auto"/>
+              <w:right w:val="single" w:sz="4" w:space="0" w:color="auto"/>
+            </w:tcBorders>
+          </w:tcPr>
+          <w:p/>
+        </w:tc>
+        <w:tc>
+          <w:tcPr>
+            <w:tcW w:w="860" w:type="dxa"/>
+            <w:tcBorders>
+              <w:left w:val="single" w:sz="4" w:space="0" w:color="auto"/>
+              <w:right w:val="nil"/>
+            </w:tcBorders>
+          </w:tcPr>
+          <w:p/>
+        </w:tc>
+      </w:tr>
+      <w:tr>
+        <w:trPr>
+          <w:trHeight w:val="340"/>
+        </w:trPr>
+        <w:tc>
+          <w:tcPr>
+            <w:tcW w:w="2381" w:type="dxa"/>
+            <w:tcBorders>
+              <w:left w:val="nil"/>
+              <w:right w:val="single" w:sz="4" w:space="0" w:color="auto"/>
+            </w:tcBorders>
+          </w:tcPr>
+          <w:p>
+            <w:r>
+              <w:t>Navigate the world of work</w:t>
+            </w:r>
+          </w:p>
+        </w:tc>
+        <w:tc>
+          <w:tcPr>
+            <w:tcW w:w="2552" w:type="dxa"/>
+            <w:tcBorders>
+              <w:left w:val="single" w:sz="4" w:space="0" w:color="auto"/>
+              <w:right w:val="single" w:sz="4" w:space="0" w:color="auto"/>
+            </w:tcBorders>
+          </w:tcPr>
+          <w:p/>
+        </w:tc>
+        <w:tc>
+          <w:tcPr>
+            <w:tcW w:w="6339" w:type="dxa"/>
+            <w:tcBorders>
+              <w:left w:val="single" w:sz="4" w:space="0" w:color="auto"/>
+              <w:right w:val="single" w:sz="4" w:space="0" w:color="auto"/>
+            </w:tcBorders>
+          </w:tcPr>
+          <w:p>
+            <w:r>
+              <w:t>Accepts responsibility and ownership for the task and makes decisions according to organisational needs and the need for coordination with others</w:t>
+            </w:r>
+          </w:p>
+        </w:tc>
+        <w:tc>
+          <w:tcPr>
+            <w:tcW w:w="859" w:type="dxa"/>
+            <w:tcBorders>
+              <w:left w:val="single" w:sz="4" w:space="0" w:color="auto"/>
+              <w:right w:val="single" w:sz="4" w:space="0" w:color="auto"/>
+            </w:tcBorders>
+          </w:tcPr>
+          <w:p/>
+        </w:tc>
+        <w:tc>
+          <w:tcPr>
+            <w:tcW w:w="859" w:type="dxa"/>
+            <w:tcBorders>
+              <w:left w:val="single" w:sz="4" w:space="0" w:color="auto"/>
+              <w:right w:val="single" w:sz="4" w:space="0" w:color="auto"/>
+            </w:tcBorders>
+          </w:tcPr>
+          <w:p/>
+        </w:tc>
+        <w:tc>
+          <w:tcPr>
+            <w:tcW w:w="859" w:type="dxa"/>
+            <w:tcBorders>
+              <w:left w:val="single" w:sz="4" w:space="0" w:color="auto"/>
+              <w:right w:val="single" w:sz="4" w:space="0" w:color="auto"/>
+            </w:tcBorders>
+          </w:tcPr>
+          <w:p/>
+        </w:tc>
+        <w:tc>
+          <w:tcPr>
+            <w:tcW w:w="859" w:type="dxa"/>
+            <w:tcBorders>
+              <w:left w:val="single" w:sz="4" w:space="0" w:color="auto"/>
+              <w:right w:val="single" w:sz="4" w:space="0" w:color="auto"/>
+            </w:tcBorders>
+          </w:tcPr>
+          <w:p/>
+        </w:tc>
+        <w:tc>
+          <w:tcPr>
+            <w:tcW w:w="860" w:type="dxa"/>
+            <w:tcBorders>
+              <w:left w:val="single" w:sz="4" w:space="0" w:color="auto"/>
+              <w:right w:val="nil"/>
+            </w:tcBorders>
+          </w:tcPr>
+          <w:p/>
+        </w:tc>
+      </w:tr>
+      <w:tr>
+        <w:trPr>
+          <w:trHeight w:val="340"/>
+        </w:trPr>
+        <w:tc>
+          <w:tcPr>
+            <w:tcW w:w="2381" w:type="dxa"/>
+            <w:tcBorders>
+              <w:left w:val="nil"/>
+              <w:right w:val="single" w:sz="4" w:space="0" w:color="auto"/>
+            </w:tcBorders>
+          </w:tcPr>
+          <w:p>
+            <w:r>
+              <w:t>Navigate the world of work</w:t>
+            </w:r>
+          </w:p>
+        </w:tc>
+        <w:tc>
+          <w:tcPr>
+            <w:tcW w:w="2552" w:type="dxa"/>
+            <w:tcBorders>
+              <w:left w:val="single" w:sz="4" w:space="0" w:color="auto"/>
+              <w:right w:val="single" w:sz="4" w:space="0" w:color="auto"/>
+            </w:tcBorders>
+          </w:tcPr>
+          <w:p/>
+        </w:tc>
+        <w:tc>
+          <w:tcPr>
+            <w:tcW w:w="6339" w:type="dxa"/>
+            <w:tcBorders>
+              <w:left w:val="single" w:sz="4" w:space="0" w:color="auto"/>
+              <w:right w:val="single" w:sz="4" w:space="0" w:color="auto"/>
+            </w:tcBorders>
+          </w:tcPr>
+          <w:p>
+            <w:r>
+              <w:t>Takes personal responsibility for following explicit and implicit policies, procedures and legislative requirements</w:t>
+            </w:r>
+          </w:p>
+        </w:tc>
+        <w:tc>
+          <w:tcPr>
+            <w:tcW w:w="859" w:type="dxa"/>
+            <w:tcBorders>
+              <w:left w:val="single" w:sz="4" w:space="0" w:color="auto"/>
+              <w:right w:val="single" w:sz="4" w:space="0" w:color="auto"/>
+            </w:tcBorders>
+          </w:tcPr>
+          <w:p/>
+        </w:tc>
+        <w:tc>
+          <w:tcPr>
+            <w:tcW w:w="859" w:type="dxa"/>
+            <w:tcBorders>
+              <w:left w:val="single" w:sz="4" w:space="0" w:color="auto"/>
+              <w:right w:val="single" w:sz="4" w:space="0" w:color="auto"/>
+            </w:tcBorders>
+          </w:tcPr>
+          <w:p/>
+        </w:tc>
+        <w:tc>
+          <w:tcPr>
+            <w:tcW w:w="859" w:type="dxa"/>
+            <w:tcBorders>
+              <w:left w:val="single" w:sz="4" w:space="0" w:color="auto"/>
+              <w:right w:val="single" w:sz="4" w:space="0" w:color="auto"/>
+            </w:tcBorders>
+          </w:tcPr>
+          <w:p/>
+        </w:tc>
+        <w:tc>
+          <w:tcPr>
+            <w:tcW w:w="859" w:type="dxa"/>
+            <w:tcBorders>
+              <w:left w:val="single" w:sz="4" w:space="0" w:color="auto"/>
+              <w:right w:val="single" w:sz="4" w:space="0" w:color="auto"/>
+            </w:tcBorders>
+          </w:tcPr>
+          <w:p/>
+        </w:tc>
+        <w:tc>
+          <w:tcPr>
+            <w:tcW w:w="860" w:type="dxa"/>
+            <w:tcBorders>
+              <w:left w:val="single" w:sz="4" w:space="0" w:color="auto"/>
+              <w:right w:val="nil"/>
+            </w:tcBorders>
+          </w:tcPr>
+          <w:p/>
+        </w:tc>
+      </w:tr>
+      <w:tr>
+        <w:trPr>
+          <w:trHeight w:val="340"/>
+        </w:trPr>
+        <w:tc>
+          <w:tcPr>
+            <w:tcW w:w="2381" w:type="dxa"/>
+            <w:tcBorders>
+              <w:left w:val="nil"/>
+              <w:right w:val="single" w:sz="4" w:space="0" w:color="auto"/>
+            </w:tcBorders>
+          </w:tcPr>
+          <w:p>
+            <w:r>
+              <w:t>Interact with others</w:t>
+            </w:r>
+          </w:p>
+        </w:tc>
+        <w:tc>
+          <w:tcPr>
+            <w:tcW w:w="2552" w:type="dxa"/>
+            <w:tcBorders>
+              <w:left w:val="single" w:sz="4" w:space="0" w:color="auto"/>
+              <w:right w:val="single" w:sz="4" w:space="0" w:color="auto"/>
+            </w:tcBorders>
+          </w:tcPr>
+          <w:p/>
+        </w:tc>
+        <w:tc>
+          <w:tcPr>
+            <w:tcW w:w="6339" w:type="dxa"/>
+            <w:tcBorders>
+              <w:left w:val="single" w:sz="4" w:space="0" w:color="auto"/>
+              <w:right w:val="single" w:sz="4" w:space="0" w:color="auto"/>
+            </w:tcBorders>
+          </w:tcPr>
+          <w:p>
+            <w:r>
+              <w:t xml:space="preserve">Selects and uses appropriate conventions and protocols when communicating with clients and colleagues in a range of work </w:t>
+            </w:r>
+            <w:r>
+              <w:lastRenderedPageBreak/>
+              <w:t>contexts</w:t>
+            </w:r>
+          </w:p>
+        </w:tc>
+        <w:tc>
+          <w:tcPr>
+            <w:tcW w:w="859" w:type="dxa"/>
+            <w:tcBorders>
+              <w:left w:val="single" w:sz="4" w:space="0" w:color="auto"/>
+              <w:right w:val="single" w:sz="4" w:space="0" w:color="auto"/>
+            </w:tcBorders>
+          </w:tcPr>
+          <w:p/>
+        </w:tc>
+        <w:tc>
+          <w:tcPr>
+            <w:tcW w:w="859" w:type="dxa"/>
+            <w:tcBorders>
+              <w:left w:val="single" w:sz="4" w:space="0" w:color="auto"/>
+              <w:right w:val="single" w:sz="4" w:space="0" w:color="auto"/>
+            </w:tcBorders>
+          </w:tcPr>
+          <w:p/>
+        </w:tc>
+        <w:tc>
+          <w:tcPr>
+            <w:tcW w:w="859" w:type="dxa"/>
+            <w:tcBorders>
+              <w:left w:val="single" w:sz="4" w:space="0" w:color="auto"/>
+              <w:right w:val="single" w:sz="4" w:space="0" w:color="auto"/>
+            </w:tcBorders>
+          </w:tcPr>
+          <w:p/>
+        </w:tc>
+        <w:tc>
+          <w:tcPr>
+            <w:tcW w:w="859" w:type="dxa"/>
+            <w:tcBorders>
+              <w:left w:val="single" w:sz="4" w:space="0" w:color="auto"/>
+              <w:right w:val="single" w:sz="4" w:space="0" w:color="auto"/>
+            </w:tcBorders>
+          </w:tcPr>
+          <w:p/>
+        </w:tc>
+        <w:tc>
+          <w:tcPr>
+            <w:tcW w:w="860" w:type="dxa"/>
+            <w:tcBorders>
+              <w:left w:val="single" w:sz="4" w:space="0" w:color="auto"/>
+              <w:right w:val="nil"/>
+            </w:tcBorders>
+          </w:tcPr>
+          <w:p/>
+        </w:tc>
+      </w:tr>
+      <w:tr>
+        <w:trPr>
+          <w:trHeight w:val="340"/>
+        </w:trPr>
+        <w:tc>
+          <w:tcPr>
+            <w:tcW w:w="2381" w:type="dxa"/>
+            <w:tcBorders>
+              <w:left w:val="nil"/>
+              <w:right w:val="single" w:sz="4" w:space="0" w:color="auto"/>
+            </w:tcBorders>
+          </w:tcPr>
+          <w:p>
+            <w:r>
+              <w:t>Interact with others</w:t>
+            </w:r>
+          </w:p>
+        </w:tc>
+        <w:tc>
+          <w:tcPr>
+            <w:tcW w:w="2552" w:type="dxa"/>
+            <w:tcBorders>
+              <w:left w:val="single" w:sz="4" w:space="0" w:color="auto"/>
+              <w:right w:val="single" w:sz="4" w:space="0" w:color="auto"/>
+            </w:tcBorders>
+          </w:tcPr>
+          <w:p/>
+        </w:tc>
+        <w:tc>
+          <w:tcPr>
+            <w:tcW w:w="6339" w:type="dxa"/>
+            <w:tcBorders>
+              <w:left w:val="single" w:sz="4" w:space="0" w:color="auto"/>
+              <w:right w:val="single" w:sz="4" w:space="0" w:color="auto"/>
+            </w:tcBorders>
+          </w:tcPr>
+          <w:p>
+            <w:r>
+              <w:t>Recognises and accommodates basic differences and priorities of others</w:t>
+            </w:r>
+          </w:p>
+        </w:tc>
+        <w:tc>
+          <w:tcPr>
+            <w:tcW w:w="859" w:type="dxa"/>
+            <w:tcBorders>
+              <w:left w:val="single" w:sz="4" w:space="0" w:color="auto"/>
+              <w:right w:val="single" w:sz="4" w:space="0" w:color="auto"/>
+            </w:tcBorders>
+          </w:tcPr>
+          <w:p/>
+        </w:tc>
+        <w:tc>
+          <w:tcPr>
+            <w:tcW w:w="859" w:type="dxa"/>
+            <w:tcBorders>
+              <w:left w:val="single" w:sz="4" w:space="0" w:color="auto"/>
+              <w:right w:val="single" w:sz="4" w:space="0" w:color="auto"/>
+            </w:tcBorders>
+          </w:tcPr>
+          <w:p/>
+        </w:tc>
+        <w:tc>
+          <w:tcPr>
+            <w:tcW w:w="859" w:type="dxa"/>
+            <w:tcBorders>
+              <w:left w:val="single" w:sz="4" w:space="0" w:color="auto"/>
+              <w:right w:val="single" w:sz="4" w:space="0" w:color="auto"/>
+            </w:tcBorders>
+          </w:tcPr>
+          <w:p/>
+        </w:tc>
+        <w:tc>
+          <w:tcPr>
+            <w:tcW w:w="859" w:type="dxa"/>
+            <w:tcBorders>
+              <w:left w:val="single" w:sz="4" w:space="0" w:color="auto"/>
+              <w:right w:val="single" w:sz="4" w:space="0" w:color="auto"/>
+            </w:tcBorders>
+          </w:tcPr>
+          <w:p/>
+        </w:tc>
+        <w:tc>
+          <w:tcPr>
+            <w:tcW w:w="860" w:type="dxa"/>
+            <w:tcBorders>
+              <w:left w:val="single" w:sz="4" w:space="0" w:color="auto"/>
+              <w:right w:val="nil"/>
+            </w:tcBorders>
+          </w:tcPr>
+          <w:p/>
+        </w:tc>
+      </w:tr>
+      <w:tr>
+        <w:trPr>
+          <w:trHeight w:val="340"/>
+        </w:trPr>
+        <w:tc>
+          <w:tcPr>
+            <w:tcW w:w="2381" w:type="dxa"/>
+            <w:tcBorders>
+              <w:left w:val="nil"/>
+              <w:right w:val="single" w:sz="4" w:space="0" w:color="auto"/>
+            </w:tcBorders>
+          </w:tcPr>
+          <w:p>
+            <w:r>
+              <w:t>Interact with others</w:t>
+            </w:r>
+          </w:p>
+        </w:tc>
+        <w:tc>
+          <w:tcPr>
+            <w:tcW w:w="2552" w:type="dxa"/>
+            <w:tcBorders>
+              <w:left w:val="single" w:sz="4" w:space="0" w:color="auto"/>
+              <w:right w:val="single" w:sz="4" w:space="0" w:color="auto"/>
+            </w:tcBorders>
+          </w:tcPr>
+          <w:p/>
+        </w:tc>
+        <w:tc>
+          <w:tcPr>
+            <w:tcW w:w="6339" w:type="dxa"/>
+            <w:tcBorders>
+              <w:left w:val="single" w:sz="4" w:space="0" w:color="auto"/>
+              <w:right w:val="single" w:sz="4" w:space="0" w:color="auto"/>
+            </w:tcBorders>
+          </w:tcPr>
+          <w:p>
+            <w:pPr>
+              <w:tabs>
+                <w:tab w:val="left" w:pos="1020"/>
+              </w:tabs>
+            </w:pPr>
+            <w:r>
+              <w:t xml:space="preserve">Cooperates with others and contributes to work practices where joint outcomes are </w:t>
+            </w:r>
+            <w:proofErr w:type="gramStart"/>
+            <w:r>
+              <w:t>expected</w:t>
+            </w:r>
+            <w:proofErr w:type="gramEnd"/>
+            <w:r>
+              <w:t xml:space="preserve"> and deadlines are to be met</w:t>
+            </w:r>
+          </w:p>
+        </w:tc>
+        <w:tc>
+          <w:tcPr>
+            <w:tcW w:w="859" w:type="dxa"/>
+            <w:tcBorders>
+              <w:left w:val="single" w:sz="4" w:space="0" w:color="auto"/>
+              <w:right w:val="single" w:sz="4" w:space="0" w:color="auto"/>
+            </w:tcBorders>
+          </w:tcPr>
+          <w:p/>
+        </w:tc>
+        <w:tc>
+          <w:tcPr>
+            <w:tcW w:w="859" w:type="dxa"/>
+            <w:tcBorders>
+              <w:left w:val="single" w:sz="4" w:space="0" w:color="auto"/>
+              <w:right w:val="single" w:sz="4" w:space="0" w:color="auto"/>
+            </w:tcBorders>
+          </w:tcPr>
+          <w:p/>
+        </w:tc>
+        <w:tc>
+          <w:tcPr>
+            <w:tcW w:w="859" w:type="dxa"/>
+            <w:tcBorders>
+              <w:left w:val="single" w:sz="4" w:space="0" w:color="auto"/>
+              <w:right w:val="single" w:sz="4" w:space="0" w:color="auto"/>
+            </w:tcBorders>
+          </w:tcPr>
+          <w:p/>
+        </w:tc>
+        <w:tc>
+          <w:tcPr>
+            <w:tcW w:w="859" w:type="dxa"/>
+            <w:tcBorders>
+              <w:left w:val="single" w:sz="4" w:space="0" w:color="auto"/>
+              <w:right w:val="single" w:sz="4" w:space="0" w:color="auto"/>
+            </w:tcBorders>
+          </w:tcPr>
+          <w:p/>
+        </w:tc>
+        <w:tc>
+          <w:tcPr>
+            <w:tcW w:w="860" w:type="dxa"/>
+            <w:tcBorders>
+              <w:left w:val="single" w:sz="4" w:space="0" w:color="auto"/>
+              <w:right w:val="nil"/>
+            </w:tcBorders>
+          </w:tcPr>
+          <w:p/>
+        </w:tc>
+      </w:tr>
+      <w:tr>
+        <w:trPr>
+          <w:trHeight w:val="340"/>
+        </w:trPr>
+        <w:tc>
+          <w:tcPr>
+            <w:tcW w:w="2381" w:type="dxa"/>
+            <w:tcBorders>
+              <w:left w:val="nil"/>
+              <w:right w:val="single" w:sz="4" w:space="0" w:color="auto"/>
+            </w:tcBorders>
+          </w:tcPr>
+          <w:p>
+            <w:r>
+              <w:t>Get the work done</w:t>
+            </w:r>
+          </w:p>
+        </w:tc>
+        <w:tc>
+          <w:tcPr>
+            <w:tcW w:w="2552" w:type="dxa"/>
+            <w:tcBorders>
+              <w:left w:val="single" w:sz="4" w:space="0" w:color="auto"/>
+              <w:right w:val="single" w:sz="4" w:space="0" w:color="auto"/>
+            </w:tcBorders>
+          </w:tcPr>
+          <w:p/>
+        </w:tc>
+        <w:tc>
+          <w:tcPr>
+            <w:tcW w:w="6339" w:type="dxa"/>
+            <w:tcBorders>
+              <w:left w:val="single" w:sz="4" w:space="0" w:color="auto"/>
+              <w:right w:val="single" w:sz="4" w:space="0" w:color="auto"/>
+            </w:tcBorders>
+          </w:tcPr>
+          <w:p>
+            <w:r>
+              <w:t xml:space="preserve">Accepts responsibility for planning and sequencing complex tasks and workload, negotiating key aspects with others and </w:t>
+            </w:r>
+            <w:proofErr w:type="gramStart"/>
+            <w:r>
+              <w:t>taking into account</w:t>
+            </w:r>
+            <w:proofErr w:type="gramEnd"/>
+            <w:r>
+              <w:t xml:space="preserve"> capabilities, efficiencies and effectiveness</w:t>
+            </w:r>
+          </w:p>
+        </w:tc>
+        <w:tc>
+          <w:tcPr>
+            <w:tcW w:w="859" w:type="dxa"/>
+            <w:tcBorders>
+              <w:left w:val="single" w:sz="4" w:space="0" w:color="auto"/>
+              <w:right w:val="single" w:sz="4" w:space="0" w:color="auto"/>
+            </w:tcBorders>
+          </w:tcPr>
+          <w:p/>
+        </w:tc>
+        <w:tc>
+          <w:tcPr>
+            <w:tcW w:w="859" w:type="dxa"/>
+            <w:tcBorders>
+              <w:left w:val="single" w:sz="4" w:space="0" w:color="auto"/>
+              <w:right w:val="single" w:sz="4" w:space="0" w:color="auto"/>
+            </w:tcBorders>
+          </w:tcPr>
+          <w:p/>
+        </w:tc>
+        <w:tc>
+          <w:tcPr>
+            <w:tcW w:w="859" w:type="dxa"/>
+            <w:tcBorders>
+              <w:left w:val="single" w:sz="4" w:space="0" w:color="auto"/>
+              <w:right w:val="single" w:sz="4" w:space="0" w:color="auto"/>
+            </w:tcBorders>
+          </w:tcPr>
+          <w:p/>
+        </w:tc>
+        <w:tc>
+          <w:tcPr>
+            <w:tcW w:w="859" w:type="dxa"/>
+            <w:tcBorders>
+              <w:left w:val="single" w:sz="4" w:space="0" w:color="auto"/>
+              <w:right w:val="single" w:sz="4" w:space="0" w:color="auto"/>
+            </w:tcBorders>
+          </w:tcPr>
+          <w:p/>
+        </w:tc>
+        <w:tc>
+          <w:tcPr>
+            <w:tcW w:w="860" w:type="dxa"/>
+            <w:tcBorders>
+              <w:left w:val="single" w:sz="4" w:space="0" w:color="auto"/>
+              <w:right w:val="nil"/>
+            </w:tcBorders>
+          </w:tcPr>
+          <w:p/>
+        </w:tc>
+      </w:tr>
+      <w:tr>
+        <w:trPr>
+          <w:trHeight w:val="340"/>
+        </w:trPr>
+        <w:tc>
+          <w:tcPr>
+            <w:tcW w:w="2381" w:type="dxa"/>
+            <w:tcBorders>
+              <w:left w:val="nil"/>
+              <w:right w:val="single" w:sz="4" w:space="0" w:color="auto"/>
+            </w:tcBorders>
+          </w:tcPr>
+          <w:p>
+            <w:r>
+              <w:t>Get the work done</w:t>
+            </w:r>
+          </w:p>
+        </w:tc>
+        <w:tc>
+          <w:tcPr>
+            <w:tcW w:w="2552" w:type="dxa"/>
+            <w:tcBorders>
+              <w:left w:val="single" w:sz="4" w:space="0" w:color="auto"/>
+              <w:right w:val="single" w:sz="4" w:space="0" w:color="auto"/>
+            </w:tcBorders>
+          </w:tcPr>
+          <w:p/>
+        </w:tc>
+        <w:tc>
+          <w:tcPr>
+            <w:tcW w:w="6339" w:type="dxa"/>
+            <w:tcBorders>
+              <w:left w:val="single" w:sz="4" w:space="0" w:color="auto"/>
+              <w:right w:val="single" w:sz="4" w:space="0" w:color="auto"/>
+            </w:tcBorders>
+          </w:tcPr>
+          <w:p>
+            <w:r>
+              <w:t xml:space="preserve">Applies systematic and analytical </w:t>
+            </w:r>
+            <w:proofErr w:type="gramStart"/>
+            <w:r>
+              <w:t>decision making</w:t>
+            </w:r>
+            <w:proofErr w:type="gramEnd"/>
+            <w:r>
+              <w:t xml:space="preserve"> processes for complex and non-routine situations</w:t>
+            </w:r>
+          </w:p>
+        </w:tc>
+        <w:tc>
+          <w:tcPr>
+            <w:tcW w:w="859" w:type="dxa"/>
+            <w:tcBorders>
+              <w:left w:val="single" w:sz="4" w:space="0" w:color="auto"/>
+              <w:right w:val="single" w:sz="4" w:space="0" w:color="auto"/>
+            </w:tcBorders>
+          </w:tcPr>
+          <w:p/>
+        </w:tc>
+        <w:tc>
+          <w:tcPr>
+            <w:tcW w:w="859" w:type="dxa"/>
+            <w:tcBorders>
+              <w:left w:val="single" w:sz="4" w:space="0" w:color="auto"/>
+              <w:right w:val="single" w:sz="4" w:space="0" w:color="auto"/>
+            </w:tcBorders>
+          </w:tcPr>
+          <w:p/>
+        </w:tc>
+        <w:tc>
+          <w:tcPr>
+            <w:tcW w:w="859" w:type="dxa"/>
+            <w:tcBorders>
+              <w:left w:val="single" w:sz="4" w:space="0" w:color="auto"/>
+              <w:right w:val="single" w:sz="4" w:space="0" w:color="auto"/>
+            </w:tcBorders>
+          </w:tcPr>
+          <w:p/>
+        </w:tc>
+        <w:tc>
+          <w:tcPr>
+            <w:tcW w:w="859" w:type="dxa"/>
+            <w:tcBorders>
+              <w:left w:val="single" w:sz="4" w:space="0" w:color="auto"/>
+              <w:right w:val="single" w:sz="4" w:space="0" w:color="auto"/>
+            </w:tcBorders>
+          </w:tcPr>
+          <w:p/>
+        </w:tc>
+        <w:tc>
+          <w:tcPr>
+            <w:tcW w:w="860" w:type="dxa"/>
+            <w:tcBorders>
+              <w:left w:val="single" w:sz="4" w:space="0" w:color="auto"/>
+              <w:right w:val="nil"/>
+            </w:tcBorders>
+          </w:tcPr>
+          <w:p/>
+        </w:tc>
+      </w:tr>
+      <w:tr>
+        <w:trPr>
+          <w:trHeight w:val="340"/>
+        </w:trPr>
+        <w:tc>
+          <w:tcPr>
+            <w:tcW w:w="2381" w:type="dxa"/>
+            <w:tcBorders>
+              <w:left w:val="nil"/>
+              <w:right w:val="single" w:sz="4" w:space="0" w:color="auto"/>
+            </w:tcBorders>
+          </w:tcPr>
+          <w:p>
+            <w:r>
+              <w:t>Get the work done</w:t>
+            </w:r>
+          </w:p>
+        </w:tc>
+        <w:tc>
+          <w:tcPr>
+            <w:tcW w:w="2552" w:type="dxa"/>
+            <w:tcBorders>
+              <w:left w:val="single" w:sz="4" w:space="0" w:color="auto"/>
+              <w:right w:val="single" w:sz="4" w:space="0" w:color="auto"/>
+            </w:tcBorders>
+          </w:tcPr>
+          <w:p/>
+        </w:tc>
+        <w:tc>
+          <w:tcPr>
+            <w:tcW w:w="6339" w:type="dxa"/>
+            <w:tcBorders>
+              <w:left w:val="single" w:sz="4" w:space="0" w:color="auto"/>
+              <w:right w:val="single" w:sz="4" w:space="0" w:color="auto"/>
+            </w:tcBorders>
+          </w:tcPr>
+          <w:p>
+            <w:r>
+              <w:t xml:space="preserve">Investigates new and innovative ideas </w:t>
+            </w:r>
+            <w:proofErr w:type="gramStart"/>
+            <w:r>
+              <w:t>as a means to</w:t>
+            </w:r>
+            <w:proofErr w:type="gramEnd"/>
+            <w:r>
+              <w:t xml:space="preserve"> continuously improve work practices and processes through consultation and formal and analytical thinking</w:t>
+            </w:r>
+          </w:p>
+        </w:tc>
+        <w:tc>
+          <w:tcPr>
+            <w:tcW w:w="859" w:type="dxa"/>
+            <w:tcBorders>
+              <w:left w:val="single" w:sz="4" w:space="0" w:color="auto"/>
+              <w:right w:val="single" w:sz="4" w:space="0" w:color="auto"/>
+            </w:tcBorders>
+          </w:tcPr>
+          <w:p/>
+        </w:tc>
+        <w:tc>
+          <w:tcPr>
+            <w:tcW w:w="859" w:type="dxa"/>
+            <w:tcBorders>
+              <w:left w:val="single" w:sz="4" w:space="0" w:color="auto"/>
+              <w:right w:val="single" w:sz="4" w:space="0" w:color="auto"/>
+            </w:tcBorders>
+          </w:tcPr>
+          <w:p/>
+        </w:tc>
+        <w:tc>
+          <w:tcPr>
+            <w:tcW w:w="859" w:type="dxa"/>
+            <w:tcBorders>
+              <w:left w:val="single" w:sz="4" w:space="0" w:color="auto"/>
+              <w:right w:val="single" w:sz="4" w:space="0" w:color="auto"/>
+            </w:tcBorders>
+          </w:tcPr>
+          <w:p/>
+        </w:tc>
+        <w:tc>
+          <w:tcPr>
+            <w:tcW w:w="859" w:type="dxa"/>
+            <w:tcBorders>
+              <w:left w:val="single" w:sz="4" w:space="0" w:color="auto"/>
+              <w:right w:val="single" w:sz="4" w:space="0" w:color="auto"/>
+            </w:tcBorders>
+          </w:tcPr>
+          <w:p/>
+        </w:tc>
+        <w:tc>
+          <w:tcPr>
+            <w:tcW w:w="860" w:type="dxa"/>
+            <w:tcBorders>
+              <w:left w:val="single" w:sz="4" w:space="0" w:color="auto"/>
+              <w:right w:val="nil"/>
+            </w:tcBorders>
+          </w:tcPr>
+          <w:p/>
+        </w:tc>
+      </w:tr>
+      <w:tr>
+        <w:trPr>
+          <w:trHeight w:val="340"/>
+        </w:trPr>
+        <w:tc>
+          <w:tcPr>
+            <w:tcW w:w="2381" w:type="dxa"/>
+            <w:tcBorders>
+              <w:left w:val="nil"/>
+              <w:right w:val="single" w:sz="4" w:space="0" w:color="auto"/>
+            </w:tcBorders>
+          </w:tcPr>
+          <w:p>
+            <w:r>
+              <w:t>Get the work done</w:t>
+            </w:r>
+          </w:p>
+        </w:tc>
+        <w:tc>
+          <w:tcPr>
+            <w:tcW w:w="2552" w:type="dxa"/>
+            <w:tcBorders>
+              <w:left w:val="single" w:sz="4" w:space="0" w:color="auto"/>
+              <w:right w:val="single" w:sz="4" w:space="0" w:color="auto"/>
+            </w:tcBorders>
+          </w:tcPr>
+          <w:p/>
+        </w:tc>
+        <w:tc>
+          <w:tcPr>
+            <w:tcW w:w="6339" w:type="dxa"/>
+            <w:tcBorders>
+              <w:left w:val="single" w:sz="4" w:space="0" w:color="auto"/>
+              <w:right w:val="single" w:sz="4" w:space="0" w:color="auto"/>
+            </w:tcBorders>
+          </w:tcPr>
+          <w:p>
+            <w:r>
+              <w:t>Uses and investigates new digital technologies and applications to manage and manipulate data and communicate effectively with others in a secure and stable digital environment</w:t>
+            </w:r>
+          </w:p>
+        </w:tc>
+        <w:tc>
+          <w:tcPr>
+            <w:tcW w:w="859" w:type="dxa"/>
+            <w:tcBorders>
+              <w:left w:val="single" w:sz="4" w:space="0" w:color="auto"/>
+              <w:right w:val="single" w:sz="4" w:space="0" w:color="auto"/>
+            </w:tcBorders>
+          </w:tcPr>
+          <w:p/>
+        </w:tc>
+        <w:tc>
+          <w:tcPr>
+            <w:tcW w:w="859" w:type="dxa"/>
+            <w:tcBorders>
+              <w:left w:val="single" w:sz="4" w:space="0" w:color="auto"/>
+              <w:right w:val="single" w:sz="4" w:space="0" w:color="auto"/>
+            </w:tcBorders>
+          </w:tcPr>
+          <w:p/>
+        </w:tc>
+        <w:tc>
+          <w:tcPr>
+            <w:tcW w:w="859" w:type="dxa"/>
+            <w:tcBorders>
+              <w:left w:val="single" w:sz="4" w:space="0" w:color="auto"/>
+              <w:right w:val="single" w:sz="4" w:space="0" w:color="auto"/>
+            </w:tcBorders>
+          </w:tcPr>
+          <w:p/>
+        </w:tc>
+        <w:tc>
+          <w:tcPr>
+            <w:tcW w:w="859" w:type="dxa"/>
+            <w:tcBorders>
+              <w:left w:val="single" w:sz="4" w:space="0" w:color="auto"/>
+              <w:right w:val="single" w:sz="4" w:space="0" w:color="auto"/>
+            </w:tcBorders>
+          </w:tcPr>
+          <w:p/>
+        </w:tc>
+        <w:tc>
+          <w:tcPr>
+            <w:tcW w:w="860" w:type="dxa"/>
+            <w:tcBorders>
+              <w:left w:val="single" w:sz="4" w:space="0" w:color="auto"/>
+              <w:right w:val="nil"/>
+            </w:tcBorders>
           </w:tcPr>
           <w:p/>
         </w:tc>
@@ -4668,7 +5441,7 @@
 </file>
 
 <file path=word/endnotes.xml><?xml version="1.0" encoding="utf-8"?>
-<w:endnotes xmlns:wpc="http://schemas.microsoft.com/office/word/2010/wordprocessingCanvas" xmlns:cx="http://schemas.microsoft.com/office/drawing/2014/chartex" xmlns:cx1="http://schemas.microsoft.com/office/drawing/2015/9/8/chartex" xmlns:cx2="http://schemas.microsoft.com/office/drawing/2015/10/21/chartex" xmlns:cx3="http://schemas.microsoft.com/office/drawing/2016/5/9/chartex" xmlns:cx4="http://schemas.microsoft.com/office/drawing/2016/5/10/chartex" xmlns:cx5="http://schemas.microsoft.com/office/drawing/2016/5/11/chartex" xmlns:cx6="http://schemas.microsoft.com/office/drawing/2016/5/12/chartex" xmlns:cx7="http://schemas.microsoft.com/office/drawing/2016/5/13/chartex" xmlns:cx8="http://schemas.microsoft.com/office/drawing/2016/5/14/chartex" xmlns:mc="http://schemas.openxmlformats.org/markup-compatibility/2006" xmlns:aink="http://schemas.microsoft.com/office/drawing/2016/ink" xmlns:am3d="http://schemas.microsoft.com/office/drawing/2017/model3d" xmlns:o="urn:schemas-microsoft-com:office:office" xmlns:oel="http://schemas.microsoft.com/office/2019/extlst" xmlns:r="http://schemas.openxmlformats.org/officeDocument/2006/relationships" xmlns:m="http://schemas.openxmlformats.org/officeDocument/2006/math" xmlns:v="urn:schemas-microsoft-com:vml" xmlns:wp14="http://schemas.microsoft.com/office/word/2010/wordprocessingDrawing" xmlns:wp="http://schemas.openxmlformats.org/drawingml/2006/wordprocessingDrawing" xmlns:w10="urn:schemas-microsoft-com:office:word" xmlns:w="http://schemas.openxmlformats.org/wordprocessingml/2006/main" xmlns:w14="http://schemas.microsoft.com/office/word/2010/wordml" xmlns:w15="http://schemas.microsoft.com/office/word/2012/wordml" xmlns:w16cex="http://schemas.microsoft.com/office/word/2018/wordml/cex" xmlns:w16cid="http://schemas.microsoft.com/office/word/2016/wordml/cid" xmlns:w16="http://schemas.microsoft.com/office/word/2018/wordml" xmlns:w16sdtdh="http://schemas.microsoft.com/office/word/2020/wordml/sdtdatahash" xmlns:w16se="http://schemas.microsoft.com/office/word/2015/wordml/symex" xmlns:wpg="http://schemas.microsoft.com/office/word/2010/wordprocessingGroup" xmlns:wpi="http://schemas.microsoft.com/office/word/2010/wordprocessingInk" xmlns:wne="http://schemas.microsoft.com/office/word/2006/wordml" xmlns:wps="http://schemas.microsoft.com/office/word/2010/wordprocessingShape" mc:Ignorable="w14 w15 w16se w16cid w16 w16cex w16sdtdh wp14">
+<w:endnotes xmlns:wpc="http://schemas.microsoft.com/office/word/2010/wordprocessingCanvas" xmlns:cx="http://schemas.microsoft.com/office/drawing/2014/chartex" xmlns:cx1="http://schemas.microsoft.com/office/drawing/2015/9/8/chartex" xmlns:cx2="http://schemas.microsoft.com/office/drawing/2015/10/21/chartex" xmlns:cx3="http://schemas.microsoft.com/office/drawing/2016/5/9/chartex" xmlns:cx4="http://schemas.microsoft.com/office/drawing/2016/5/10/chartex" xmlns:cx5="http://schemas.microsoft.com/office/drawing/2016/5/11/chartex" xmlns:cx6="http://schemas.microsoft.com/office/drawing/2016/5/12/chartex" xmlns:cx7="http://schemas.microsoft.com/office/drawing/2016/5/13/chartex" xmlns:cx8="http://schemas.microsoft.com/office/drawing/2016/5/14/chartex" xmlns:mc="http://schemas.openxmlformats.org/markup-compatibility/2006" xmlns:aink="http://schemas.microsoft.com/office/drawing/2016/ink" xmlns:am3d="http://schemas.microsoft.com/office/drawing/2017/model3d" xmlns:o="urn:schemas-microsoft-com:office:office" xmlns:oel="http://schemas.microsoft.com/office/2019/extlst" xmlns:r="http://schemas.openxmlformats.org/officeDocument/2006/relationships" xmlns:m="http://schemas.openxmlformats.org/officeDocument/2006/math" xmlns:v="urn:schemas-microsoft-com:vml" xmlns:wp14="http://schemas.microsoft.com/office/word/2010/wordprocessingDrawing" xmlns:wp="http://schemas.openxmlformats.org/drawingml/2006/wordprocessingDrawing" xmlns:w10="urn:schemas-microsoft-com:office:word" xmlns:w="http://schemas.openxmlformats.org/wordprocessingml/2006/main" xmlns:w14="http://schemas.microsoft.com/office/word/2010/wordml" xmlns:w15="http://schemas.microsoft.com/office/word/2012/wordml" xmlns:w16cex="http://schemas.microsoft.com/office/word/2018/wordml/cex" xmlns:w16cid="http://schemas.microsoft.com/office/word/2016/wordml/cid" xmlns:w16="http://schemas.microsoft.com/office/word/2018/wordml" xmlns:w16du="http://schemas.microsoft.com/office/word/2023/wordml/word16du" xmlns:w16sdtdh="http://schemas.microsoft.com/office/word/2020/wordml/sdtdatahash" xmlns:w16sdtfl="http://schemas.microsoft.com/office/word/2024/wordml/sdtformatlock" xmlns:w16se="http://schemas.microsoft.com/office/word/2015/wordml/symex" xmlns:wpg="http://schemas.microsoft.com/office/word/2010/wordprocessingGroup" xmlns:wpi="http://schemas.microsoft.com/office/word/2010/wordprocessingInk" xmlns:wne="http://schemas.microsoft.com/office/word/2006/wordml" xmlns:wps="http://schemas.microsoft.com/office/word/2010/wordprocessingShape" mc:Ignorable="w14 w15 w16se w16cid w16 w16cex w16sdtdh w16sdtfl w16du wp14">
   <w:endnote w:type="separator" w:id="-1">
     <w:p>
       <w:r>
@@ -4687,7 +5460,7 @@
 </file>
 
 <file path=word/footer1.xml><?xml version="1.0" encoding="utf-8"?>
-<w:ftr xmlns:wpc="http://schemas.microsoft.com/office/word/2010/wordprocessingCanvas" xmlns:cx="http://schemas.microsoft.com/office/drawing/2014/chartex" xmlns:cx1="http://schemas.microsoft.com/office/drawing/2015/9/8/chartex" xmlns:cx2="http://schemas.microsoft.com/office/drawing/2015/10/21/chartex" xmlns:cx3="http://schemas.microsoft.com/office/drawing/2016/5/9/chartex" xmlns:cx4="http://schemas.microsoft.com/office/drawing/2016/5/10/chartex" xmlns:cx5="http://schemas.microsoft.com/office/drawing/2016/5/11/chartex" xmlns:cx6="http://schemas.microsoft.com/office/drawing/2016/5/12/chartex" xmlns:cx7="http://schemas.microsoft.com/office/drawing/2016/5/13/chartex" xmlns:cx8="http://schemas.microsoft.com/office/drawing/2016/5/14/chartex" xmlns:mc="http://schemas.openxmlformats.org/markup-compatibility/2006" xmlns:aink="http://schemas.microsoft.com/office/drawing/2016/ink" xmlns:am3d="http://schemas.microsoft.com/office/drawing/2017/model3d" xmlns:o="urn:schemas-microsoft-com:office:office" xmlns:oel="http://schemas.microsoft.com/office/2019/extlst" xmlns:r="http://schemas.openxmlformats.org/officeDocument/2006/relationships" xmlns:m="http://schemas.openxmlformats.org/officeDocument/2006/math" xmlns:v="urn:schemas-microsoft-com:vml" xmlns:wp14="http://schemas.microsoft.com/office/word/2010/wordprocessingDrawing" xmlns:wp="http://schemas.openxmlformats.org/drawingml/2006/wordprocessingDrawing" xmlns:w10="urn:schemas-microsoft-com:office:word" xmlns:w="http://schemas.openxmlformats.org/wordprocessingml/2006/main" xmlns:w14="http://schemas.microsoft.com/office/word/2010/wordml" xmlns:w15="http://schemas.microsoft.com/office/word/2012/wordml" xmlns:w16cex="http://schemas.microsoft.com/office/word/2018/wordml/cex" xmlns:w16cid="http://schemas.microsoft.com/office/word/2016/wordml/cid" xmlns:w16="http://schemas.microsoft.com/office/word/2018/wordml" xmlns:w16sdtdh="http://schemas.microsoft.com/office/word/2020/wordml/sdtdatahash" xmlns:w16se="http://schemas.microsoft.com/office/word/2015/wordml/symex" xmlns:wpg="http://schemas.microsoft.com/office/word/2010/wordprocessingGroup" xmlns:wpi="http://schemas.microsoft.com/office/word/2010/wordprocessingInk" xmlns:wne="http://schemas.microsoft.com/office/word/2006/wordml" xmlns:wps="http://schemas.microsoft.com/office/word/2010/wordprocessingShape" mc:Ignorable="w14 w15 w16se w16cid w16 w16cex w16sdtdh wp14">
+<w:ftr xmlns:wpc="http://schemas.microsoft.com/office/word/2010/wordprocessingCanvas" xmlns:cx="http://schemas.microsoft.com/office/drawing/2014/chartex" xmlns:cx1="http://schemas.microsoft.com/office/drawing/2015/9/8/chartex" xmlns:cx2="http://schemas.microsoft.com/office/drawing/2015/10/21/chartex" xmlns:cx3="http://schemas.microsoft.com/office/drawing/2016/5/9/chartex" xmlns:cx4="http://schemas.microsoft.com/office/drawing/2016/5/10/chartex" xmlns:cx5="http://schemas.microsoft.com/office/drawing/2016/5/11/chartex" xmlns:cx6="http://schemas.microsoft.com/office/drawing/2016/5/12/chartex" xmlns:cx7="http://schemas.microsoft.com/office/drawing/2016/5/13/chartex" xmlns:cx8="http://schemas.microsoft.com/office/drawing/2016/5/14/chartex" xmlns:mc="http://schemas.openxmlformats.org/markup-compatibility/2006" xmlns:aink="http://schemas.microsoft.com/office/drawing/2016/ink" xmlns:am3d="http://schemas.microsoft.com/office/drawing/2017/model3d" xmlns:o="urn:schemas-microsoft-com:office:office" xmlns:oel="http://schemas.microsoft.com/office/2019/extlst" xmlns:r="http://schemas.openxmlformats.org/officeDocument/2006/relationships" xmlns:m="http://schemas.openxmlformats.org/officeDocument/2006/math" xmlns:v="urn:schemas-microsoft-com:vml" xmlns:wp14="http://schemas.microsoft.com/office/word/2010/wordprocessingDrawing" xmlns:wp="http://schemas.openxmlformats.org/drawingml/2006/wordprocessingDrawing" xmlns:w10="urn:schemas-microsoft-com:office:word" xmlns:w="http://schemas.openxmlformats.org/wordprocessingml/2006/main" xmlns:w14="http://schemas.microsoft.com/office/word/2010/wordml" xmlns:w15="http://schemas.microsoft.com/office/word/2012/wordml" xmlns:w16cex="http://schemas.microsoft.com/office/word/2018/wordml/cex" xmlns:w16cid="http://schemas.microsoft.com/office/word/2016/wordml/cid" xmlns:w16="http://schemas.microsoft.com/office/word/2018/wordml" xmlns:w16du="http://schemas.microsoft.com/office/word/2023/wordml/word16du" xmlns:w16sdtdh="http://schemas.microsoft.com/office/word/2020/wordml/sdtdatahash" xmlns:w16sdtfl="http://schemas.microsoft.com/office/word/2024/wordml/sdtformatlock" xmlns:w16se="http://schemas.microsoft.com/office/word/2015/wordml/symex" xmlns:wpg="http://schemas.microsoft.com/office/word/2010/wordprocessingGroup" xmlns:wpi="http://schemas.microsoft.com/office/word/2010/wordprocessingInk" xmlns:wne="http://schemas.microsoft.com/office/word/2006/wordml" xmlns:wps="http://schemas.microsoft.com/office/word/2010/wordprocessingShape" mc:Ignorable="w14 w15 w16se w16cid w16 w16cex w16sdtdh w16sdtfl w16du wp14">
   <w:p>
     <w:pPr>
       <w:pStyle w:val="Footer"/>
@@ -4720,14 +5493,13 @@
     <w:r>
       <w:t>0</w:t>
     </w:r>
+    <w:proofErr w:type="gramStart"/>
     <w:r>
-      <w:t xml:space="preserve">   (Template Version 1.</w:t>
+      <w:t xml:space="preserve">   (</w:t>
     </w:r>
+    <w:proofErr w:type="gramEnd"/>
     <w:r>
-      <w:t>1</w:t>
-    </w:r>
-    <w:r>
-      <w:t>)</w:t>
+      <w:t>Template Version 1.1)</w:t>
     </w:r>
     <w:r>
       <w:tab/>
@@ -4746,7 +5518,7 @@
       <w:rPr>
         <w:noProof/>
       </w:rPr>
-      <w:t>9 February 2022</w:t>
+      <w:t>13 March 2024</w:t>
     </w:r>
     <w:r>
       <w:fldChar w:fldCharType="end"/>
@@ -4789,7 +5561,7 @@
 </file>
 
 <file path=word/footnotes.xml><?xml version="1.0" encoding="utf-8"?>
-<w:footnotes xmlns:wpc="http://schemas.microsoft.com/office/word/2010/wordprocessingCanvas" xmlns:cx="http://schemas.microsoft.com/office/drawing/2014/chartex" xmlns:cx1="http://schemas.microsoft.com/office/drawing/2015/9/8/chartex" xmlns:cx2="http://schemas.microsoft.com/office/drawing/2015/10/21/chartex" xmlns:cx3="http://schemas.microsoft.com/office/drawing/2016/5/9/chartex" xmlns:cx4="http://schemas.microsoft.com/office/drawing/2016/5/10/chartex" xmlns:cx5="http://schemas.microsoft.com/office/drawing/2016/5/11/chartex" xmlns:cx6="http://schemas.microsoft.com/office/drawing/2016/5/12/chartex" xmlns:cx7="http://schemas.microsoft.com/office/drawing/2016/5/13/chartex" xmlns:cx8="http://schemas.microsoft.com/office/drawing/2016/5/14/chartex" xmlns:mc="http://schemas.openxmlformats.org/markup-compatibility/2006" xmlns:aink="http://schemas.microsoft.com/office/drawing/2016/ink" xmlns:am3d="http://schemas.microsoft.com/office/drawing/2017/model3d" xmlns:o="urn:schemas-microsoft-com:office:office" xmlns:oel="http://schemas.microsoft.com/office/2019/extlst" xmlns:r="http://schemas.openxmlformats.org/officeDocument/2006/relationships" xmlns:m="http://schemas.openxmlformats.org/officeDocument/2006/math" xmlns:v="urn:schemas-microsoft-com:vml" xmlns:wp14="http://schemas.microsoft.com/office/word/2010/wordprocessingDrawing" xmlns:wp="http://schemas.openxmlformats.org/drawingml/2006/wordprocessingDrawing" xmlns:w10="urn:schemas-microsoft-com:office:word" xmlns:w="http://schemas.openxmlformats.org/wordprocessingml/2006/main" xmlns:w14="http://schemas.microsoft.com/office/word/2010/wordml" xmlns:w15="http://schemas.microsoft.com/office/word/2012/wordml" xmlns:w16cex="http://schemas.microsoft.com/office/word/2018/wordml/cex" xmlns:w16cid="http://schemas.microsoft.com/office/word/2016/wordml/cid" xmlns:w16="http://schemas.microsoft.com/office/word/2018/wordml" xmlns:w16sdtdh="http://schemas.microsoft.com/office/word/2020/wordml/sdtdatahash" xmlns:w16se="http://schemas.microsoft.com/office/word/2015/wordml/symex" xmlns:wpg="http://schemas.microsoft.com/office/word/2010/wordprocessingGroup" xmlns:wpi="http://schemas.microsoft.com/office/word/2010/wordprocessingInk" xmlns:wne="http://schemas.microsoft.com/office/word/2006/wordml" xmlns:wps="http://schemas.microsoft.com/office/word/2010/wordprocessingShape" mc:Ignorable="w14 w15 w16se w16cid w16 w16cex w16sdtdh wp14">
+<w:footnotes xmlns:wpc="http://schemas.microsoft.com/office/word/2010/wordprocessingCanvas" xmlns:cx="http://schemas.microsoft.com/office/drawing/2014/chartex" xmlns:cx1="http://schemas.microsoft.com/office/drawing/2015/9/8/chartex" xmlns:cx2="http://schemas.microsoft.com/office/drawing/2015/10/21/chartex" xmlns:cx3="http://schemas.microsoft.com/office/drawing/2016/5/9/chartex" xmlns:cx4="http://schemas.microsoft.com/office/drawing/2016/5/10/chartex" xmlns:cx5="http://schemas.microsoft.com/office/drawing/2016/5/11/chartex" xmlns:cx6="http://schemas.microsoft.com/office/drawing/2016/5/12/chartex" xmlns:cx7="http://schemas.microsoft.com/office/drawing/2016/5/13/chartex" xmlns:cx8="http://schemas.microsoft.com/office/drawing/2016/5/14/chartex" xmlns:mc="http://schemas.openxmlformats.org/markup-compatibility/2006" xmlns:aink="http://schemas.microsoft.com/office/drawing/2016/ink" xmlns:am3d="http://schemas.microsoft.com/office/drawing/2017/model3d" xmlns:o="urn:schemas-microsoft-com:office:office" xmlns:oel="http://schemas.microsoft.com/office/2019/extlst" xmlns:r="http://schemas.openxmlformats.org/officeDocument/2006/relationships" xmlns:m="http://schemas.openxmlformats.org/officeDocument/2006/math" xmlns:v="urn:schemas-microsoft-com:vml" xmlns:wp14="http://schemas.microsoft.com/office/word/2010/wordprocessingDrawing" xmlns:wp="http://schemas.openxmlformats.org/drawingml/2006/wordprocessingDrawing" xmlns:w10="urn:schemas-microsoft-com:office:word" xmlns:w="http://schemas.openxmlformats.org/wordprocessingml/2006/main" xmlns:w14="http://schemas.microsoft.com/office/word/2010/wordml" xmlns:w15="http://schemas.microsoft.com/office/word/2012/wordml" xmlns:w16cex="http://schemas.microsoft.com/office/word/2018/wordml/cex" xmlns:w16cid="http://schemas.microsoft.com/office/word/2016/wordml/cid" xmlns:w16="http://schemas.microsoft.com/office/word/2018/wordml" xmlns:w16du="http://schemas.microsoft.com/office/word/2023/wordml/word16du" xmlns:w16sdtdh="http://schemas.microsoft.com/office/word/2020/wordml/sdtdatahash" xmlns:w16sdtfl="http://schemas.microsoft.com/office/word/2024/wordml/sdtformatlock" xmlns:w16se="http://schemas.microsoft.com/office/word/2015/wordml/symex" xmlns:wpg="http://schemas.microsoft.com/office/word/2010/wordprocessingGroup" xmlns:wpi="http://schemas.microsoft.com/office/word/2010/wordprocessingInk" xmlns:wne="http://schemas.microsoft.com/office/word/2006/wordml" xmlns:wps="http://schemas.microsoft.com/office/word/2010/wordprocessingShape" mc:Ignorable="w14 w15 w16se w16cid w16 w16cex w16sdtdh w16sdtfl w16du wp14">
   <w:footnote w:type="separator" w:id="-1">
     <w:p>
       <w:r>
@@ -4808,7 +5580,7 @@
 </file>
 
 <file path=word/header1.xml><?xml version="1.0" encoding="utf-8"?>
-<w:hdr xmlns:wpc="http://schemas.microsoft.com/office/word/2010/wordprocessingCanvas" xmlns:cx="http://schemas.microsoft.com/office/drawing/2014/chartex" xmlns:cx1="http://schemas.microsoft.com/office/drawing/2015/9/8/chartex" xmlns:cx2="http://schemas.microsoft.com/office/drawing/2015/10/21/chartex" xmlns:cx3="http://schemas.microsoft.com/office/drawing/2016/5/9/chartex" xmlns:cx4="http://schemas.microsoft.com/office/drawing/2016/5/10/chartex" xmlns:cx5="http://schemas.microsoft.com/office/drawing/2016/5/11/chartex" xmlns:cx6="http://schemas.microsoft.com/office/drawing/2016/5/12/chartex" xmlns:cx7="http://schemas.microsoft.com/office/drawing/2016/5/13/chartex" xmlns:cx8="http://schemas.microsoft.com/office/drawing/2016/5/14/chartex" xmlns:mc="http://schemas.openxmlformats.org/markup-compatibility/2006" xmlns:aink="http://schemas.microsoft.com/office/drawing/2016/ink" xmlns:am3d="http://schemas.microsoft.com/office/drawing/2017/model3d" xmlns:o="urn:schemas-microsoft-com:office:office" xmlns:oel="http://schemas.microsoft.com/office/2019/extlst" xmlns:r="http://schemas.openxmlformats.org/officeDocument/2006/relationships" xmlns:m="http://schemas.openxmlformats.org/officeDocument/2006/math" xmlns:v="urn:schemas-microsoft-com:vml" xmlns:wp14="http://schemas.microsoft.com/office/word/2010/wordprocessingDrawing" xmlns:wp="http://schemas.openxmlformats.org/drawingml/2006/wordprocessingDrawing" xmlns:w10="urn:schemas-microsoft-com:office:word" xmlns:w="http://schemas.openxmlformats.org/wordprocessingml/2006/main" xmlns:w14="http://schemas.microsoft.com/office/word/2010/wordml" xmlns:w15="http://schemas.microsoft.com/office/word/2012/wordml" xmlns:w16cex="http://schemas.microsoft.com/office/word/2018/wordml/cex" xmlns:w16cid="http://schemas.microsoft.com/office/word/2016/wordml/cid" xmlns:w16="http://schemas.microsoft.com/office/word/2018/wordml" xmlns:w16sdtdh="http://schemas.microsoft.com/office/word/2020/wordml/sdtdatahash" xmlns:w16se="http://schemas.microsoft.com/office/word/2015/wordml/symex" xmlns:wpg="http://schemas.microsoft.com/office/word/2010/wordprocessingGroup" xmlns:wpi="http://schemas.microsoft.com/office/word/2010/wordprocessingInk" xmlns:wne="http://schemas.microsoft.com/office/word/2006/wordml" xmlns:wps="http://schemas.microsoft.com/office/word/2010/wordprocessingShape" mc:Ignorable="w14 w15 w16se w16cid w16 w16cex w16sdtdh wp14">
+<w:hdr xmlns:wpc="http://schemas.microsoft.com/office/word/2010/wordprocessingCanvas" xmlns:cx="http://schemas.microsoft.com/office/drawing/2014/chartex" xmlns:cx1="http://schemas.microsoft.com/office/drawing/2015/9/8/chartex" xmlns:cx2="http://schemas.microsoft.com/office/drawing/2015/10/21/chartex" xmlns:cx3="http://schemas.microsoft.com/office/drawing/2016/5/9/chartex" xmlns:cx4="http://schemas.microsoft.com/office/drawing/2016/5/10/chartex" xmlns:cx5="http://schemas.microsoft.com/office/drawing/2016/5/11/chartex" xmlns:cx6="http://schemas.microsoft.com/office/drawing/2016/5/12/chartex" xmlns:cx7="http://schemas.microsoft.com/office/drawing/2016/5/13/chartex" xmlns:cx8="http://schemas.microsoft.com/office/drawing/2016/5/14/chartex" xmlns:mc="http://schemas.openxmlformats.org/markup-compatibility/2006" xmlns:aink="http://schemas.microsoft.com/office/drawing/2016/ink" xmlns:am3d="http://schemas.microsoft.com/office/drawing/2017/model3d" xmlns:o="urn:schemas-microsoft-com:office:office" xmlns:oel="http://schemas.microsoft.com/office/2019/extlst" xmlns:r="http://schemas.openxmlformats.org/officeDocument/2006/relationships" xmlns:m="http://schemas.openxmlformats.org/officeDocument/2006/math" xmlns:v="urn:schemas-microsoft-com:vml" xmlns:wp14="http://schemas.microsoft.com/office/word/2010/wordprocessingDrawing" xmlns:wp="http://schemas.openxmlformats.org/drawingml/2006/wordprocessingDrawing" xmlns:w10="urn:schemas-microsoft-com:office:word" xmlns:w="http://schemas.openxmlformats.org/wordprocessingml/2006/main" xmlns:w14="http://schemas.microsoft.com/office/word/2010/wordml" xmlns:w15="http://schemas.microsoft.com/office/word/2012/wordml" xmlns:w16cex="http://schemas.microsoft.com/office/word/2018/wordml/cex" xmlns:w16cid="http://schemas.microsoft.com/office/word/2016/wordml/cid" xmlns:w16="http://schemas.microsoft.com/office/word/2018/wordml" xmlns:w16du="http://schemas.microsoft.com/office/word/2023/wordml/word16du" xmlns:w16sdtdh="http://schemas.microsoft.com/office/word/2020/wordml/sdtdatahash" xmlns:w16sdtfl="http://schemas.microsoft.com/office/word/2024/wordml/sdtformatlock" xmlns:w16se="http://schemas.microsoft.com/office/word/2015/wordml/symex" xmlns:wpg="http://schemas.microsoft.com/office/word/2010/wordprocessingGroup" xmlns:wpi="http://schemas.microsoft.com/office/word/2010/wordprocessingInk" xmlns:wne="http://schemas.microsoft.com/office/word/2006/wordml" xmlns:wps="http://schemas.microsoft.com/office/word/2010/wordprocessingShape" mc:Ignorable="w14 w15 w16se w16cid w16 w16cex w16sdtdh w16sdtfl w16du wp14">
   <w:p>
     <w:pPr>
       <w:pStyle w:val="Header"/>
@@ -4900,7 +5672,6 @@
               <v:path gradientshapeok="t" o:connecttype="rect"/>
             </v:shapetype>
             <v:shape id="Text Box 2" o:spid="_x0000_s1026" type="#_x0000_t202" alt="OFFICIAL" style="position:absolute;margin-left:0;margin-top:0;width:34.95pt;height:34.95pt;z-index:251658752;visibility:visible;mso-wrap-style:none;mso-wrap-distance-left:0;mso-wrap-distance-top:0;mso-wrap-distance-right:0;mso-wrap-distance-bottom:0;mso-position-horizontal:center;mso-position-horizontal-relative:page;mso-position-vertical:top;mso-position-vertical-relative:page;v-text-anchor:top" o:gfxdata="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" filled="f" stroked="f">
-              <v:fill o:detectmouseclick="t"/>
               <v:textbox style="mso-fit-shape-to-text:t" inset="0,15pt,0,0">
                 <w:txbxContent>
                   <w:p>
@@ -4937,7 +5708,7 @@
 </file>
 
 <file path=word/header2.xml><?xml version="1.0" encoding="utf-8"?>
-<w:hdr xmlns:wpc="http://schemas.microsoft.com/office/word/2010/wordprocessingCanvas" xmlns:cx="http://schemas.microsoft.com/office/drawing/2014/chartex" xmlns:cx1="http://schemas.microsoft.com/office/drawing/2015/9/8/chartex" xmlns:cx2="http://schemas.microsoft.com/office/drawing/2015/10/21/chartex" xmlns:cx3="http://schemas.microsoft.com/office/drawing/2016/5/9/chartex" xmlns:cx4="http://schemas.microsoft.com/office/drawing/2016/5/10/chartex" xmlns:cx5="http://schemas.microsoft.com/office/drawing/2016/5/11/chartex" xmlns:cx6="http://schemas.microsoft.com/office/drawing/2016/5/12/chartex" xmlns:cx7="http://schemas.microsoft.com/office/drawing/2016/5/13/chartex" xmlns:cx8="http://schemas.microsoft.com/office/drawing/2016/5/14/chartex" xmlns:mc="http://schemas.openxmlformats.org/markup-compatibility/2006" xmlns:aink="http://schemas.microsoft.com/office/drawing/2016/ink" xmlns:am3d="http://schemas.microsoft.com/office/drawing/2017/model3d" xmlns:o="urn:schemas-microsoft-com:office:office" xmlns:oel="http://schemas.microsoft.com/office/2019/extlst" xmlns:r="http://schemas.openxmlformats.org/officeDocument/2006/relationships" xmlns:m="http://schemas.openxmlformats.org/officeDocument/2006/math" xmlns:v="urn:schemas-microsoft-com:vml" xmlns:wp14="http://schemas.microsoft.com/office/word/2010/wordprocessingDrawing" xmlns:wp="http://schemas.openxmlformats.org/drawingml/2006/wordprocessingDrawing" xmlns:w10="urn:schemas-microsoft-com:office:word" xmlns:w="http://schemas.openxmlformats.org/wordprocessingml/2006/main" xmlns:w14="http://schemas.microsoft.com/office/word/2010/wordml" xmlns:w15="http://schemas.microsoft.com/office/word/2012/wordml" xmlns:w16cex="http://schemas.microsoft.com/office/word/2018/wordml/cex" xmlns:w16cid="http://schemas.microsoft.com/office/word/2016/wordml/cid" xmlns:w16="http://schemas.microsoft.com/office/word/2018/wordml" xmlns:w16sdtdh="http://schemas.microsoft.com/office/word/2020/wordml/sdtdatahash" xmlns:w16se="http://schemas.microsoft.com/office/word/2015/wordml/symex" xmlns:wpg="http://schemas.microsoft.com/office/word/2010/wordprocessingGroup" xmlns:wpi="http://schemas.microsoft.com/office/word/2010/wordprocessingInk" xmlns:wne="http://schemas.microsoft.com/office/word/2006/wordml" xmlns:wps="http://schemas.microsoft.com/office/word/2010/wordprocessingShape" mc:Ignorable="w14 w15 w16se w16cid w16 w16cex w16sdtdh wp14">
+<w:hdr xmlns:wpc="http://schemas.microsoft.com/office/word/2010/wordprocessingCanvas" xmlns:cx="http://schemas.microsoft.com/office/drawing/2014/chartex" xmlns:cx1="http://schemas.microsoft.com/office/drawing/2015/9/8/chartex" xmlns:cx2="http://schemas.microsoft.com/office/drawing/2015/10/21/chartex" xmlns:cx3="http://schemas.microsoft.com/office/drawing/2016/5/9/chartex" xmlns:cx4="http://schemas.microsoft.com/office/drawing/2016/5/10/chartex" xmlns:cx5="http://schemas.microsoft.com/office/drawing/2016/5/11/chartex" xmlns:cx6="http://schemas.microsoft.com/office/drawing/2016/5/12/chartex" xmlns:cx7="http://schemas.microsoft.com/office/drawing/2016/5/13/chartex" xmlns:cx8="http://schemas.microsoft.com/office/drawing/2016/5/14/chartex" xmlns:mc="http://schemas.openxmlformats.org/markup-compatibility/2006" xmlns:aink="http://schemas.microsoft.com/office/drawing/2016/ink" xmlns:am3d="http://schemas.microsoft.com/office/drawing/2017/model3d" xmlns:o="urn:schemas-microsoft-com:office:office" xmlns:oel="http://schemas.microsoft.com/office/2019/extlst" xmlns:r="http://schemas.openxmlformats.org/officeDocument/2006/relationships" xmlns:m="http://schemas.openxmlformats.org/officeDocument/2006/math" xmlns:v="urn:schemas-microsoft-com:vml" xmlns:wp14="http://schemas.microsoft.com/office/word/2010/wordprocessingDrawing" xmlns:wp="http://schemas.openxmlformats.org/drawingml/2006/wordprocessingDrawing" xmlns:w10="urn:schemas-microsoft-com:office:word" xmlns:w="http://schemas.openxmlformats.org/wordprocessingml/2006/main" xmlns:w14="http://schemas.microsoft.com/office/word/2010/wordml" xmlns:w15="http://schemas.microsoft.com/office/word/2012/wordml" xmlns:w16cex="http://schemas.microsoft.com/office/word/2018/wordml/cex" xmlns:w16cid="http://schemas.microsoft.com/office/word/2016/wordml/cid" xmlns:w16="http://schemas.microsoft.com/office/word/2018/wordml" xmlns:w16du="http://schemas.microsoft.com/office/word/2023/wordml/word16du" xmlns:w16sdtdh="http://schemas.microsoft.com/office/word/2020/wordml/sdtdatahash" xmlns:w16sdtfl="http://schemas.microsoft.com/office/word/2024/wordml/sdtformatlock" xmlns:w16se="http://schemas.microsoft.com/office/word/2015/wordml/symex" xmlns:wpg="http://schemas.microsoft.com/office/word/2010/wordprocessingGroup" xmlns:wpi="http://schemas.microsoft.com/office/word/2010/wordprocessingInk" xmlns:wne="http://schemas.microsoft.com/office/word/2006/wordml" xmlns:wps="http://schemas.microsoft.com/office/word/2010/wordprocessingShape" mc:Ignorable="w14 w15 w16se w16cid w16 w16cex w16sdtdh w16sdtfl w16du wp14">
   <w:p>
     <w:pPr>
       <w:pStyle w:val="Header"/>
@@ -5029,7 +5800,6 @@
               <v:path gradientshapeok="t" o:connecttype="rect"/>
             </v:shapetype>
             <v:shape id="Text Box 3" o:spid="_x0000_s1027" type="#_x0000_t202" alt="OFFICIAL" style="position:absolute;margin-left:0;margin-top:0;width:34.95pt;height:34.95pt;z-index:251661824;visibility:visible;mso-wrap-style:none;mso-wrap-distance-left:0;mso-wrap-distance-top:0;mso-wrap-distance-right:0;mso-wrap-distance-bottom:0;mso-position-horizontal:center;mso-position-horizontal-relative:page;mso-position-vertical:top;mso-position-vertical-relative:page;v-text-anchor:top" o:gfxdata="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" filled="f" stroked="f">
-              <v:fill o:detectmouseclick="t"/>
               <v:textbox style="mso-fit-shape-to-text:t" inset="0,15pt,0,0">
                 <w:txbxContent>
                   <w:p>
@@ -5066,7 +5836,7 @@
 </file>
 
 <file path=word/header3.xml><?xml version="1.0" encoding="utf-8"?>
-<w:hdr xmlns:wpc="http://schemas.microsoft.com/office/word/2010/wordprocessingCanvas" xmlns:cx="http://schemas.microsoft.com/office/drawing/2014/chartex" xmlns:cx1="http://schemas.microsoft.com/office/drawing/2015/9/8/chartex" xmlns:cx2="http://schemas.microsoft.com/office/drawing/2015/10/21/chartex" xmlns:cx3="http://schemas.microsoft.com/office/drawing/2016/5/9/chartex" xmlns:cx4="http://schemas.microsoft.com/office/drawing/2016/5/10/chartex" xmlns:cx5="http://schemas.microsoft.com/office/drawing/2016/5/11/chartex" xmlns:cx6="http://schemas.microsoft.com/office/drawing/2016/5/12/chartex" xmlns:cx7="http://schemas.microsoft.com/office/drawing/2016/5/13/chartex" xmlns:cx8="http://schemas.microsoft.com/office/drawing/2016/5/14/chartex" xmlns:mc="http://schemas.openxmlformats.org/markup-compatibility/2006" xmlns:aink="http://schemas.microsoft.com/office/drawing/2016/ink" xmlns:am3d="http://schemas.microsoft.com/office/drawing/2017/model3d" xmlns:o="urn:schemas-microsoft-com:office:office" xmlns:oel="http://schemas.microsoft.com/office/2019/extlst" xmlns:r="http://schemas.openxmlformats.org/officeDocument/2006/relationships" xmlns:m="http://schemas.openxmlformats.org/officeDocument/2006/math" xmlns:v="urn:schemas-microsoft-com:vml" xmlns:wp14="http://schemas.microsoft.com/office/word/2010/wordprocessingDrawing" xmlns:wp="http://schemas.openxmlformats.org/drawingml/2006/wordprocessingDrawing" xmlns:w10="urn:schemas-microsoft-com:office:word" xmlns:w="http://schemas.openxmlformats.org/wordprocessingml/2006/main" xmlns:w14="http://schemas.microsoft.com/office/word/2010/wordml" xmlns:w15="http://schemas.microsoft.com/office/word/2012/wordml" xmlns:w16cex="http://schemas.microsoft.com/office/word/2018/wordml/cex" xmlns:w16cid="http://schemas.microsoft.com/office/word/2016/wordml/cid" xmlns:w16="http://schemas.microsoft.com/office/word/2018/wordml" xmlns:w16sdtdh="http://schemas.microsoft.com/office/word/2020/wordml/sdtdatahash" xmlns:w16se="http://schemas.microsoft.com/office/word/2015/wordml/symex" xmlns:wpg="http://schemas.microsoft.com/office/word/2010/wordprocessingGroup" xmlns:wpi="http://schemas.microsoft.com/office/word/2010/wordprocessingInk" xmlns:wne="http://schemas.microsoft.com/office/word/2006/wordml" xmlns:wps="http://schemas.microsoft.com/office/word/2010/wordprocessingShape" mc:Ignorable="w14 w15 w16se w16cid w16 w16cex w16sdtdh wp14">
+<w:hdr xmlns:wpc="http://schemas.microsoft.com/office/word/2010/wordprocessingCanvas" xmlns:cx="http://schemas.microsoft.com/office/drawing/2014/chartex" xmlns:cx1="http://schemas.microsoft.com/office/drawing/2015/9/8/chartex" xmlns:cx2="http://schemas.microsoft.com/office/drawing/2015/10/21/chartex" xmlns:cx3="http://schemas.microsoft.com/office/drawing/2016/5/9/chartex" xmlns:cx4="http://schemas.microsoft.com/office/drawing/2016/5/10/chartex" xmlns:cx5="http://schemas.microsoft.com/office/drawing/2016/5/11/chartex" xmlns:cx6="http://schemas.microsoft.com/office/drawing/2016/5/12/chartex" xmlns:cx7="http://schemas.microsoft.com/office/drawing/2016/5/13/chartex" xmlns:cx8="http://schemas.microsoft.com/office/drawing/2016/5/14/chartex" xmlns:mc="http://schemas.openxmlformats.org/markup-compatibility/2006" xmlns:aink="http://schemas.microsoft.com/office/drawing/2016/ink" xmlns:am3d="http://schemas.microsoft.com/office/drawing/2017/model3d" xmlns:o="urn:schemas-microsoft-com:office:office" xmlns:oel="http://schemas.microsoft.com/office/2019/extlst" xmlns:r="http://schemas.openxmlformats.org/officeDocument/2006/relationships" xmlns:m="http://schemas.openxmlformats.org/officeDocument/2006/math" xmlns:v="urn:schemas-microsoft-com:vml" xmlns:wp14="http://schemas.microsoft.com/office/word/2010/wordprocessingDrawing" xmlns:wp="http://schemas.openxmlformats.org/drawingml/2006/wordprocessingDrawing" xmlns:w10="urn:schemas-microsoft-com:office:word" xmlns:w="http://schemas.openxmlformats.org/wordprocessingml/2006/main" xmlns:w14="http://schemas.microsoft.com/office/word/2010/wordml" xmlns:w15="http://schemas.microsoft.com/office/word/2012/wordml" xmlns:w16cex="http://schemas.microsoft.com/office/word/2018/wordml/cex" xmlns:w16cid="http://schemas.microsoft.com/office/word/2016/wordml/cid" xmlns:w16="http://schemas.microsoft.com/office/word/2018/wordml" xmlns:w16du="http://schemas.microsoft.com/office/word/2023/wordml/word16du" xmlns:w16sdtdh="http://schemas.microsoft.com/office/word/2020/wordml/sdtdatahash" xmlns:w16sdtfl="http://schemas.microsoft.com/office/word/2024/wordml/sdtformatlock" xmlns:w16se="http://schemas.microsoft.com/office/word/2015/wordml/symex" xmlns:wpg="http://schemas.microsoft.com/office/word/2010/wordprocessingGroup" xmlns:wpi="http://schemas.microsoft.com/office/word/2010/wordprocessingInk" xmlns:wne="http://schemas.microsoft.com/office/word/2006/wordml" xmlns:wps="http://schemas.microsoft.com/office/word/2010/wordprocessingShape" mc:Ignorable="w14 w15 w16se w16cid w16 w16cex w16sdtdh w16sdtfl w16du wp14">
   <w:p>
     <w:pPr>
       <w:pStyle w:val="Header"/>
@@ -5158,7 +5928,6 @@
               <v:path gradientshapeok="t" o:connecttype="rect"/>
             </v:shapetype>
             <v:shape id="Text Box 1" o:spid="_x0000_s1028" type="#_x0000_t202" alt="OFFICIAL" style="position:absolute;margin-left:0;margin-top:0;width:34.95pt;height:34.95pt;z-index:251655680;visibility:visible;mso-wrap-style:none;mso-wrap-distance-left:0;mso-wrap-distance-top:0;mso-wrap-distance-right:0;mso-wrap-distance-bottom:0;mso-position-horizontal:center;mso-position-horizontal-relative:page;mso-position-vertical:top;mso-position-vertical-relative:page;v-text-anchor:top" o:gfxdata="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" filled="f" stroked="f">
-              <v:fill o:detectmouseclick="t"/>
               <v:textbox style="mso-fit-shape-to-text:t" inset="0,15pt,0,0">
                 <w:txbxContent>
                   <w:p>
@@ -5195,7 +5964,7 @@
 </file>
 
 <file path=word/numbering.xml><?xml version="1.0" encoding="utf-8"?>
-<w:numbering xmlns:wpc="http://schemas.microsoft.com/office/word/2010/wordprocessingCanvas" xmlns:cx="http://schemas.microsoft.com/office/drawing/2014/chartex" xmlns:cx1="http://schemas.microsoft.com/office/drawing/2015/9/8/chartex" xmlns:cx2="http://schemas.microsoft.com/office/drawing/2015/10/21/chartex" xmlns:cx3="http://schemas.microsoft.com/office/drawing/2016/5/9/chartex" xmlns:cx4="http://schemas.microsoft.com/office/drawing/2016/5/10/chartex" xmlns:cx5="http://schemas.microsoft.com/office/drawing/2016/5/11/chartex" xmlns:cx6="http://schemas.microsoft.com/office/drawing/2016/5/12/chartex" xmlns:cx7="http://schemas.microsoft.com/office/drawing/2016/5/13/chartex" xmlns:cx8="http://schemas.microsoft.com/office/drawing/2016/5/14/chartex" xmlns:mc="http://schemas.openxmlformats.org/markup-compatibility/2006" xmlns:aink="http://schemas.microsoft.com/office/drawing/2016/ink" xmlns:am3d="http://schemas.microsoft.com/office/drawing/2017/model3d" xmlns:o="urn:schemas-microsoft-com:office:office" xmlns:oel="http://schemas.microsoft.com/office/2019/extlst" xmlns:r="http://schemas.openxmlformats.org/officeDocument/2006/relationships" xmlns:m="http://schemas.openxmlformats.org/officeDocument/2006/math" xmlns:v="urn:schemas-microsoft-com:vml" xmlns:wp14="http://schemas.microsoft.com/office/word/2010/wordprocessingDrawing" xmlns:wp="http://schemas.openxmlformats.org/drawingml/2006/wordprocessingDrawing" xmlns:w10="urn:schemas-microsoft-com:office:word" xmlns:w="http://schemas.openxmlformats.org/wordprocessingml/2006/main" xmlns:w14="http://schemas.microsoft.com/office/word/2010/wordml" xmlns:w15="http://schemas.microsoft.com/office/word/2012/wordml" xmlns:w16cex="http://schemas.microsoft.com/office/word/2018/wordml/cex" xmlns:w16cid="http://schemas.microsoft.com/office/word/2016/wordml/cid" xmlns:w16="http://schemas.microsoft.com/office/word/2018/wordml" xmlns:w16sdtdh="http://schemas.microsoft.com/office/word/2020/wordml/sdtdatahash" xmlns:w16se="http://schemas.microsoft.com/office/word/2015/wordml/symex" xmlns:wpg="http://schemas.microsoft.com/office/word/2010/wordprocessingGroup" xmlns:wpi="http://schemas.microsoft.com/office/word/2010/wordprocessingInk" xmlns:wne="http://schemas.microsoft.com/office/word/2006/wordml" xmlns:wps="http://schemas.microsoft.com/office/word/2010/wordprocessingShape" mc:Ignorable="w14 w15 w16se w16cid w16 w16cex w16sdtdh wp14">
+<w:numbering xmlns:wpc="http://schemas.microsoft.com/office/word/2010/wordprocessingCanvas" xmlns:cx="http://schemas.microsoft.com/office/drawing/2014/chartex" xmlns:cx1="http://schemas.microsoft.com/office/drawing/2015/9/8/chartex" xmlns:cx2="http://schemas.microsoft.com/office/drawing/2015/10/21/chartex" xmlns:cx3="http://schemas.microsoft.com/office/drawing/2016/5/9/chartex" xmlns:cx4="http://schemas.microsoft.com/office/drawing/2016/5/10/chartex" xmlns:cx5="http://schemas.microsoft.com/office/drawing/2016/5/11/chartex" xmlns:cx6="http://schemas.microsoft.com/office/drawing/2016/5/12/chartex" xmlns:cx7="http://schemas.microsoft.com/office/drawing/2016/5/13/chartex" xmlns:cx8="http://schemas.microsoft.com/office/drawing/2016/5/14/chartex" xmlns:mc="http://schemas.openxmlformats.org/markup-compatibility/2006" xmlns:aink="http://schemas.microsoft.com/office/drawing/2016/ink" xmlns:am3d="http://schemas.microsoft.com/office/drawing/2017/model3d" xmlns:o="urn:schemas-microsoft-com:office:office" xmlns:oel="http://schemas.microsoft.com/office/2019/extlst" xmlns:r="http://schemas.openxmlformats.org/officeDocument/2006/relationships" xmlns:m="http://schemas.openxmlformats.org/officeDocument/2006/math" xmlns:v="urn:schemas-microsoft-com:vml" xmlns:wp14="http://schemas.microsoft.com/office/word/2010/wordprocessingDrawing" xmlns:wp="http://schemas.openxmlformats.org/drawingml/2006/wordprocessingDrawing" xmlns:w10="urn:schemas-microsoft-com:office:word" xmlns:w="http://schemas.openxmlformats.org/wordprocessingml/2006/main" xmlns:w14="http://schemas.microsoft.com/office/word/2010/wordml" xmlns:w15="http://schemas.microsoft.com/office/word/2012/wordml" xmlns:w16cex="http://schemas.microsoft.com/office/word/2018/wordml/cex" xmlns:w16cid="http://schemas.microsoft.com/office/word/2016/wordml/cid" xmlns:w16="http://schemas.microsoft.com/office/word/2018/wordml" xmlns:w16du="http://schemas.microsoft.com/office/word/2023/wordml/word16du" xmlns:w16sdtdh="http://schemas.microsoft.com/office/word/2020/wordml/sdtdatahash" xmlns:w16sdtfl="http://schemas.microsoft.com/office/word/2024/wordml/sdtformatlock" xmlns:w16se="http://schemas.microsoft.com/office/word/2015/wordml/symex" xmlns:wpg="http://schemas.microsoft.com/office/word/2010/wordprocessingGroup" xmlns:wpi="http://schemas.microsoft.com/office/word/2010/wordprocessingInk" xmlns:wne="http://schemas.microsoft.com/office/word/2006/wordml" xmlns:wps="http://schemas.microsoft.com/office/word/2010/wordprocessingShape" mc:Ignorable="w14 w15 w16se w16cid w16 w16cex w16sdtdh w16sdtfl w16du wp14">
   <w:abstractNum w:abstractNumId="0" w15:restartNumberingAfterBreak="0">
     <w:nsid w:val="008C174E"/>
     <w:multiLevelType w:val="hybridMultilevel"/>
@@ -6384,6 +7153,155 @@
     </w:lvl>
   </w:abstractNum>
   <w:abstractNum w:abstractNumId="11" w15:restartNumberingAfterBreak="0">
+    <w:nsid w:val="1DA32318"/>
+    <w:multiLevelType w:val="multilevel"/>
+    <w:tmpl w:val="2C0E6F8C"/>
+    <w:lvl w:ilvl="0">
+      <w:start w:val="1"/>
+      <w:numFmt w:val="bullet"/>
+      <w:lvlText w:val=""/>
+      <w:lvlJc w:val="left"/>
+      <w:pPr>
+        <w:tabs>
+          <w:tab w:val="num" w:pos="720"/>
+        </w:tabs>
+        <w:ind w:left="720" w:hanging="360"/>
+      </w:pPr>
+      <w:rPr>
+        <w:rFonts w:ascii="Symbol" w:hAnsi="Symbol" w:hint="default"/>
+        <w:sz w:val="20"/>
+      </w:rPr>
+    </w:lvl>
+    <w:lvl w:ilvl="1" w:tentative="1">
+      <w:start w:val="1"/>
+      <w:numFmt w:val="bullet"/>
+      <w:lvlText w:val="o"/>
+      <w:lvlJc w:val="left"/>
+      <w:pPr>
+        <w:tabs>
+          <w:tab w:val="num" w:pos="1440"/>
+        </w:tabs>
+        <w:ind w:left="1440" w:hanging="360"/>
+      </w:pPr>
+      <w:rPr>
+        <w:rFonts w:ascii="Courier New" w:hAnsi="Courier New" w:hint="default"/>
+        <w:sz w:val="20"/>
+      </w:rPr>
+    </w:lvl>
+    <w:lvl w:ilvl="2" w:tentative="1">
+      <w:start w:val="1"/>
+      <w:numFmt w:val="bullet"/>
+      <w:lvlText w:val=""/>
+      <w:lvlJc w:val="left"/>
+      <w:pPr>
+        <w:tabs>
+          <w:tab w:val="num" w:pos="2160"/>
+        </w:tabs>
+        <w:ind w:left="2160" w:hanging="360"/>
+      </w:pPr>
+      <w:rPr>
+        <w:rFonts w:ascii="Wingdings" w:hAnsi="Wingdings" w:hint="default"/>
+        <w:sz w:val="20"/>
+      </w:rPr>
+    </w:lvl>
+    <w:lvl w:ilvl="3" w:tentative="1">
+      <w:start w:val="1"/>
+      <w:numFmt w:val="bullet"/>
+      <w:lvlText w:val=""/>
+      <w:lvlJc w:val="left"/>
+      <w:pPr>
+        <w:tabs>
+          <w:tab w:val="num" w:pos="2880"/>
+        </w:tabs>
+        <w:ind w:left="2880" w:hanging="360"/>
+      </w:pPr>
+      <w:rPr>
+        <w:rFonts w:ascii="Wingdings" w:hAnsi="Wingdings" w:hint="default"/>
+        <w:sz w:val="20"/>
+      </w:rPr>
+    </w:lvl>
+    <w:lvl w:ilvl="4" w:tentative="1">
+      <w:start w:val="1"/>
+      <w:numFmt w:val="bullet"/>
+      <w:lvlText w:val=""/>
+      <w:lvlJc w:val="left"/>
+      <w:pPr>
+        <w:tabs>
+          <w:tab w:val="num" w:pos="3600"/>
+        </w:tabs>
+        <w:ind w:left="3600" w:hanging="360"/>
+      </w:pPr>
+      <w:rPr>
+        <w:rFonts w:ascii="Wingdings" w:hAnsi="Wingdings" w:hint="default"/>
+        <w:sz w:val="20"/>
+      </w:rPr>
+    </w:lvl>
+    <w:lvl w:ilvl="5" w:tentative="1">
+      <w:start w:val="1"/>
+      <w:numFmt w:val="bullet"/>
+      <w:lvlText w:val=""/>
+      <w:lvlJc w:val="left"/>
+      <w:pPr>
+        <w:tabs>
+          <w:tab w:val="num" w:pos="4320"/>
+        </w:tabs>
+        <w:ind w:left="4320" w:hanging="360"/>
+      </w:pPr>
+      <w:rPr>
+        <w:rFonts w:ascii="Wingdings" w:hAnsi="Wingdings" w:hint="default"/>
+        <w:sz w:val="20"/>
+      </w:rPr>
+    </w:lvl>
+    <w:lvl w:ilvl="6" w:tentative="1">
+      <w:start w:val="1"/>
+      <w:numFmt w:val="bullet"/>
+      <w:lvlText w:val=""/>
+      <w:lvlJc w:val="left"/>
+      <w:pPr>
+        <w:tabs>
+          <w:tab w:val="num" w:pos="5040"/>
+        </w:tabs>
+        <w:ind w:left="5040" w:hanging="360"/>
+      </w:pPr>
+      <w:rPr>
+        <w:rFonts w:ascii="Wingdings" w:hAnsi="Wingdings" w:hint="default"/>
+        <w:sz w:val="20"/>
+      </w:rPr>
+    </w:lvl>
+    <w:lvl w:ilvl="7" w:tentative="1">
+      <w:start w:val="1"/>
+      <w:numFmt w:val="bullet"/>
+      <w:lvlText w:val=""/>
+      <w:lvlJc w:val="left"/>
+      <w:pPr>
+        <w:tabs>
+          <w:tab w:val="num" w:pos="5760"/>
+        </w:tabs>
+        <w:ind w:left="5760" w:hanging="360"/>
+      </w:pPr>
+      <w:rPr>
+        <w:rFonts w:ascii="Wingdings" w:hAnsi="Wingdings" w:hint="default"/>
+        <w:sz w:val="20"/>
+      </w:rPr>
+    </w:lvl>
+    <w:lvl w:ilvl="8" w:tentative="1">
+      <w:start w:val="1"/>
+      <w:numFmt w:val="bullet"/>
+      <w:lvlText w:val=""/>
+      <w:lvlJc w:val="left"/>
+      <w:pPr>
+        <w:tabs>
+          <w:tab w:val="num" w:pos="6480"/>
+        </w:tabs>
+        <w:ind w:left="6480" w:hanging="360"/>
+      </w:pPr>
+      <w:rPr>
+        <w:rFonts w:ascii="Wingdings" w:hAnsi="Wingdings" w:hint="default"/>
+        <w:sz w:val="20"/>
+      </w:rPr>
+    </w:lvl>
+  </w:abstractNum>
+  <w:abstractNum w:abstractNumId="12" w15:restartNumberingAfterBreak="0">
     <w:nsid w:val="1E6B334B"/>
     <w:multiLevelType w:val="hybridMultilevel"/>
     <w:tmpl w:val="E8025744"/>
@@ -6496,7 +7414,7 @@
       </w:rPr>
     </w:lvl>
   </w:abstractNum>
-  <w:abstractNum w:abstractNumId="12" w15:restartNumberingAfterBreak="0">
+  <w:abstractNum w:abstractNumId="13" w15:restartNumberingAfterBreak="0">
     <w:nsid w:val="202F6753"/>
     <w:multiLevelType w:val="hybridMultilevel"/>
     <w:tmpl w:val="F050CEE0"/>
@@ -6609,7 +7527,7 @@
       </w:rPr>
     </w:lvl>
   </w:abstractNum>
-  <w:abstractNum w:abstractNumId="13" w15:restartNumberingAfterBreak="0">
+  <w:abstractNum w:abstractNumId="14" w15:restartNumberingAfterBreak="0">
     <w:nsid w:val="20B44E7C"/>
     <w:multiLevelType w:val="hybridMultilevel"/>
     <w:tmpl w:val="38BC0494"/>
@@ -6721,7 +7639,7 @@
       </w:rPr>
     </w:lvl>
   </w:abstractNum>
-  <w:abstractNum w:abstractNumId="14" w15:restartNumberingAfterBreak="0">
+  <w:abstractNum w:abstractNumId="15" w15:restartNumberingAfterBreak="0">
     <w:nsid w:val="229A1AC4"/>
     <w:multiLevelType w:val="hybridMultilevel"/>
     <w:tmpl w:val="F21227CC"/>
@@ -6834,7 +7752,7 @@
       </w:rPr>
     </w:lvl>
   </w:abstractNum>
-  <w:abstractNum w:abstractNumId="15" w15:restartNumberingAfterBreak="0">
+  <w:abstractNum w:abstractNumId="16" w15:restartNumberingAfterBreak="0">
     <w:nsid w:val="275D6522"/>
     <w:multiLevelType w:val="hybridMultilevel"/>
     <w:tmpl w:val="2D78A73C"/>
@@ -6947,7 +7865,7 @@
       </w:rPr>
     </w:lvl>
   </w:abstractNum>
-  <w:abstractNum w:abstractNumId="16" w15:restartNumberingAfterBreak="0">
+  <w:abstractNum w:abstractNumId="17" w15:restartNumberingAfterBreak="0">
     <w:nsid w:val="321D31C6"/>
     <w:multiLevelType w:val="hybridMultilevel"/>
     <w:tmpl w:val="418AC4B4"/>
@@ -7060,7 +7978,7 @@
       </w:rPr>
     </w:lvl>
   </w:abstractNum>
-  <w:abstractNum w:abstractNumId="17" w15:restartNumberingAfterBreak="0">
+  <w:abstractNum w:abstractNumId="18" w15:restartNumberingAfterBreak="0">
     <w:nsid w:val="35497D83"/>
     <w:multiLevelType w:val="hybridMultilevel"/>
     <w:tmpl w:val="3498F96C"/>
@@ -7149,7 +8067,7 @@
       </w:pPr>
     </w:lvl>
   </w:abstractNum>
-  <w:abstractNum w:abstractNumId="18" w15:restartNumberingAfterBreak="0">
+  <w:abstractNum w:abstractNumId="19" w15:restartNumberingAfterBreak="0">
     <w:nsid w:val="41F525DD"/>
     <w:multiLevelType w:val="hybridMultilevel"/>
     <w:tmpl w:val="B44A08F2"/>
@@ -7262,7 +8180,7 @@
       </w:rPr>
     </w:lvl>
   </w:abstractNum>
-  <w:abstractNum w:abstractNumId="19" w15:restartNumberingAfterBreak="0">
+  <w:abstractNum w:abstractNumId="20" w15:restartNumberingAfterBreak="0">
     <w:nsid w:val="46515E85"/>
     <w:multiLevelType w:val="hybridMultilevel"/>
     <w:tmpl w:val="BB2C17CC"/>
@@ -7375,7 +8293,7 @@
       </w:rPr>
     </w:lvl>
   </w:abstractNum>
-  <w:abstractNum w:abstractNumId="20" w15:restartNumberingAfterBreak="0">
+  <w:abstractNum w:abstractNumId="21" w15:restartNumberingAfterBreak="0">
     <w:nsid w:val="486749C7"/>
     <w:multiLevelType w:val="hybridMultilevel"/>
     <w:tmpl w:val="35F6992A"/>
@@ -7488,7 +8406,7 @@
       </w:rPr>
     </w:lvl>
   </w:abstractNum>
-  <w:abstractNum w:abstractNumId="21" w15:restartNumberingAfterBreak="0">
+  <w:abstractNum w:abstractNumId="22" w15:restartNumberingAfterBreak="0">
     <w:nsid w:val="49AA54A6"/>
     <w:multiLevelType w:val="hybridMultilevel"/>
     <w:tmpl w:val="580895A2"/>
@@ -7601,7 +8519,7 @@
       </w:rPr>
     </w:lvl>
   </w:abstractNum>
-  <w:abstractNum w:abstractNumId="22" w15:restartNumberingAfterBreak="0">
+  <w:abstractNum w:abstractNumId="23" w15:restartNumberingAfterBreak="0">
     <w:nsid w:val="4BA07F28"/>
     <w:multiLevelType w:val="hybridMultilevel"/>
     <w:tmpl w:val="F2228652"/>
@@ -7714,7 +8632,7 @@
       </w:rPr>
     </w:lvl>
   </w:abstractNum>
-  <w:abstractNum w:abstractNumId="23" w15:restartNumberingAfterBreak="0">
+  <w:abstractNum w:abstractNumId="24" w15:restartNumberingAfterBreak="0">
     <w:nsid w:val="4C257798"/>
     <w:multiLevelType w:val="hybridMultilevel"/>
     <w:tmpl w:val="9F3E8064"/>
@@ -7800,7 +8718,7 @@
       </w:pPr>
     </w:lvl>
   </w:abstractNum>
-  <w:abstractNum w:abstractNumId="24" w15:restartNumberingAfterBreak="0">
+  <w:abstractNum w:abstractNumId="25" w15:restartNumberingAfterBreak="0">
     <w:nsid w:val="512656FD"/>
     <w:multiLevelType w:val="hybridMultilevel"/>
     <w:tmpl w:val="DD96831E"/>
@@ -7913,7 +8831,7 @@
       </w:rPr>
     </w:lvl>
   </w:abstractNum>
-  <w:abstractNum w:abstractNumId="25" w15:restartNumberingAfterBreak="0">
+  <w:abstractNum w:abstractNumId="26" w15:restartNumberingAfterBreak="0">
     <w:nsid w:val="5CB00F1E"/>
     <w:multiLevelType w:val="hybridMultilevel"/>
     <w:tmpl w:val="2DFA36BC"/>
@@ -8026,7 +8944,7 @@
       </w:rPr>
     </w:lvl>
   </w:abstractNum>
-  <w:abstractNum w:abstractNumId="26" w15:restartNumberingAfterBreak="0">
+  <w:abstractNum w:abstractNumId="27" w15:restartNumberingAfterBreak="0">
     <w:nsid w:val="61E96012"/>
     <w:multiLevelType w:val="hybridMultilevel"/>
     <w:tmpl w:val="C6D458D8"/>
@@ -8112,7 +9030,7 @@
       </w:pPr>
     </w:lvl>
   </w:abstractNum>
-  <w:abstractNum w:abstractNumId="27" w15:restartNumberingAfterBreak="0">
+  <w:abstractNum w:abstractNumId="28" w15:restartNumberingAfterBreak="0">
     <w:nsid w:val="65AB26A3"/>
     <w:multiLevelType w:val="hybridMultilevel"/>
     <w:tmpl w:val="C8AE668E"/>
@@ -8201,7 +9119,7 @@
       </w:pPr>
     </w:lvl>
   </w:abstractNum>
-  <w:abstractNum w:abstractNumId="28" w15:restartNumberingAfterBreak="0">
+  <w:abstractNum w:abstractNumId="29" w15:restartNumberingAfterBreak="0">
     <w:nsid w:val="6B6C590A"/>
     <w:multiLevelType w:val="hybridMultilevel"/>
     <w:tmpl w:val="5D04E4CA"/>
@@ -8314,7 +9232,7 @@
       </w:rPr>
     </w:lvl>
   </w:abstractNum>
-  <w:abstractNum w:abstractNumId="29" w15:restartNumberingAfterBreak="0">
+  <w:abstractNum w:abstractNumId="30" w15:restartNumberingAfterBreak="0">
     <w:nsid w:val="6BC66878"/>
     <w:multiLevelType w:val="hybridMultilevel"/>
     <w:tmpl w:val="46967A7C"/>
@@ -8427,7 +9345,7 @@
       </w:rPr>
     </w:lvl>
   </w:abstractNum>
-  <w:abstractNum w:abstractNumId="30" w15:restartNumberingAfterBreak="0">
+  <w:abstractNum w:abstractNumId="31" w15:restartNumberingAfterBreak="0">
     <w:nsid w:val="6EEA5BA9"/>
     <w:multiLevelType w:val="hybridMultilevel"/>
     <w:tmpl w:val="55E00B66"/>
@@ -8540,7 +9458,7 @@
       </w:rPr>
     </w:lvl>
   </w:abstractNum>
-  <w:abstractNum w:abstractNumId="31" w15:restartNumberingAfterBreak="0">
+  <w:abstractNum w:abstractNumId="32" w15:restartNumberingAfterBreak="0">
     <w:nsid w:val="702D3192"/>
     <w:multiLevelType w:val="hybridMultilevel"/>
     <w:tmpl w:val="F68609CA"/>
@@ -8626,7 +9544,7 @@
       </w:pPr>
     </w:lvl>
   </w:abstractNum>
-  <w:abstractNum w:abstractNumId="32" w15:restartNumberingAfterBreak="0">
+  <w:abstractNum w:abstractNumId="33" w15:restartNumberingAfterBreak="0">
     <w:nsid w:val="71A33B79"/>
     <w:multiLevelType w:val="hybridMultilevel"/>
     <w:tmpl w:val="A2BCA3B6"/>
@@ -8712,7 +9630,7 @@
       </w:pPr>
     </w:lvl>
   </w:abstractNum>
-  <w:abstractNum w:abstractNumId="33" w15:restartNumberingAfterBreak="0">
+  <w:abstractNum w:abstractNumId="34" w15:restartNumberingAfterBreak="0">
     <w:nsid w:val="71FA5176"/>
     <w:multiLevelType w:val="hybridMultilevel"/>
     <w:tmpl w:val="D96233CA"/>
@@ -8825,7 +9743,7 @@
       </w:rPr>
     </w:lvl>
   </w:abstractNum>
-  <w:abstractNum w:abstractNumId="34" w15:restartNumberingAfterBreak="0">
+  <w:abstractNum w:abstractNumId="35" w15:restartNumberingAfterBreak="0">
     <w:nsid w:val="7A206A9D"/>
     <w:multiLevelType w:val="hybridMultilevel"/>
     <w:tmpl w:val="E00A665E"/>
@@ -8938,7 +9856,7 @@
       </w:rPr>
     </w:lvl>
   </w:abstractNum>
-  <w:abstractNum w:abstractNumId="35" w15:restartNumberingAfterBreak="0">
+  <w:abstractNum w:abstractNumId="36" w15:restartNumberingAfterBreak="0">
     <w:nsid w:val="7BE544AE"/>
     <w:multiLevelType w:val="hybridMultilevel"/>
     <w:tmpl w:val="11C06D4C"/>
@@ -9051,7 +9969,156 @@
       </w:rPr>
     </w:lvl>
   </w:abstractNum>
-  <w:abstractNum w:abstractNumId="36" w15:restartNumberingAfterBreak="0">
+  <w:abstractNum w:abstractNumId="37" w15:restartNumberingAfterBreak="0">
+    <w:nsid w:val="7C7B43A3"/>
+    <w:multiLevelType w:val="multilevel"/>
+    <w:tmpl w:val="1E889CCC"/>
+    <w:lvl w:ilvl="0">
+      <w:start w:val="1"/>
+      <w:numFmt w:val="bullet"/>
+      <w:lvlText w:val=""/>
+      <w:lvlJc w:val="left"/>
+      <w:pPr>
+        <w:tabs>
+          <w:tab w:val="num" w:pos="360"/>
+        </w:tabs>
+        <w:ind w:left="360" w:hanging="360"/>
+      </w:pPr>
+      <w:rPr>
+        <w:rFonts w:ascii="Symbol" w:hAnsi="Symbol" w:hint="default"/>
+        <w:sz w:val="20"/>
+      </w:rPr>
+    </w:lvl>
+    <w:lvl w:ilvl="1">
+      <w:start w:val="1"/>
+      <w:numFmt w:val="bullet"/>
+      <w:lvlText w:val="o"/>
+      <w:lvlJc w:val="left"/>
+      <w:pPr>
+        <w:tabs>
+          <w:tab w:val="num" w:pos="1080"/>
+        </w:tabs>
+        <w:ind w:left="1080" w:hanging="360"/>
+      </w:pPr>
+      <w:rPr>
+        <w:rFonts w:ascii="Courier New" w:hAnsi="Courier New" w:hint="default"/>
+        <w:sz w:val="20"/>
+      </w:rPr>
+    </w:lvl>
+    <w:lvl w:ilvl="2" w:tentative="1">
+      <w:start w:val="1"/>
+      <w:numFmt w:val="bullet"/>
+      <w:lvlText w:val=""/>
+      <w:lvlJc w:val="left"/>
+      <w:pPr>
+        <w:tabs>
+          <w:tab w:val="num" w:pos="1800"/>
+        </w:tabs>
+        <w:ind w:left="1800" w:hanging="360"/>
+      </w:pPr>
+      <w:rPr>
+        <w:rFonts w:ascii="Wingdings" w:hAnsi="Wingdings" w:hint="default"/>
+        <w:sz w:val="20"/>
+      </w:rPr>
+    </w:lvl>
+    <w:lvl w:ilvl="3" w:tentative="1">
+      <w:start w:val="1"/>
+      <w:numFmt w:val="bullet"/>
+      <w:lvlText w:val=""/>
+      <w:lvlJc w:val="left"/>
+      <w:pPr>
+        <w:tabs>
+          <w:tab w:val="num" w:pos="2520"/>
+        </w:tabs>
+        <w:ind w:left="2520" w:hanging="360"/>
+      </w:pPr>
+      <w:rPr>
+        <w:rFonts w:ascii="Wingdings" w:hAnsi="Wingdings" w:hint="default"/>
+        <w:sz w:val="20"/>
+      </w:rPr>
+    </w:lvl>
+    <w:lvl w:ilvl="4" w:tentative="1">
+      <w:start w:val="1"/>
+      <w:numFmt w:val="bullet"/>
+      <w:lvlText w:val=""/>
+      <w:lvlJc w:val="left"/>
+      <w:pPr>
+        <w:tabs>
+          <w:tab w:val="num" w:pos="3240"/>
+        </w:tabs>
+        <w:ind w:left="3240" w:hanging="360"/>
+      </w:pPr>
+      <w:rPr>
+        <w:rFonts w:ascii="Wingdings" w:hAnsi="Wingdings" w:hint="default"/>
+        <w:sz w:val="20"/>
+      </w:rPr>
+    </w:lvl>
+    <w:lvl w:ilvl="5" w:tentative="1">
+      <w:start w:val="1"/>
+      <w:numFmt w:val="bullet"/>
+      <w:lvlText w:val=""/>
+      <w:lvlJc w:val="left"/>
+      <w:pPr>
+        <w:tabs>
+          <w:tab w:val="num" w:pos="3960"/>
+        </w:tabs>
+        <w:ind w:left="3960" w:hanging="360"/>
+      </w:pPr>
+      <w:rPr>
+        <w:rFonts w:ascii="Wingdings" w:hAnsi="Wingdings" w:hint="default"/>
+        <w:sz w:val="20"/>
+      </w:rPr>
+    </w:lvl>
+    <w:lvl w:ilvl="6" w:tentative="1">
+      <w:start w:val="1"/>
+      <w:numFmt w:val="bullet"/>
+      <w:lvlText w:val=""/>
+      <w:lvlJc w:val="left"/>
+      <w:pPr>
+        <w:tabs>
+          <w:tab w:val="num" w:pos="4680"/>
+        </w:tabs>
+        <w:ind w:left="4680" w:hanging="360"/>
+      </w:pPr>
+      <w:rPr>
+        <w:rFonts w:ascii="Wingdings" w:hAnsi="Wingdings" w:hint="default"/>
+        <w:sz w:val="20"/>
+      </w:rPr>
+    </w:lvl>
+    <w:lvl w:ilvl="7" w:tentative="1">
+      <w:start w:val="1"/>
+      <w:numFmt w:val="bullet"/>
+      <w:lvlText w:val=""/>
+      <w:lvlJc w:val="left"/>
+      <w:pPr>
+        <w:tabs>
+          <w:tab w:val="num" w:pos="5400"/>
+        </w:tabs>
+        <w:ind w:left="5400" w:hanging="360"/>
+      </w:pPr>
+      <w:rPr>
+        <w:rFonts w:ascii="Wingdings" w:hAnsi="Wingdings" w:hint="default"/>
+        <w:sz w:val="20"/>
+      </w:rPr>
+    </w:lvl>
+    <w:lvl w:ilvl="8" w:tentative="1">
+      <w:start w:val="1"/>
+      <w:numFmt w:val="bullet"/>
+      <w:lvlText w:val=""/>
+      <w:lvlJc w:val="left"/>
+      <w:pPr>
+        <w:tabs>
+          <w:tab w:val="num" w:pos="6120"/>
+        </w:tabs>
+        <w:ind w:left="6120" w:hanging="360"/>
+      </w:pPr>
+      <w:rPr>
+        <w:rFonts w:ascii="Wingdings" w:hAnsi="Wingdings" w:hint="default"/>
+        <w:sz w:val="20"/>
+      </w:rPr>
+    </w:lvl>
+  </w:abstractNum>
+  <w:abstractNum w:abstractNumId="38" w15:restartNumberingAfterBreak="0">
     <w:nsid w:val="7E560167"/>
     <w:multiLevelType w:val="hybridMultilevel"/>
     <w:tmpl w:val="F7422A3C"/>
@@ -9165,7 +10232,7 @@
     </w:lvl>
   </w:abstractNum>
   <w:num w:numId="1" w16cid:durableId="1326785105">
-    <w:abstractNumId w:val="12"/>
+    <w:abstractNumId w:val="13"/>
   </w:num>
   <w:num w:numId="2" w16cid:durableId="1496801457">
     <w:abstractNumId w:val="8"/>
@@ -9174,34 +10241,34 @@
     <w:abstractNumId w:val="3"/>
   </w:num>
   <w:num w:numId="4" w16cid:durableId="1227642604">
-    <w:abstractNumId w:val="29"/>
+    <w:abstractNumId w:val="30"/>
   </w:num>
   <w:num w:numId="5" w16cid:durableId="388115528">
     <w:abstractNumId w:val="0"/>
   </w:num>
   <w:num w:numId="6" w16cid:durableId="1511066747">
-    <w:abstractNumId w:val="26"/>
+    <w:abstractNumId w:val="27"/>
   </w:num>
   <w:num w:numId="7" w16cid:durableId="466167682">
+    <w:abstractNumId w:val="32"/>
+  </w:num>
+  <w:num w:numId="8" w16cid:durableId="1606882199">
+    <w:abstractNumId w:val="33"/>
+  </w:num>
+  <w:num w:numId="9" w16cid:durableId="187137277">
+    <w:abstractNumId w:val="18"/>
+  </w:num>
+  <w:num w:numId="10" w16cid:durableId="353306670">
+    <w:abstractNumId w:val="23"/>
+  </w:num>
+  <w:num w:numId="11" w16cid:durableId="1350062214">
+    <w:abstractNumId w:val="16"/>
+  </w:num>
+  <w:num w:numId="12" w16cid:durableId="2085911297">
     <w:abstractNumId w:val="31"/>
   </w:num>
-  <w:num w:numId="8" w16cid:durableId="1606882199">
-    <w:abstractNumId w:val="32"/>
-  </w:num>
-  <w:num w:numId="9" w16cid:durableId="187137277">
-    <w:abstractNumId w:val="17"/>
-  </w:num>
-  <w:num w:numId="10" w16cid:durableId="353306670">
-    <w:abstractNumId w:val="22"/>
-  </w:num>
-  <w:num w:numId="11" w16cid:durableId="1350062214">
-    <w:abstractNumId w:val="15"/>
-  </w:num>
-  <w:num w:numId="12" w16cid:durableId="2085911297">
-    <w:abstractNumId w:val="30"/>
-  </w:num>
   <w:num w:numId="13" w16cid:durableId="1265382752">
-    <w:abstractNumId w:val="13"/>
+    <w:abstractNumId w:val="14"/>
   </w:num>
   <w:num w:numId="14" w16cid:durableId="342363566">
     <w:abstractNumId w:val="10"/>
@@ -9210,61 +10277,61 @@
     <w:abstractNumId w:val="6"/>
   </w:num>
   <w:num w:numId="16" w16cid:durableId="1172069218">
-    <w:abstractNumId w:val="23"/>
+    <w:abstractNumId w:val="24"/>
   </w:num>
   <w:num w:numId="17" w16cid:durableId="1829056151">
-    <w:abstractNumId w:val="20"/>
+    <w:abstractNumId w:val="21"/>
   </w:num>
   <w:num w:numId="18" w16cid:durableId="1234392500">
     <w:abstractNumId w:val="9"/>
   </w:num>
   <w:num w:numId="19" w16cid:durableId="469253040">
-    <w:abstractNumId w:val="34"/>
+    <w:abstractNumId w:val="35"/>
   </w:num>
   <w:num w:numId="20" w16cid:durableId="1184588079">
-    <w:abstractNumId w:val="19"/>
+    <w:abstractNumId w:val="20"/>
   </w:num>
   <w:num w:numId="21" w16cid:durableId="535385113">
-    <w:abstractNumId w:val="16"/>
+    <w:abstractNumId w:val="17"/>
   </w:num>
   <w:num w:numId="22" w16cid:durableId="951665696">
-    <w:abstractNumId w:val="24"/>
+    <w:abstractNumId w:val="25"/>
   </w:num>
   <w:num w:numId="23" w16cid:durableId="1190340046">
     <w:abstractNumId w:val="5"/>
   </w:num>
   <w:num w:numId="24" w16cid:durableId="368265925">
-    <w:abstractNumId w:val="28"/>
+    <w:abstractNumId w:val="29"/>
   </w:num>
   <w:num w:numId="25" w16cid:durableId="231892850">
     <w:abstractNumId w:val="1"/>
   </w:num>
   <w:num w:numId="26" w16cid:durableId="988365323">
-    <w:abstractNumId w:val="14"/>
+    <w:abstractNumId w:val="15"/>
   </w:num>
   <w:num w:numId="27" w16cid:durableId="339501832">
     <w:abstractNumId w:val="2"/>
   </w:num>
   <w:num w:numId="28" w16cid:durableId="1548225071">
+    <w:abstractNumId w:val="38"/>
+  </w:num>
+  <w:num w:numId="29" w16cid:durableId="2125421467">
+    <w:abstractNumId w:val="34"/>
+  </w:num>
+  <w:num w:numId="30" w16cid:durableId="1064793516">
+    <w:abstractNumId w:val="12"/>
+  </w:num>
+  <w:num w:numId="31" w16cid:durableId="884563810">
     <w:abstractNumId w:val="36"/>
   </w:num>
-  <w:num w:numId="29" w16cid:durableId="2125421467">
-    <w:abstractNumId w:val="33"/>
-  </w:num>
-  <w:num w:numId="30" w16cid:durableId="1064793516">
-    <w:abstractNumId w:val="11"/>
-  </w:num>
-  <w:num w:numId="31" w16cid:durableId="884563810">
-    <w:abstractNumId w:val="35"/>
-  </w:num>
   <w:num w:numId="32" w16cid:durableId="2071078501">
-    <w:abstractNumId w:val="21"/>
+    <w:abstractNumId w:val="22"/>
   </w:num>
   <w:num w:numId="33" w16cid:durableId="1691909479">
-    <w:abstractNumId w:val="25"/>
+    <w:abstractNumId w:val="26"/>
   </w:num>
   <w:num w:numId="34" w16cid:durableId="213779519">
-    <w:abstractNumId w:val="27"/>
+    <w:abstractNumId w:val="28"/>
   </w:num>
   <w:num w:numId="35" w16cid:durableId="2064593053">
     <w:abstractNumId w:val="7"/>
@@ -9273,13 +10340,19 @@
     <w:abstractNumId w:val="4"/>
   </w:num>
   <w:num w:numId="37" w16cid:durableId="858129691">
-    <w:abstractNumId w:val="18"/>
+    <w:abstractNumId w:val="19"/>
+  </w:num>
+  <w:num w:numId="38" w16cid:durableId="1540164895">
+    <w:abstractNumId w:val="37"/>
+  </w:num>
+  <w:num w:numId="39" w16cid:durableId="1749034197">
+    <w:abstractNumId w:val="11"/>
   </w:num>
 </w:numbering>
 </file>
 
 <file path=word/styles.xml><?xml version="1.0" encoding="utf-8"?>
-<w:styles xmlns:mc="http://schemas.openxmlformats.org/markup-compatibility/2006" xmlns:r="http://schemas.openxmlformats.org/officeDocument/2006/relationships" xmlns:w="http://schemas.openxmlformats.org/wordprocessingml/2006/main" xmlns:w14="http://schemas.microsoft.com/office/word/2010/wordml" xmlns:w15="http://schemas.microsoft.com/office/word/2012/wordml" xmlns:w16cex="http://schemas.microsoft.com/office/word/2018/wordml/cex" xmlns:w16cid="http://schemas.microsoft.com/office/word/2016/wordml/cid" xmlns:w16="http://schemas.microsoft.com/office/word/2018/wordml" xmlns:w16sdtdh="http://schemas.microsoft.com/office/word/2020/wordml/sdtdatahash" xmlns:w16se="http://schemas.microsoft.com/office/word/2015/wordml/symex" mc:Ignorable="w14 w15 w16se w16cid w16 w16cex w16sdtdh">
+<w:styles xmlns:mc="http://schemas.openxmlformats.org/markup-compatibility/2006" xmlns:r="http://schemas.openxmlformats.org/officeDocument/2006/relationships" xmlns:w="http://schemas.openxmlformats.org/wordprocessingml/2006/main" xmlns:w14="http://schemas.microsoft.com/office/word/2010/wordml" xmlns:w15="http://schemas.microsoft.com/office/word/2012/wordml" xmlns:w16cex="http://schemas.microsoft.com/office/word/2018/wordml/cex" xmlns:w16cid="http://schemas.microsoft.com/office/word/2016/wordml/cid" xmlns:w16="http://schemas.microsoft.com/office/word/2018/wordml" xmlns:w16du="http://schemas.microsoft.com/office/word/2023/wordml/word16du" xmlns:w16sdtdh="http://schemas.microsoft.com/office/word/2020/wordml/sdtdatahash" xmlns:w16sdtfl="http://schemas.microsoft.com/office/word/2024/wordml/sdtformatlock" xmlns:w16se="http://schemas.microsoft.com/office/word/2015/wordml/symex" mc:Ignorable="w14 w15 w16se w16cid w16 w16cex w16sdtdh w16sdtfl w16du">
   <w:docDefaults>
     <w:rPrDefault>
       <w:rPr>
@@ -9768,7 +10841,6 @@
   <w:style w:type="character" w:default="1" w:styleId="DefaultParagraphFont">
     <w:name w:val="Default Paragraph Font"/>
     <w:uiPriority w:val="1"/>
-    <w:semiHidden/>
     <w:unhideWhenUsed/>
   </w:style>
   <w:style w:type="table" w:default="1" w:styleId="TableNormal">
@@ -10566,10 +11638,6 @@
 </file>
 
 <file path=customXml/item1.xml><?xml version="1.0" encoding="utf-8"?>
-<b:Sources xmlns:b="http://schemas.openxmlformats.org/officeDocument/2006/bibliography" xmlns="http://schemas.openxmlformats.org/officeDocument/2006/bibliography" SelectedStyle="\APA.XSL" StyleName="APA"/>
-</file>
-
-<file path=customXml/item2.xml><?xml version="1.0" encoding="utf-8"?>
 <?mso-contentType ?>
 <FormTemplates xmlns="http://schemas.microsoft.com/sharepoint/v3/contenttype/forms">
   <Display>DocumentLibraryForm</Display>
@@ -10578,7 +11646,30 @@
 </FormTemplates>
 </file>
 
+<file path=customXml/item2.xml><?xml version="1.0" encoding="utf-8"?>
+<b:Sources xmlns:b="http://schemas.openxmlformats.org/officeDocument/2006/bibliography" xmlns="http://schemas.openxmlformats.org/officeDocument/2006/bibliography" SelectedStyle="\APA.XSL" StyleName="APA"/>
+</file>
+
 <file path=customXml/item3.xml><?xml version="1.0" encoding="utf-8"?>
+<p:properties xmlns:p="http://schemas.microsoft.com/office/2006/metadata/properties" xmlns:xsi="http://www.w3.org/2001/XMLSchema-instance" xmlns:pc="http://schemas.microsoft.com/office/infopath/2007/PartnerControls">
+  <documentManagement>
+    <Category0 xmlns="bef73783-b83a-4f38-94d5-1aaaa1b3b0a2">1</Category0>
+    <i0f84bba906045b4af568ee102a52dcb xmlns="2933ac1b-cace-482f-bed9-bf9b7d80f34a">
+      <Terms xmlns="http://schemas.microsoft.com/office/infopath/2007/PartnerControls">
+        <TermInfo xmlns="http://schemas.microsoft.com/office/infopath/2007/PartnerControls">
+          <TermName xmlns="http://schemas.microsoft.com/office/infopath/2007/PartnerControls">Corporate Records</TermName>
+          <TermId xmlns="http://schemas.microsoft.com/office/infopath/2007/PartnerControls">2c702203-4f28-4769-bfc5-dad5ef3425c7</TermId>
+        </TermInfo>
+      </Terms>
+    </i0f84bba906045b4af568ee102a52dcb>
+    <TaxCatchAll xmlns="2933ac1b-cace-482f-bed9-bf9b7d80f34a">
+      <Value>1</Value>
+    </TaxCatchAll>
+  </documentManagement>
+</p:properties>
+</file>
+
+<file path=customXml/item4.xml><?xml version="1.0" encoding="utf-8"?>
 <ct:contentTypeSchema xmlns:ct="http://schemas.microsoft.com/office/2006/metadata/contentType" xmlns:ma="http://schemas.microsoft.com/office/2006/metadata/properties/metaAttributes" ct:_="" ma:_="" ma:contentTypeName="Document" ma:contentTypeID="0x010100D17E1B4D89D91D49A316865B50B76B78" ma:contentTypeVersion="26" ma:contentTypeDescription="Create a new document." ma:contentTypeScope="" ma:versionID="2e43e94bda34b09537a48d601b321f81">
   <xsd:schema xmlns:xsd="http://www.w3.org/2001/XMLSchema" xmlns:xs="http://www.w3.org/2001/XMLSchema" xmlns:p="http://schemas.microsoft.com/office/2006/metadata/properties" xmlns:ns2="bef73783-b83a-4f38-94d5-1aaaa1b3b0a2" xmlns:ns3="2933ac1b-cace-482f-bed9-bf9b7d80f34a" targetNamespace="http://schemas.microsoft.com/office/2006/metadata/properties" ma:root="true" ma:fieldsID="68ad2338b471bae35515ce7eaf1f964b" ns2:_="" ns3:_="">
     <xsd:import namespace="bef73783-b83a-4f38-94d5-1aaaa1b3b0a2"/>
@@ -10793,26 +11884,15 @@
 </ct:contentTypeSchema>
 </file>
 
-<file path=customXml/item4.xml><?xml version="1.0" encoding="utf-8"?>
-<p:properties xmlns:p="http://schemas.microsoft.com/office/2006/metadata/properties" xmlns:xsi="http://www.w3.org/2001/XMLSchema-instance" xmlns:pc="http://schemas.microsoft.com/office/infopath/2007/PartnerControls">
-  <documentManagement>
-    <Category0 xmlns="bef73783-b83a-4f38-94d5-1aaaa1b3b0a2">1</Category0>
-    <i0f84bba906045b4af568ee102a52dcb xmlns="2933ac1b-cace-482f-bed9-bf9b7d80f34a">
-      <Terms xmlns="http://schemas.microsoft.com/office/infopath/2007/PartnerControls">
-        <TermInfo xmlns="http://schemas.microsoft.com/office/infopath/2007/PartnerControls">
-          <TermName xmlns="http://schemas.microsoft.com/office/infopath/2007/PartnerControls">Corporate Records</TermName>
-          <TermId xmlns="http://schemas.microsoft.com/office/infopath/2007/PartnerControls">2c702203-4f28-4769-bfc5-dad5ef3425c7</TermId>
-        </TermInfo>
-      </Terms>
-    </i0f84bba906045b4af568ee102a52dcb>
-    <TaxCatchAll xmlns="2933ac1b-cace-482f-bed9-bf9b7d80f34a">
-      <Value>1</Value>
-    </TaxCatchAll>
-  </documentManagement>
-</p:properties>
+<file path=customXml/itemProps1.xml><?xml version="1.0" encoding="utf-8"?>
+<ds:datastoreItem xmlns:ds="http://schemas.openxmlformats.org/officeDocument/2006/customXml" ds:itemID="{93737E1E-B456-42C7-9F02-6B7D736E2393}">
+  <ds:schemaRefs>
+    <ds:schemaRef ds:uri="http://schemas.microsoft.com/sharepoint/v3/contenttype/forms"/>
+  </ds:schemaRefs>
+</ds:datastoreItem>
 </file>
 
-<file path=customXml/itemProps1.xml><?xml version="1.0" encoding="utf-8"?>
+<file path=customXml/itemProps2.xml><?xml version="1.0" encoding="utf-8"?>
 <ds:datastoreItem xmlns:ds="http://schemas.openxmlformats.org/officeDocument/2006/customXml" ds:itemID="{7769C2E1-50C7-4AF2-861B-F52E75CE3623}">
   <ds:schemaRefs>
     <ds:schemaRef ds:uri="http://schemas.openxmlformats.org/officeDocument/2006/bibliography"/>
@@ -10820,19 +11900,7 @@
 </ds:datastoreItem>
 </file>
 
-<file path=customXml/itemProps2.xml><?xml version="1.0" encoding="utf-8"?>
-<ds:datastoreItem xmlns:ds="http://schemas.openxmlformats.org/officeDocument/2006/customXml" ds:itemID="{93737E1E-B456-42C7-9F02-6B7D736E2393}">
-  <ds:schemaRefs>
-    <ds:schemaRef ds:uri="http://schemas.microsoft.com/sharepoint/v3/contenttype/forms"/>
-  </ds:schemaRefs>
-</ds:datastoreItem>
-</file>
-
 <file path=customXml/itemProps3.xml><?xml version="1.0" encoding="utf-8"?>
-<ds:datastoreItem xmlns:ds="http://schemas.openxmlformats.org/officeDocument/2006/customXml" ds:itemID="{05C235B8-E803-46E7-B24C-80752B1E7EE4}"/>
-</file>
-
-<file path=customXml/itemProps4.xml><?xml version="1.0" encoding="utf-8"?>
 <ds:datastoreItem xmlns:ds="http://schemas.openxmlformats.org/officeDocument/2006/customXml" ds:itemID="{88E25B5C-5BD7-403A-8876-7F03EDF4549D}">
   <ds:schemaRefs>
     <ds:schemaRef ds:uri="http://schemas.microsoft.com/office/2006/metadata/properties"/>
@@ -10841,4 +11909,23 @@
     <ds:schemaRef ds:uri="2933ac1b-cace-482f-bed9-bf9b7d80f34a"/>
   </ds:schemaRefs>
 </ds:datastoreItem>
+</file>
+
+<file path=customXml/itemProps4.xml><?xml version="1.0" encoding="utf-8"?>
+<ds:datastoreItem xmlns:ds="http://schemas.openxmlformats.org/officeDocument/2006/customXml" ds:itemID="{05C235B8-E803-46E7-B24C-80752B1E7EE4}">
+  <ds:schemaRefs>
+    <ds:schemaRef ds:uri="http://schemas.microsoft.com/office/2006/metadata/contentType"/>
+    <ds:schemaRef ds:uri="http://schemas.microsoft.com/office/2006/metadata/properties/metaAttributes"/>
+    <ds:schemaRef ds:uri="http://www.w3.org/2001/XMLSchema"/>
+    <ds:schemaRef ds:uri="http://schemas.microsoft.com/office/2006/metadata/properties"/>
+    <ds:schemaRef ds:uri="bef73783-b83a-4f38-94d5-1aaaa1b3b0a2"/>
+    <ds:schemaRef ds:uri="2933ac1b-cace-482f-bed9-bf9b7d80f34a"/>
+    <ds:schemaRef ds:uri="http://schemas.microsoft.com/office/2006/documentManagement/types"/>
+    <ds:schemaRef ds:uri="http://schemas.microsoft.com/office/infopath/2007/PartnerControls"/>
+    <ds:schemaRef ds:uri="http://schemas.openxmlformats.org/package/2006/metadata/core-properties"/>
+    <ds:schemaRef ds:uri="http://purl.org/dc/elements/1.1/"/>
+    <ds:schemaRef ds:uri="http://purl.org/dc/terms/"/>
+    <ds:schemaRef ds:uri="http://schemas.microsoft.com/internal/obd"/>
+  </ds:schemaRefs>
+</ds:datastoreItem>
 </file>
</xml_diff>